<commit_message>
Fixed iclals name first page
</commit_message>
<xml_diff>
--- a/EEE309_Project2_ADC_Report.docx
+++ b/EEE309_Project2_ADC_Report.docx
@@ -81,12 +81,16 @@
       <w:pPr>
         <w:spacing w:after="80" w:line="300" w:lineRule="auto"/>
         <w:jc w:val="center"/>
-      </w:pPr>
-      <w:r>
         <w:rPr>
           <w:b/>
           <w:bCs/>
         </w:rPr>
+      </w:pPr>
+      <w:r>
+        <w:rPr>
+          <w:b/>
+          <w:bCs/>
+        </w:rPr>
         <w:t>Sara Zor (20261701082)</w:t>
       </w:r>
     </w:p>
@@ -99,9 +103,22 @@
         <w:rPr>
           <w:b/>
           <w:bCs/>
-          <w:shd w:val="clear" w:color="auto" w:fill="FFFF00"/>
-        </w:rPr>
-        <w:t>Iclal [SURNAME] ([STUDENT ID])</w:t>
+        </w:rPr>
+        <w:t>Iclal Sevde Yavus (</w:t>
+      </w:r>
+      <w:r>
+        <w:rPr>
+          <w:b/>
+          <w:bCs/>
+        </w:rPr>
+        <w:t>20241701011</w:t>
+      </w:r>
+      <w:r>
+        <w:rPr>
+          <w:b/>
+          <w:bCs/>
+        </w:rPr>
+        <w:t>)</w:t>
       </w:r>
     </w:p>
     <w:p>
@@ -844,71 +861,6 @@
             <wp:extent cx="3619500" cy="1809750"/>
             <wp:effectExtent l="0" t="0" r="0" b="0"/>
             <wp:docPr id="1" name="Picture 1"/>
-            <wp:cNvGraphicFramePr>
-              <a:graphicFrameLocks xmlns:a="http://schemas.openxmlformats.org/drawingml/2006/main" noChangeAspect="1"/>
-            </wp:cNvGraphicFramePr>
-            <a:graphic xmlns:a="http://schemas.openxmlformats.org/drawingml/2006/main">
-              <a:graphicData uri="http://schemas.openxmlformats.org/drawingml/2006/picture">
-                <pic:pic xmlns:pic="http://schemas.openxmlformats.org/drawingml/2006/picture">
-                  <pic:nvPicPr>
-                    <pic:cNvPr id="0" name=""/>
-                    <pic:cNvPicPr>
-                      <a:picLocks noChangeAspect="1" noChangeArrowheads="1"/>
-                    </pic:cNvPicPr>
-                  </pic:nvPicPr>
-                  <pic:blipFill>
-                    <a:blip r:embed="rId7"/>
-                    <a:srcRect/>
-                    <a:stretch>
-                      <a:fillRect/>
-                    </a:stretch>
-                  </pic:blipFill>
-                  <pic:spPr bwMode="auto">
-                    <a:xfrm>
-                      <a:off x="0" y="0"/>
-                      <a:ext cx="3619500" cy="1809750"/>
-                    </a:xfrm>
-                    <a:prstGeom prst="rect">
-                      <a:avLst/>
-                    </a:prstGeom>
-                  </pic:spPr>
-                </pic:pic>
-              </a:graphicData>
-            </a:graphic>
-          </wp:inline>
-        </w:drawing>
-      </w:r>
-    </w:p>
-    <w:p>
-      <w:pPr>
-        <w:spacing w:after="240" w:line="300" w:lineRule="auto"/>
-        <w:jc w:val="center"/>
-      </w:pPr>
-      <w:r>
-        <w:rPr>
-          <w:b/>
-          <w:bCs/>
-          <w:sz w:val="22"/>
-          <w:szCs w:val="22"/>
-        </w:rPr>
-        <w:t>Figure 2.1 Arduino ADC circuit</w:t>
-      </w:r>
-    </w:p>
-    <w:p>
-      <w:pPr>
-        <w:keepNext/>
-        <w:spacing w:after="80"/>
-        <w:jc w:val="center"/>
-      </w:pPr>
-      <w:r>
-        <w:rPr>
-          <w:noProof/>
-        </w:rPr>
-        <w:drawing>
-          <wp:inline distT="0" distB="0" distL="0" distR="0" wp14:anchorId="73EC1688" wp14:editId="43295B43">
-            <wp:extent cx="3143250" cy="2362200"/>
-            <wp:effectExtent l="0" t="0" r="0" b="0"/>
-            <wp:docPr id="166192144" name="Picture 166192144"/>
             <wp:cNvGraphicFramePr>
               <a:graphicFrameLocks xmlns:a="http://schemas.openxmlformats.org/drawingml/2006/main" noChangeAspect="1"/>
             </wp:cNvGraphicFramePr>
@@ -931,7 +883,7 @@
                   <pic:spPr bwMode="auto">
                     <a:xfrm>
                       <a:off x="0" y="0"/>
-                      <a:ext cx="3143250" cy="2362200"/>
+                      <a:ext cx="3619500" cy="1809750"/>
                     </a:xfrm>
                     <a:prstGeom prst="rect">
                       <a:avLst/>
@@ -956,7 +908,7 @@
           <w:sz w:val="22"/>
           <w:szCs w:val="22"/>
         </w:rPr>
-        <w:t>Figure 2.2 Experimental setup</w:t>
+        <w:t>Figure 2.1 Arduino ADC circuit</w:t>
       </w:r>
     </w:p>
     <w:p>
@@ -969,12 +921,11 @@
         <w:rPr>
           <w:noProof/>
         </w:rPr>
-        <w:lastRenderedPageBreak/>
         <w:drawing>
-          <wp:inline distT="0" distB="0" distL="0" distR="0" wp14:anchorId="249EFCEC" wp14:editId="0259AC93">
+          <wp:inline distT="0" distB="0" distL="0" distR="0" wp14:anchorId="73EC1688" wp14:editId="43295B43">
             <wp:extent cx="3143250" cy="2362200"/>
             <wp:effectExtent l="0" t="0" r="0" b="0"/>
-            <wp:docPr id="2127202317" name="Picture 2127202317"/>
+            <wp:docPr id="166192144" name="Picture 166192144"/>
             <wp:cNvGraphicFramePr>
               <a:graphicFrameLocks xmlns:a="http://schemas.openxmlformats.org/drawingml/2006/main" noChangeAspect="1"/>
             </wp:cNvGraphicFramePr>
@@ -1022,6 +973,72 @@
           <w:sz w:val="22"/>
           <w:szCs w:val="22"/>
         </w:rPr>
+        <w:t>Figure 2.2 Experimental setup</w:t>
+      </w:r>
+    </w:p>
+    <w:p>
+      <w:pPr>
+        <w:keepNext/>
+        <w:spacing w:after="80"/>
+        <w:jc w:val="center"/>
+      </w:pPr>
+      <w:r>
+        <w:rPr>
+          <w:noProof/>
+        </w:rPr>
+        <w:lastRenderedPageBreak/>
+        <w:drawing>
+          <wp:inline distT="0" distB="0" distL="0" distR="0" wp14:anchorId="249EFCEC" wp14:editId="0259AC93">
+            <wp:extent cx="3143250" cy="2362200"/>
+            <wp:effectExtent l="0" t="0" r="0" b="0"/>
+            <wp:docPr id="2127202317" name="Picture 2127202317"/>
+            <wp:cNvGraphicFramePr>
+              <a:graphicFrameLocks xmlns:a="http://schemas.openxmlformats.org/drawingml/2006/main" noChangeAspect="1"/>
+            </wp:cNvGraphicFramePr>
+            <a:graphic xmlns:a="http://schemas.openxmlformats.org/drawingml/2006/main">
+              <a:graphicData uri="http://schemas.openxmlformats.org/drawingml/2006/picture">
+                <pic:pic xmlns:pic="http://schemas.openxmlformats.org/drawingml/2006/picture">
+                  <pic:nvPicPr>
+                    <pic:cNvPr id="0" name=""/>
+                    <pic:cNvPicPr>
+                      <a:picLocks noChangeAspect="1" noChangeArrowheads="1"/>
+                    </pic:cNvPicPr>
+                  </pic:nvPicPr>
+                  <pic:blipFill>
+                    <a:blip r:embed="rId10"/>
+                    <a:srcRect/>
+                    <a:stretch>
+                      <a:fillRect/>
+                    </a:stretch>
+                  </pic:blipFill>
+                  <pic:spPr bwMode="auto">
+                    <a:xfrm>
+                      <a:off x="0" y="0"/>
+                      <a:ext cx="3143250" cy="2362200"/>
+                    </a:xfrm>
+                    <a:prstGeom prst="rect">
+                      <a:avLst/>
+                    </a:prstGeom>
+                  </pic:spPr>
+                </pic:pic>
+              </a:graphicData>
+            </a:graphic>
+          </wp:inline>
+        </w:drawing>
+      </w:r>
+    </w:p>
+    <w:p>
+      <w:pPr>
+        <w:spacing w:after="240" w:line="300" w:lineRule="auto"/>
+        <w:jc w:val="center"/>
+      </w:pPr>
+      <w:r>
+        <w:rPr>
+          <w:b/>
+          <w:bCs/>
+          <w:sz w:val="22"/>
+          <w:szCs w:val="22"/>
+        </w:rPr>
         <w:t>Figure 2.3 Measuring the potentiometer voltage with the multimeter</w:t>
       </w:r>
     </w:p>
@@ -1278,7 +1295,7 @@
                     </pic:cNvPicPr>
                   </pic:nvPicPr>
                   <pic:blipFill>
-                    <a:blip r:embed="rId10"/>
+                    <a:blip r:embed="rId11"/>
                     <a:srcRect/>
                     <a:stretch>
                       <a:fillRect/>
@@ -1539,12 +1556,6 @@
         <w:gridCol w:w="1900"/>
       </w:tblGrid>
       <w:tr>
-        <w:tblPrEx>
-          <w:tblCellMar>
-            <w:top w:w="0" w:type="dxa"/>
-            <w:bottom w:w="0" w:type="dxa"/>
-          </w:tblCellMar>
-        </w:tblPrEx>
         <w:trPr>
           <w:cantSplit/>
           <w:tblHeader/>
@@ -1722,12 +1733,6 @@
         </w:tc>
       </w:tr>
       <w:tr>
-        <w:tblPrEx>
-          <w:tblCellMar>
-            <w:top w:w="0" w:type="dxa"/>
-            <w:bottom w:w="0" w:type="dxa"/>
-          </w:tblCellMar>
-        </w:tblPrEx>
         <w:trPr>
           <w:cantSplit/>
           <w:jc w:val="center"/>
@@ -1889,12 +1894,6 @@
         </w:tc>
       </w:tr>
       <w:tr>
-        <w:tblPrEx>
-          <w:tblCellMar>
-            <w:top w:w="0" w:type="dxa"/>
-            <w:bottom w:w="0" w:type="dxa"/>
-          </w:tblCellMar>
-        </w:tblPrEx>
         <w:trPr>
           <w:cantSplit/>
           <w:jc w:val="center"/>
@@ -2056,12 +2055,6 @@
         </w:tc>
       </w:tr>
       <w:tr>
-        <w:tblPrEx>
-          <w:tblCellMar>
-            <w:top w:w="0" w:type="dxa"/>
-            <w:bottom w:w="0" w:type="dxa"/>
-          </w:tblCellMar>
-        </w:tblPrEx>
         <w:trPr>
           <w:cantSplit/>
           <w:jc w:val="center"/>
@@ -2223,12 +2216,6 @@
         </w:tc>
       </w:tr>
       <w:tr>
-        <w:tblPrEx>
-          <w:tblCellMar>
-            <w:top w:w="0" w:type="dxa"/>
-            <w:bottom w:w="0" w:type="dxa"/>
-          </w:tblCellMar>
-        </w:tblPrEx>
         <w:trPr>
           <w:cantSplit/>
           <w:jc w:val="center"/>
@@ -2390,12 +2377,6 @@
         </w:tc>
       </w:tr>
       <w:tr>
-        <w:tblPrEx>
-          <w:tblCellMar>
-            <w:top w:w="0" w:type="dxa"/>
-            <w:bottom w:w="0" w:type="dxa"/>
-          </w:tblCellMar>
-        </w:tblPrEx>
         <w:trPr>
           <w:cantSplit/>
           <w:jc w:val="center"/>
@@ -2557,12 +2538,6 @@
         </w:tc>
       </w:tr>
       <w:tr>
-        <w:tblPrEx>
-          <w:tblCellMar>
-            <w:top w:w="0" w:type="dxa"/>
-            <w:bottom w:w="0" w:type="dxa"/>
-          </w:tblCellMar>
-        </w:tblPrEx>
         <w:trPr>
           <w:cantSplit/>
           <w:jc w:val="center"/>
@@ -2724,12 +2699,6 @@
         </w:tc>
       </w:tr>
       <w:tr>
-        <w:tblPrEx>
-          <w:tblCellMar>
-            <w:top w:w="0" w:type="dxa"/>
-            <w:bottom w:w="0" w:type="dxa"/>
-          </w:tblCellMar>
-        </w:tblPrEx>
         <w:trPr>
           <w:cantSplit/>
           <w:jc w:val="center"/>
@@ -2891,12 +2860,6 @@
         </w:tc>
       </w:tr>
       <w:tr>
-        <w:tblPrEx>
-          <w:tblCellMar>
-            <w:top w:w="0" w:type="dxa"/>
-            <w:bottom w:w="0" w:type="dxa"/>
-          </w:tblCellMar>
-        </w:tblPrEx>
         <w:trPr>
           <w:cantSplit/>
           <w:jc w:val="center"/>
@@ -3058,12 +3021,6 @@
         </w:tc>
       </w:tr>
       <w:tr>
-        <w:tblPrEx>
-          <w:tblCellMar>
-            <w:top w:w="0" w:type="dxa"/>
-            <w:bottom w:w="0" w:type="dxa"/>
-          </w:tblCellMar>
-        </w:tblPrEx>
         <w:trPr>
           <w:cantSplit/>
           <w:jc w:val="center"/>
@@ -3225,12 +3182,6 @@
         </w:tc>
       </w:tr>
       <w:tr>
-        <w:tblPrEx>
-          <w:tblCellMar>
-            <w:top w:w="0" w:type="dxa"/>
-            <w:bottom w:w="0" w:type="dxa"/>
-          </w:tblCellMar>
-        </w:tblPrEx>
         <w:trPr>
           <w:cantSplit/>
           <w:jc w:val="center"/>
@@ -3392,12 +3343,6 @@
         </w:tc>
       </w:tr>
       <w:tr>
-        <w:tblPrEx>
-          <w:tblCellMar>
-            <w:top w:w="0" w:type="dxa"/>
-            <w:bottom w:w="0" w:type="dxa"/>
-          </w:tblCellMar>
-        </w:tblPrEx>
         <w:trPr>
           <w:cantSplit/>
           <w:jc w:val="center"/>
@@ -3559,12 +3504,6 @@
         </w:tc>
       </w:tr>
       <w:tr>
-        <w:tblPrEx>
-          <w:tblCellMar>
-            <w:top w:w="0" w:type="dxa"/>
-            <w:bottom w:w="0" w:type="dxa"/>
-          </w:tblCellMar>
-        </w:tblPrEx>
         <w:trPr>
           <w:cantSplit/>
           <w:jc w:val="center"/>
@@ -3726,12 +3665,6 @@
         </w:tc>
       </w:tr>
       <w:tr>
-        <w:tblPrEx>
-          <w:tblCellMar>
-            <w:top w:w="0" w:type="dxa"/>
-            <w:bottom w:w="0" w:type="dxa"/>
-          </w:tblCellMar>
-        </w:tblPrEx>
         <w:trPr>
           <w:cantSplit/>
           <w:jc w:val="center"/>
@@ -3893,12 +3826,6 @@
         </w:tc>
       </w:tr>
       <w:tr>
-        <w:tblPrEx>
-          <w:tblCellMar>
-            <w:top w:w="0" w:type="dxa"/>
-            <w:bottom w:w="0" w:type="dxa"/>
-          </w:tblCellMar>
-        </w:tblPrEx>
         <w:trPr>
           <w:cantSplit/>
           <w:jc w:val="center"/>
@@ -4118,10 +4045,7 @@
         <w:jc w:val="both"/>
       </w:pPr>
       <w:r>
-        <w:t xml:space="preserve">Digits: three decimal places </w:t>
-      </w:r>
-      <w:r>
-        <w:t>are shown, because one ADC step is 4.88 mV, so a third decimal still carries information while a fourth would not.</w:t>
+        <w:t>Digits: three decimal places are shown, because one ADC step is 4.88 mV, so a third decimal still carries information while a fourth would not.</w:t>
       </w:r>
     </w:p>
     <w:p>
@@ -4183,96 +4107,6 @@
             <wp:extent cx="2857500" cy="2705100"/>
             <wp:effectExtent l="0" t="0" r="0" b="0"/>
             <wp:docPr id="765756655" name="Picture 765756655"/>
-            <wp:cNvGraphicFramePr>
-              <a:graphicFrameLocks xmlns:a="http://schemas.openxmlformats.org/drawingml/2006/main" noChangeAspect="1"/>
-            </wp:cNvGraphicFramePr>
-            <a:graphic xmlns:a="http://schemas.openxmlformats.org/drawingml/2006/main">
-              <a:graphicData uri="http://schemas.openxmlformats.org/drawingml/2006/picture">
-                <pic:pic xmlns:pic="http://schemas.openxmlformats.org/drawingml/2006/picture">
-                  <pic:nvPicPr>
-                    <pic:cNvPr id="0" name=""/>
-                    <pic:cNvPicPr>
-                      <a:picLocks noChangeAspect="1" noChangeArrowheads="1"/>
-                    </pic:cNvPicPr>
-                  </pic:nvPicPr>
-                  <pic:blipFill>
-                    <a:blip r:embed="rId11"/>
-                    <a:srcRect/>
-                    <a:stretch>
-                      <a:fillRect/>
-                    </a:stretch>
-                  </pic:blipFill>
-                  <pic:spPr bwMode="auto">
-                    <a:xfrm>
-                      <a:off x="0" y="0"/>
-                      <a:ext cx="2857500" cy="2705100"/>
-                    </a:xfrm>
-                    <a:prstGeom prst="rect">
-                      <a:avLst/>
-                    </a:prstGeom>
-                  </pic:spPr>
-                </pic:pic>
-              </a:graphicData>
-            </a:graphic>
-          </wp:inline>
-        </w:drawing>
-      </w:r>
-    </w:p>
-    <w:p>
-      <w:pPr>
-        <w:spacing w:after="240" w:line="300" w:lineRule="auto"/>
-        <w:jc w:val="center"/>
-      </w:pPr>
-      <w:r>
-        <w:rPr>
-          <w:b/>
-          <w:bCs/>
-          <w:sz w:val="22"/>
-          <w:szCs w:val="22"/>
-        </w:rPr>
-        <w:t>Figure 4.1 Digital voltmeter GUI in online mode, with A0 connected to the Arduino 3.3 V pin</w:t>
-      </w:r>
-    </w:p>
-    <w:p>
-      <w:pPr>
-        <w:keepNext/>
-        <w:spacing w:before="240" w:after="160"/>
-      </w:pPr>
-      <w:r>
-        <w:rPr>
-          <w:b/>
-          <w:bCs/>
-        </w:rPr>
-        <w:lastRenderedPageBreak/>
-        <w:t>4.3    Offline Mode</w:t>
-      </w:r>
-    </w:p>
-    <w:p>
-      <w:pPr>
-        <w:keepNext/>
-        <w:spacing w:after="160" w:line="300" w:lineRule="auto"/>
-        <w:ind w:firstLine="540"/>
-        <w:jc w:val="both"/>
-      </w:pPr>
-      <w:r>
-        <w:t>In offline mode a slider steps through the stored measurements, and a CSV file with Multimeter_V and ADC columns can be loaded.</w:t>
-      </w:r>
-    </w:p>
-    <w:p>
-      <w:pPr>
-        <w:keepNext/>
-        <w:spacing w:after="80"/>
-        <w:jc w:val="center"/>
-      </w:pPr>
-      <w:r>
-        <w:rPr>
-          <w:noProof/>
-        </w:rPr>
-        <w:drawing>
-          <wp:inline distT="0" distB="0" distL="0" distR="0" wp14:anchorId="22CEB841" wp14:editId="6F7F506E">
-            <wp:extent cx="2476500" cy="2381250"/>
-            <wp:effectExtent l="0" t="0" r="0" b="0"/>
-            <wp:docPr id="422259839" name="Picture 422259839"/>
             <wp:cNvGraphicFramePr>
               <a:graphicFrameLocks xmlns:a="http://schemas.openxmlformats.org/drawingml/2006/main" noChangeAspect="1"/>
             </wp:cNvGraphicFramePr>
@@ -4295,6 +4129,96 @@
                   <pic:spPr bwMode="auto">
                     <a:xfrm>
                       <a:off x="0" y="0"/>
+                      <a:ext cx="2857500" cy="2705100"/>
+                    </a:xfrm>
+                    <a:prstGeom prst="rect">
+                      <a:avLst/>
+                    </a:prstGeom>
+                  </pic:spPr>
+                </pic:pic>
+              </a:graphicData>
+            </a:graphic>
+          </wp:inline>
+        </w:drawing>
+      </w:r>
+    </w:p>
+    <w:p>
+      <w:pPr>
+        <w:spacing w:after="240" w:line="300" w:lineRule="auto"/>
+        <w:jc w:val="center"/>
+      </w:pPr>
+      <w:r>
+        <w:rPr>
+          <w:b/>
+          <w:bCs/>
+          <w:sz w:val="22"/>
+          <w:szCs w:val="22"/>
+        </w:rPr>
+        <w:t>Figure 4.1 Digital voltmeter GUI in online mode, with A0 connected to the Arduino 3.3 V pin</w:t>
+      </w:r>
+    </w:p>
+    <w:p>
+      <w:pPr>
+        <w:keepNext/>
+        <w:spacing w:before="240" w:after="160"/>
+      </w:pPr>
+      <w:r>
+        <w:rPr>
+          <w:b/>
+          <w:bCs/>
+        </w:rPr>
+        <w:lastRenderedPageBreak/>
+        <w:t>4.3    Offline Mode</w:t>
+      </w:r>
+    </w:p>
+    <w:p>
+      <w:pPr>
+        <w:keepNext/>
+        <w:spacing w:after="160" w:line="300" w:lineRule="auto"/>
+        <w:ind w:firstLine="540"/>
+        <w:jc w:val="both"/>
+      </w:pPr>
+      <w:r>
+        <w:t>In offline mode a slider steps through the stored measurements, and a CSV file with Multimeter_V and ADC columns can be loaded.</w:t>
+      </w:r>
+    </w:p>
+    <w:p>
+      <w:pPr>
+        <w:keepNext/>
+        <w:spacing w:after="80"/>
+        <w:jc w:val="center"/>
+      </w:pPr>
+      <w:r>
+        <w:rPr>
+          <w:noProof/>
+        </w:rPr>
+        <w:drawing>
+          <wp:inline distT="0" distB="0" distL="0" distR="0" wp14:anchorId="22CEB841" wp14:editId="6F7F506E">
+            <wp:extent cx="2476500" cy="2381250"/>
+            <wp:effectExtent l="0" t="0" r="0" b="0"/>
+            <wp:docPr id="422259839" name="Picture 422259839"/>
+            <wp:cNvGraphicFramePr>
+              <a:graphicFrameLocks xmlns:a="http://schemas.openxmlformats.org/drawingml/2006/main" noChangeAspect="1"/>
+            </wp:cNvGraphicFramePr>
+            <a:graphic xmlns:a="http://schemas.openxmlformats.org/drawingml/2006/main">
+              <a:graphicData uri="http://schemas.openxmlformats.org/drawingml/2006/picture">
+                <pic:pic xmlns:pic="http://schemas.openxmlformats.org/drawingml/2006/picture">
+                  <pic:nvPicPr>
+                    <pic:cNvPr id="0" name=""/>
+                    <pic:cNvPicPr>
+                      <a:picLocks noChangeAspect="1" noChangeArrowheads="1"/>
+                    </pic:cNvPicPr>
+                  </pic:nvPicPr>
+                  <pic:blipFill>
+                    <a:blip r:embed="rId13"/>
+                    <a:srcRect/>
+                    <a:stretch>
+                      <a:fillRect/>
+                    </a:stretch>
+                  </pic:blipFill>
+                  <pic:spPr bwMode="auto">
+                    <a:xfrm>
+                      <a:off x="0" y="0"/>
                       <a:ext cx="2476500" cy="2381250"/>
                     </a:xfrm>
                     <a:prstGeom prst="rect">
@@ -4351,7 +4275,7 @@
                     </pic:cNvPicPr>
                   </pic:nvPicPr>
                   <pic:blipFill>
-                    <a:blip r:embed="rId13"/>
+                    <a:blip r:embed="rId14"/>
                     <a:srcRect/>
                     <a:stretch>
                       <a:fillRect/>
@@ -4559,12 +4483,6 @@
         <w:gridCol w:w="4680"/>
       </w:tblGrid>
       <w:tr>
-        <w:tblPrEx>
-          <w:tblCellMar>
-            <w:top w:w="0" w:type="dxa"/>
-            <w:bottom w:w="0" w:type="dxa"/>
-          </w:tblCellMar>
-        </w:tblPrEx>
         <w:trPr>
           <w:cantSplit/>
           <w:jc w:val="center"/>
@@ -4592,80 +4510,6 @@
                   <wp:extent cx="2857500" cy="1790700"/>
                   <wp:effectExtent l="0" t="0" r="0" b="0"/>
                   <wp:docPr id="211279112" name="Picture 211279112"/>
-                  <wp:cNvGraphicFramePr>
-                    <a:graphicFrameLocks xmlns:a="http://schemas.openxmlformats.org/drawingml/2006/main" noChangeAspect="1"/>
-                  </wp:cNvGraphicFramePr>
-                  <a:graphic xmlns:a="http://schemas.openxmlformats.org/drawingml/2006/main">
-                    <a:graphicData uri="http://schemas.openxmlformats.org/drawingml/2006/picture">
-                      <pic:pic xmlns:pic="http://schemas.openxmlformats.org/drawingml/2006/picture">
-                        <pic:nvPicPr>
-                          <pic:cNvPr id="0" name=""/>
-                          <pic:cNvPicPr>
-                            <a:picLocks noChangeAspect="1" noChangeArrowheads="1"/>
-                          </pic:cNvPicPr>
-                        </pic:nvPicPr>
-                        <pic:blipFill>
-                          <a:blip r:embed="rId14"/>
-                          <a:srcRect/>
-                          <a:stretch>
-                            <a:fillRect/>
-                          </a:stretch>
-                        </pic:blipFill>
-                        <pic:spPr bwMode="auto">
-                          <a:xfrm>
-                            <a:off x="0" y="0"/>
-                            <a:ext cx="2857500" cy="1790700"/>
-                          </a:xfrm>
-                          <a:prstGeom prst="rect">
-                            <a:avLst/>
-                          </a:prstGeom>
-                        </pic:spPr>
-                      </pic:pic>
-                    </a:graphicData>
-                  </a:graphic>
-                </wp:inline>
-              </w:drawing>
-            </w:r>
-          </w:p>
-          <w:p>
-            <w:pPr>
-              <w:spacing w:after="200" w:line="300" w:lineRule="auto"/>
-              <w:jc w:val="center"/>
-            </w:pPr>
-            <w:r>
-              <w:rPr>
-                <w:b/>
-                <w:bCs/>
-                <w:sz w:val="20"/>
-                <w:szCs w:val="20"/>
-              </w:rPr>
-              <w:t>Figure 5.1 Experiment 1 vs ideal ADC</w:t>
-            </w:r>
-          </w:p>
-        </w:tc>
-        <w:tc>
-          <w:tcPr>
-            <w:tcW w:w="4680" w:type="dxa"/>
-            <w:tcBorders>
-              <w:top w:val="none" w:sz="0" w:space="0" w:color="FFFFFF"/>
-              <w:left w:val="none" w:sz="0" w:space="0" w:color="FFFFFF"/>
-              <w:bottom w:val="none" w:sz="0" w:space="0" w:color="FFFFFF"/>
-              <w:right w:val="none" w:sz="0" w:space="0" w:color="FFFFFF"/>
-            </w:tcBorders>
-          </w:tcPr>
-          <w:p>
-            <w:pPr>
-              <w:jc w:val="center"/>
-            </w:pPr>
-            <w:r>
-              <w:rPr>
-                <w:noProof/>
-              </w:rPr>
-              <w:drawing>
-                <wp:inline distT="0" distB="0" distL="0" distR="0" wp14:anchorId="4F193C71" wp14:editId="163099D7">
-                  <wp:extent cx="2857500" cy="1790700"/>
-                  <wp:effectExtent l="0" t="0" r="0" b="0"/>
-                  <wp:docPr id="1869222194" name="Picture 1869222194"/>
                   <wp:cNvGraphicFramePr>
                     <a:graphicFrameLocks xmlns:a="http://schemas.openxmlformats.org/drawingml/2006/main" noChangeAspect="1"/>
                   </wp:cNvGraphicFramePr>
@@ -4713,70 +4557,10 @@
                 <w:sz w:val="20"/>
                 <w:szCs w:val="20"/>
               </w:rPr>
-              <w:t>Figure 5.2 Experiment 2 vs ideal ADC</w:t>
-            </w:r>
-          </w:p>
-        </w:tc>
-      </w:tr>
-    </w:tbl>
-    <w:p>
-      <w:pPr>
-        <w:keepNext/>
-        <w:spacing w:before="240" w:after="160"/>
-      </w:pPr>
-      <w:r>
-        <w:rPr>
-          <w:b/>
-          <w:bCs/>
-        </w:rPr>
-        <w:lastRenderedPageBreak/>
-        <w:t>5.4    Linearity and INL</w:t>
-      </w:r>
-    </w:p>
-    <w:p>
-      <w:pPr>
-        <w:keepNext/>
-        <w:spacing w:after="160" w:line="300" w:lineRule="auto"/>
-        <w:ind w:firstLine="540"/>
-        <w:jc w:val="both"/>
-      </w:pPr>
-      <w:r>
-        <w:t>The deviation from the ideal ADC (in LSB) and the endpoint INL (deviation from a straight line between the first and last valid points) were calculated for both experiments.</w:t>
-      </w:r>
-    </w:p>
-    <w:tbl>
-      <w:tblPr>
-        <w:tblW w:w="9360" w:type="dxa"/>
-        <w:jc w:val="center"/>
-        <w:tblBorders>
-          <w:top w:val="none" w:sz="0" w:space="0" w:color="FFFFFF"/>
-          <w:left w:val="none" w:sz="0" w:space="0" w:color="FFFFFF"/>
-          <w:bottom w:val="none" w:sz="0" w:space="0" w:color="FFFFFF"/>
-          <w:right w:val="none" w:sz="0" w:space="0" w:color="FFFFFF"/>
-          <w:insideH w:val="none" w:sz="0" w:space="0" w:color="FFFFFF"/>
-          <w:insideV w:val="none" w:sz="0" w:space="0" w:color="FFFFFF"/>
-        </w:tblBorders>
-        <w:tblCellMar>
-          <w:left w:w="10" w:type="dxa"/>
-          <w:right w:w="10" w:type="dxa"/>
-        </w:tblCellMar>
-        <w:tblLook w:val="0000" w:firstRow="0" w:lastRow="0" w:firstColumn="0" w:lastColumn="0" w:noHBand="0" w:noVBand="0"/>
-      </w:tblPr>
-      <w:tblGrid>
-        <w:gridCol w:w="4680"/>
-        <w:gridCol w:w="4680"/>
-      </w:tblGrid>
-      <w:tr>
-        <w:tblPrEx>
-          <w:tblCellMar>
-            <w:top w:w="0" w:type="dxa"/>
-            <w:bottom w:w="0" w:type="dxa"/>
-          </w:tblCellMar>
-        </w:tblPrEx>
-        <w:trPr>
-          <w:cantSplit/>
-          <w:jc w:val="center"/>
-        </w:trPr>
+              <w:t>Figure 5.1 Experiment 1 vs ideal ADC</w:t>
+            </w:r>
+          </w:p>
+        </w:tc>
         <w:tc>
           <w:tcPr>
             <w:tcW w:w="4680" w:type="dxa"/>
@@ -4796,10 +4580,10 @@
                 <w:noProof/>
               </w:rPr>
               <w:drawing>
-                <wp:inline distT="0" distB="0" distL="0" distR="0" wp14:anchorId="618A77F6" wp14:editId="182914AD">
+                <wp:inline distT="0" distB="0" distL="0" distR="0" wp14:anchorId="4F193C71" wp14:editId="163099D7">
                   <wp:extent cx="2857500" cy="1790700"/>
                   <wp:effectExtent l="0" t="0" r="0" b="0"/>
-                  <wp:docPr id="1273208776" name="Picture 1273208776"/>
+                  <wp:docPr id="1869222194" name="Picture 1869222194"/>
                   <wp:cNvGraphicFramePr>
                     <a:graphicFrameLocks xmlns:a="http://schemas.openxmlformats.org/drawingml/2006/main" noChangeAspect="1"/>
                   </wp:cNvGraphicFramePr>
@@ -4847,10 +4631,64 @@
                 <w:sz w:val="20"/>
                 <w:szCs w:val="20"/>
               </w:rPr>
-              <w:t>Figure 5.3 Experiment 1 deviation from ideal</w:t>
-            </w:r>
-          </w:p>
-        </w:tc>
+              <w:t>Figure 5.2 Experiment 2 vs ideal ADC</w:t>
+            </w:r>
+          </w:p>
+        </w:tc>
+      </w:tr>
+    </w:tbl>
+    <w:p>
+      <w:pPr>
+        <w:keepNext/>
+        <w:spacing w:before="240" w:after="160"/>
+      </w:pPr>
+      <w:r>
+        <w:rPr>
+          <w:b/>
+          <w:bCs/>
+        </w:rPr>
+        <w:lastRenderedPageBreak/>
+        <w:t>5.4    Linearity and INL</w:t>
+      </w:r>
+    </w:p>
+    <w:p>
+      <w:pPr>
+        <w:keepNext/>
+        <w:spacing w:after="160" w:line="300" w:lineRule="auto"/>
+        <w:ind w:firstLine="540"/>
+        <w:jc w:val="both"/>
+      </w:pPr>
+      <w:r>
+        <w:t>The deviation from the ideal ADC (in LSB) and the endpoint INL (deviation from a straight line between the first and last valid points) were calculated for both experiments.</w:t>
+      </w:r>
+    </w:p>
+    <w:tbl>
+      <w:tblPr>
+        <w:tblW w:w="9360" w:type="dxa"/>
+        <w:jc w:val="center"/>
+        <w:tblBorders>
+          <w:top w:val="none" w:sz="0" w:space="0" w:color="FFFFFF"/>
+          <w:left w:val="none" w:sz="0" w:space="0" w:color="FFFFFF"/>
+          <w:bottom w:val="none" w:sz="0" w:space="0" w:color="FFFFFF"/>
+          <w:right w:val="none" w:sz="0" w:space="0" w:color="FFFFFF"/>
+          <w:insideH w:val="none" w:sz="0" w:space="0" w:color="FFFFFF"/>
+          <w:insideV w:val="none" w:sz="0" w:space="0" w:color="FFFFFF"/>
+        </w:tblBorders>
+        <w:tblCellMar>
+          <w:left w:w="10" w:type="dxa"/>
+          <w:right w:w="10" w:type="dxa"/>
+        </w:tblCellMar>
+        <w:tblLook w:val="0000" w:firstRow="0" w:lastRow="0" w:firstColumn="0" w:lastColumn="0" w:noHBand="0" w:noVBand="0"/>
+      </w:tblPr>
+      <w:tblGrid>
+        <w:gridCol w:w="4680"/>
+        <w:gridCol w:w="4680"/>
+      </w:tblGrid>
+      <w:tr>
+        <w:trPr>
+          <w:cantSplit/>
+          <w:jc w:val="center"/>
+        </w:trPr>
         <w:tc>
           <w:tcPr>
             <w:tcW w:w="4680" w:type="dxa"/>
@@ -4870,10 +4708,10 @@
                 <w:noProof/>
               </w:rPr>
               <w:drawing>
-                <wp:inline distT="0" distB="0" distL="0" distR="0" wp14:anchorId="7B0AF16F" wp14:editId="6DDD1F31">
+                <wp:inline distT="0" distB="0" distL="0" distR="0" wp14:anchorId="618A77F6" wp14:editId="182914AD">
                   <wp:extent cx="2857500" cy="1790700"/>
                   <wp:effectExtent l="0" t="0" r="0" b="0"/>
-                  <wp:docPr id="2102509777" name="Picture 2102509777"/>
+                  <wp:docPr id="1273208776" name="Picture 1273208776"/>
                   <wp:cNvGraphicFramePr>
                     <a:graphicFrameLocks xmlns:a="http://schemas.openxmlformats.org/drawingml/2006/main" noChangeAspect="1"/>
                   </wp:cNvGraphicFramePr>
@@ -4921,22 +4759,10 @@
                 <w:sz w:val="20"/>
                 <w:szCs w:val="20"/>
               </w:rPr>
-              <w:t>Figure 5.4 Experiment 2 deviation from ideal</w:t>
-            </w:r>
-          </w:p>
-        </w:tc>
-      </w:tr>
-      <w:tr>
-        <w:tblPrEx>
-          <w:tblCellMar>
-            <w:top w:w="0" w:type="dxa"/>
-            <w:bottom w:w="0" w:type="dxa"/>
-          </w:tblCellMar>
-        </w:tblPrEx>
-        <w:trPr>
-          <w:cantSplit/>
-          <w:jc w:val="center"/>
-        </w:trPr>
+              <w:t>Figure 5.3 Experiment 1 deviation from ideal</w:t>
+            </w:r>
+          </w:p>
+        </w:tc>
         <w:tc>
           <w:tcPr>
             <w:tcW w:w="4680" w:type="dxa"/>
@@ -4956,10 +4782,10 @@
                 <w:noProof/>
               </w:rPr>
               <w:drawing>
-                <wp:inline distT="0" distB="0" distL="0" distR="0" wp14:anchorId="57027BFB" wp14:editId="155B3CA7">
+                <wp:inline distT="0" distB="0" distL="0" distR="0" wp14:anchorId="7B0AF16F" wp14:editId="6DDD1F31">
                   <wp:extent cx="2857500" cy="1790700"/>
                   <wp:effectExtent l="0" t="0" r="0" b="0"/>
-                  <wp:docPr id="80313615" name="Picture 80313615"/>
+                  <wp:docPr id="2102509777" name="Picture 2102509777"/>
                   <wp:cNvGraphicFramePr>
                     <a:graphicFrameLocks xmlns:a="http://schemas.openxmlformats.org/drawingml/2006/main" noChangeAspect="1"/>
                   </wp:cNvGraphicFramePr>
@@ -5007,10 +4833,16 @@
                 <w:sz w:val="20"/>
                 <w:szCs w:val="20"/>
               </w:rPr>
-              <w:t>Figure 5.5 Experiment 1 endpoint INL</w:t>
-            </w:r>
-          </w:p>
-        </w:tc>
+              <w:t>Figure 5.4 Experiment 2 deviation from ideal</w:t>
+            </w:r>
+          </w:p>
+        </w:tc>
+      </w:tr>
+      <w:tr>
+        <w:trPr>
+          <w:cantSplit/>
+          <w:jc w:val="center"/>
+        </w:trPr>
         <w:tc>
           <w:tcPr>
             <w:tcW w:w="4680" w:type="dxa"/>
@@ -5030,10 +4862,10 @@
                 <w:noProof/>
               </w:rPr>
               <w:drawing>
-                <wp:inline distT="0" distB="0" distL="0" distR="0" wp14:anchorId="68329ECB" wp14:editId="7902C090">
+                <wp:inline distT="0" distB="0" distL="0" distR="0" wp14:anchorId="57027BFB" wp14:editId="155B3CA7">
                   <wp:extent cx="2857500" cy="1790700"/>
                   <wp:effectExtent l="0" t="0" r="0" b="0"/>
-                  <wp:docPr id="1897414921" name="Picture 1897414921"/>
+                  <wp:docPr id="80313615" name="Picture 80313615"/>
                   <wp:cNvGraphicFramePr>
                     <a:graphicFrameLocks xmlns:a="http://schemas.openxmlformats.org/drawingml/2006/main" noChangeAspect="1"/>
                   </wp:cNvGraphicFramePr>
@@ -5081,6 +4913,80 @@
                 <w:sz w:val="20"/>
                 <w:szCs w:val="20"/>
               </w:rPr>
+              <w:t>Figure 5.5 Experiment 1 endpoint INL</w:t>
+            </w:r>
+          </w:p>
+        </w:tc>
+        <w:tc>
+          <w:tcPr>
+            <w:tcW w:w="4680" w:type="dxa"/>
+            <w:tcBorders>
+              <w:top w:val="none" w:sz="0" w:space="0" w:color="FFFFFF"/>
+              <w:left w:val="none" w:sz="0" w:space="0" w:color="FFFFFF"/>
+              <w:bottom w:val="none" w:sz="0" w:space="0" w:color="FFFFFF"/>
+              <w:right w:val="none" w:sz="0" w:space="0" w:color="FFFFFF"/>
+            </w:tcBorders>
+          </w:tcPr>
+          <w:p>
+            <w:pPr>
+              <w:jc w:val="center"/>
+            </w:pPr>
+            <w:r>
+              <w:rPr>
+                <w:noProof/>
+              </w:rPr>
+              <w:drawing>
+                <wp:inline distT="0" distB="0" distL="0" distR="0" wp14:anchorId="68329ECB" wp14:editId="7902C090">
+                  <wp:extent cx="2857500" cy="1790700"/>
+                  <wp:effectExtent l="0" t="0" r="0" b="0"/>
+                  <wp:docPr id="1897414921" name="Picture 1897414921"/>
+                  <wp:cNvGraphicFramePr>
+                    <a:graphicFrameLocks xmlns:a="http://schemas.openxmlformats.org/drawingml/2006/main" noChangeAspect="1"/>
+                  </wp:cNvGraphicFramePr>
+                  <a:graphic xmlns:a="http://schemas.openxmlformats.org/drawingml/2006/main">
+                    <a:graphicData uri="http://schemas.openxmlformats.org/drawingml/2006/picture">
+                      <pic:pic xmlns:pic="http://schemas.openxmlformats.org/drawingml/2006/picture">
+                        <pic:nvPicPr>
+                          <pic:cNvPr id="0" name=""/>
+                          <pic:cNvPicPr>
+                            <a:picLocks noChangeAspect="1" noChangeArrowheads="1"/>
+                          </pic:cNvPicPr>
+                        </pic:nvPicPr>
+                        <pic:blipFill>
+                          <a:blip r:embed="rId20"/>
+                          <a:srcRect/>
+                          <a:stretch>
+                            <a:fillRect/>
+                          </a:stretch>
+                        </pic:blipFill>
+                        <pic:spPr bwMode="auto">
+                          <a:xfrm>
+                            <a:off x="0" y="0"/>
+                            <a:ext cx="2857500" cy="1790700"/>
+                          </a:xfrm>
+                          <a:prstGeom prst="rect">
+                            <a:avLst/>
+                          </a:prstGeom>
+                        </pic:spPr>
+                      </pic:pic>
+                    </a:graphicData>
+                  </a:graphic>
+                </wp:inline>
+              </w:drawing>
+            </w:r>
+          </w:p>
+          <w:p>
+            <w:pPr>
+              <w:spacing w:after="200" w:line="300" w:lineRule="auto"/>
+              <w:jc w:val="center"/>
+            </w:pPr>
+            <w:r>
+              <w:rPr>
+                <w:b/>
+                <w:bCs/>
+                <w:sz w:val="20"/>
+                <w:szCs w:val="20"/>
+              </w:rPr>
               <w:t>Figure 5.6 Experiment 2 endpoint INL</w:t>
             </w:r>
           </w:p>
@@ -5127,12 +5033,6 @@
         <w:gridCol w:w="3000"/>
       </w:tblGrid>
       <w:tr>
-        <w:tblPrEx>
-          <w:tblCellMar>
-            <w:top w:w="0" w:type="dxa"/>
-            <w:bottom w:w="0" w:type="dxa"/>
-          </w:tblCellMar>
-        </w:tblPrEx>
         <w:trPr>
           <w:cantSplit/>
           <w:tblHeader/>
@@ -5233,12 +5133,6 @@
         </w:tc>
       </w:tr>
       <w:tr>
-        <w:tblPrEx>
-          <w:tblCellMar>
-            <w:top w:w="0" w:type="dxa"/>
-            <w:bottom w:w="0" w:type="dxa"/>
-          </w:tblCellMar>
-        </w:tblPrEx>
         <w:trPr>
           <w:cantSplit/>
           <w:jc w:val="center"/>
@@ -5338,12 +5232,6 @@
         </w:tc>
       </w:tr>
       <w:tr>
-        <w:tblPrEx>
-          <w:tblCellMar>
-            <w:top w:w="0" w:type="dxa"/>
-            <w:bottom w:w="0" w:type="dxa"/>
-          </w:tblCellMar>
-        </w:tblPrEx>
         <w:trPr>
           <w:cantSplit/>
           <w:jc w:val="center"/>
@@ -5460,7 +5348,7 @@
           <w:b/>
           <w:bCs/>
         </w:rPr>
-        <w:t xml:space="preserve">5.5    Discussion</w:t>
+        <w:t>5.5    Discussion</w:t>
       </w:r>
     </w:p>
     <w:p>
@@ -5483,7 +5371,8 @@
           <w:b/>
           <w:bCs/>
         </w:rPr>
-        <w:t xml:space="preserve">5.6    Bonus: Python GUI</w:t>
+        <w:lastRenderedPageBreak/>
+        <w:t>5.6    Bonus: Python GUI</w:t>
       </w:r>
     </w:p>
     <w:p>
@@ -5493,7 +5382,7 @@
         <w:jc w:val="both"/>
       </w:pPr>
       <w:r>
-        <w:t xml:space="preserve">The bonus task was completed: the full digital voltmeter GUI (online and offline modes) was built in Python with Tkinter and pyserial, since MATLAB was not available. It reads live data from the Arduino over the serial port and loads stored measurements from CSV files (Figures 4.1–4.3). AI assistance was used to debug and improve the GUI code.</w:t>
+        <w:t>The bonus task was completed: the full digital voltmeter GUI (online and offline modes) was built in Python with Tkinter and pyserial, since MATLAB was not available. It reads live data from the Arduino over the serial port and loads stored measurements from CSV files (Figures 4.1–4.3). AI assistance was used to debug and improve the GUI code.</w:t>
       </w:r>
     </w:p>
     <w:p>
@@ -5554,7 +5443,7 @@
           <w:sz w:val="22"/>
           <w:szCs w:val="22"/>
         </w:rPr>
-        <w:t xml:space="preserve">AI (Claude, Anthropic) was used to help write the Python analysis and plotting code (Figures 5.1–5.6, Appendix A), to debug the GUI code, and to format this report. All measurements, photos and screenshots were taken by the group.</w:t>
+        <w:t>AI (Claude, Anthropic) was used to help write the Python analysis and plotting code (Figures 5.1–5.6, Appendix A), to debug the GUI code, and to format this report. All measurements, photos and screenshots were taken by the group.</w:t>
       </w:r>
     </w:p>
     <w:p/>
@@ -5603,7 +5492,7 @@
         <w:spacing w:after="160" w:line="300" w:lineRule="auto"/>
       </w:pPr>
       <w:r>
-        <w:t xml:space="preserve">[4]  EEE309 Project 2 source code (prj2_gui.py, prj2-ex2.2.py, prj2_analysis.py), GitHub: https://github.com/gingerismisharam/EEE309Project2</w:t>
+        <w:t>[4]  EEE309 Project 2 source code (prj2_gui.py, prj2-ex2.2.py, prj2_analysis.py), GitHub: https://github.com/gingerismisharam/EEE309Project2</w:t>
       </w:r>
     </w:p>
     <w:p>
@@ -5640,11 +5529,10 @@
           <w:sz w:val="22"/>
           <w:szCs w:val="22"/>
         </w:rPr>
-        <w:t xml:space="preserve">This code was written with AI assistance (Claude, Anthropic) and run by the group. The full source code (prj2_gui.py, prj2-ex2.2.py, prj2_analysis.py) is available on GitHub [4].</w:t>
-      </w:r>
-    </w:p>
-    <w:p>
-      <w:pPr/>
+        <w:t>This code was written with AI assistance (Claude, Anthropic) and run by the group. The full source code (prj2_gui.py, prj2-ex2.2.py, prj2_analysis.py) is available on GitHub [4].</w:t>
+      </w:r>
+    </w:p>
+    <w:p>
       <w:r>
         <w:rPr>
           <w:rFonts w:ascii="Calibri" w:eastAsia="Calibri" w:hAnsi="Calibri" w:cs="Calibri"/>
@@ -5655,7 +5543,6 @@
       </w:r>
     </w:p>
     <w:p>
-      <w:pPr/>
       <w:r>
         <w:rPr>
           <w:rFonts w:ascii="Calibri" w:eastAsia="Calibri" w:hAnsi="Calibri" w:cs="Calibri"/>
@@ -5665,11 +5552,8 @@
         <w:t>import matplotlib.pyplot as plt</w:t>
       </w:r>
     </w:p>
-    <w:p>
-      <w:pPr/>
-    </w:p>
-    <w:p>
-      <w:pPr/>
+    <w:p/>
+    <w:p>
       <w:r>
         <w:rPr>
           <w:rFonts w:ascii="Calibri" w:eastAsia="Calibri" w:hAnsi="Calibri" w:cs="Calibri"/>
@@ -5680,7 +5564,6 @@
       </w:r>
     </w:p>
     <w:p>
-      <w:pPr/>
       <w:r>
         <w:rPr>
           <w:rFonts w:ascii="Calibri" w:eastAsia="Calibri" w:hAnsi="Calibri" w:cs="Calibri"/>
@@ -5691,7 +5574,6 @@
       </w:r>
     </w:p>
     <w:p>
-      <w:pPr/>
       <w:r>
         <w:rPr>
           <w:rFonts w:ascii="Calibri" w:eastAsia="Calibri" w:hAnsi="Calibri" w:cs="Calibri"/>
@@ -5702,7 +5584,6 @@
       </w:r>
     </w:p>
     <w:p>
-      <w:pPr/>
       <w:r>
         <w:rPr>
           <w:rFonts w:ascii="Calibri" w:eastAsia="Calibri" w:hAnsi="Calibri" w:cs="Calibri"/>
@@ -5712,11 +5593,8 @@
         <w:t>ideal_adc = multimeter * 1023 / 5.0</w:t>
       </w:r>
     </w:p>
-    <w:p>
-      <w:pPr/>
-    </w:p>
-    <w:p>
-      <w:pPr/>
+    <w:p/>
+    <w:p>
       <w:r>
         <w:rPr>
           <w:rFonts w:ascii="Calibri" w:eastAsia="Calibri" w:hAnsi="Calibri" w:cs="Calibri"/>
@@ -5727,7 +5605,6 @@
       </w:r>
     </w:p>
     <w:p>
-      <w:pPr/>
       <w:r>
         <w:rPr>
           <w:rFonts w:ascii="Calibri" w:eastAsia="Calibri" w:hAnsi="Calibri" w:cs="Calibri"/>
@@ -5738,7 +5615,6 @@
       </w:r>
     </w:p>
     <w:p>
-      <w:pPr/>
       <w:r>
         <w:rPr>
           <w:rFonts w:ascii="Calibri" w:eastAsia="Calibri" w:hAnsi="Calibri" w:cs="Calibri"/>
@@ -5749,7 +5625,6 @@
       </w:r>
     </w:p>
     <w:p>
-      <w:pPr/>
       <w:r>
         <w:rPr>
           <w:rFonts w:ascii="Calibri" w:eastAsia="Calibri" w:hAnsi="Calibri" w:cs="Calibri"/>
@@ -5760,7 +5635,6 @@
       </w:r>
     </w:p>
     <w:p>
-      <w:pPr/>
       <w:r>
         <w:rPr>
           <w:rFonts w:ascii="Calibri" w:eastAsia="Calibri" w:hAnsi="Calibri" w:cs="Calibri"/>
@@ -5771,7 +5645,6 @@
       </w:r>
     </w:p>
     <w:p>
-      <w:pPr/>
       <w:r>
         <w:rPr>
           <w:rFonts w:ascii="Calibri" w:eastAsia="Calibri" w:hAnsi="Calibri" w:cs="Calibri"/>
@@ -5782,7 +5655,6 @@
       </w:r>
     </w:p>
     <w:p>
-      <w:pPr/>
       <w:r>
         <w:rPr>
           <w:rFonts w:ascii="Calibri" w:eastAsia="Calibri" w:hAnsi="Calibri" w:cs="Calibri"/>
@@ -5793,7 +5665,6 @@
       </w:r>
     </w:p>
     <w:p>
-      <w:pPr/>
       <w:r>
         <w:rPr>
           <w:rFonts w:ascii="Calibri" w:eastAsia="Calibri" w:hAnsi="Calibri" w:cs="Calibri"/>
@@ -5804,7 +5675,6 @@
       </w:r>
     </w:p>
     <w:p>
-      <w:pPr/>
       <w:r>
         <w:rPr>
           <w:rFonts w:ascii="Calibri" w:eastAsia="Calibri" w:hAnsi="Calibri" w:cs="Calibri"/>
@@ -5815,7 +5685,6 @@
       </w:r>
     </w:p>
     <w:p>
-      <w:pPr/>
       <w:r>
         <w:rPr>
           <w:rFonts w:ascii="Calibri" w:eastAsia="Calibri" w:hAnsi="Calibri" w:cs="Calibri"/>
@@ -5825,11 +5694,8 @@
         <w:t xml:space="preserve">    plt.grid(True)</w:t>
       </w:r>
     </w:p>
-    <w:p>
-      <w:pPr/>
-    </w:p>
-    <w:p>
-      <w:pPr/>
+    <w:p/>
+    <w:p>
       <w:r>
         <w:rPr>
           <w:rFonts w:ascii="Calibri" w:eastAsia="Calibri" w:hAnsi="Calibri" w:cs="Calibri"/>
@@ -5840,7 +5706,6 @@
       </w:r>
     </w:p>
     <w:p>
-      <w:pPr/>
       <w:r>
         <w:rPr>
           <w:rFonts w:ascii="Calibri" w:eastAsia="Calibri" w:hAnsi="Calibri" w:cs="Calibri"/>
@@ -5851,7 +5716,6 @@
       </w:r>
     </w:p>
     <w:p>
-      <w:pPr/>
       <w:r>
         <w:rPr>
           <w:rFonts w:ascii="Calibri" w:eastAsia="Calibri" w:hAnsi="Calibri" w:cs="Calibri"/>
@@ -5862,7 +5726,6 @@
       </w:r>
     </w:p>
     <w:p>
-      <w:pPr/>
       <w:r>
         <w:rPr>
           <w:rFonts w:ascii="Calibri" w:eastAsia="Calibri" w:hAnsi="Calibri" w:cs="Calibri"/>
@@ -5873,7 +5736,6 @@
       </w:r>
     </w:p>
     <w:p>
-      <w:pPr/>
       <w:r>
         <w:rPr>
           <w:rFonts w:ascii="Calibri" w:eastAsia="Calibri" w:hAnsi="Calibri" w:cs="Calibri"/>
@@ -5884,7 +5746,6 @@
       </w:r>
     </w:p>
     <w:p>
-      <w:pPr/>
       <w:r>
         <w:rPr>
           <w:rFonts w:ascii="Calibri" w:eastAsia="Calibri" w:hAnsi="Calibri" w:cs="Calibri"/>
@@ -5895,7 +5756,6 @@
       </w:r>
     </w:p>
     <w:p>
-      <w:pPr/>
       <w:r>
         <w:rPr>
           <w:rFonts w:ascii="Calibri" w:eastAsia="Calibri" w:hAnsi="Calibri" w:cs="Calibri"/>
@@ -5906,7 +5766,6 @@
       </w:r>
     </w:p>
     <w:p>
-      <w:pPr/>
       <w:r>
         <w:rPr>
           <w:rFonts w:ascii="Calibri" w:eastAsia="Calibri" w:hAnsi="Calibri" w:cs="Calibri"/>
@@ -5917,7 +5776,6 @@
       </w:r>
     </w:p>
     <w:p>
-      <w:pPr/>
       <w:r>
         <w:rPr>
           <w:rFonts w:ascii="Calibri" w:eastAsia="Calibri" w:hAnsi="Calibri" w:cs="Calibri"/>
@@ -5928,7 +5786,6 @@
       </w:r>
     </w:p>
     <w:p>
-      <w:pPr/>
       <w:r>
         <w:rPr>
           <w:rFonts w:ascii="Calibri" w:eastAsia="Calibri" w:hAnsi="Calibri" w:cs="Calibri"/>
@@ -5938,11 +5795,8 @@
         <w:t xml:space="preserve">    plt.grid(True)</w:t>
       </w:r>
     </w:p>
-    <w:p>
-      <w:pPr/>
-    </w:p>
-    <w:p>
-      <w:pPr/>
+    <w:p/>
+    <w:p>
       <w:r>
         <w:rPr>
           <w:rFonts w:ascii="Calibri" w:eastAsia="Calibri" w:hAnsi="Calibri" w:cs="Calibri"/>
@@ -5953,7 +5807,6 @@
       </w:r>
     </w:p>
     <w:p>
-      <w:pPr/>
       <w:r>
         <w:rPr>
           <w:rFonts w:ascii="Calibri" w:eastAsia="Calibri" w:hAnsi="Calibri" w:cs="Calibri"/>
@@ -5964,7 +5817,6 @@
       </w:r>
     </w:p>
     <w:p>
-      <w:pPr/>
       <w:r>
         <w:rPr>
           <w:rFonts w:ascii="Calibri" w:eastAsia="Calibri" w:hAnsi="Calibri" w:cs="Calibri"/>
@@ -5975,7 +5827,6 @@
       </w:r>
     </w:p>
     <w:p>
-      <w:pPr/>
       <w:r>
         <w:rPr>
           <w:rFonts w:ascii="Calibri" w:eastAsia="Calibri" w:hAnsi="Calibri" w:cs="Calibri"/>
@@ -5986,7 +5837,6 @@
       </w:r>
     </w:p>
     <w:p>
-      <w:pPr/>
       <w:r>
         <w:rPr>
           <w:rFonts w:ascii="Calibri" w:eastAsia="Calibri" w:hAnsi="Calibri" w:cs="Calibri"/>
@@ -5997,7 +5847,6 @@
       </w:r>
     </w:p>
     <w:p>
-      <w:pPr/>
       <w:r>
         <w:rPr>
           <w:rFonts w:ascii="Calibri" w:eastAsia="Calibri" w:hAnsi="Calibri" w:cs="Calibri"/>
@@ -6008,7 +5857,6 @@
       </w:r>
     </w:p>
     <w:p>
-      <w:pPr/>
       <w:r>
         <w:rPr>
           <w:rFonts w:ascii="Calibri" w:eastAsia="Calibri" w:hAnsi="Calibri" w:cs="Calibri"/>
@@ -6019,7 +5867,6 @@
       </w:r>
     </w:p>
     <w:p>
-      <w:pPr/>
       <w:r>
         <w:rPr>
           <w:rFonts w:ascii="Calibri" w:eastAsia="Calibri" w:hAnsi="Calibri" w:cs="Calibri"/>
@@ -6030,7 +5877,6 @@
       </w:r>
     </w:p>
     <w:p>
-      <w:pPr/>
       <w:r>
         <w:rPr>
           <w:rFonts w:ascii="Calibri" w:eastAsia="Calibri" w:hAnsi="Calibri" w:cs="Calibri"/>
@@ -6041,7 +5887,6 @@
       </w:r>
     </w:p>
     <w:p>
-      <w:pPr/>
       <w:r>
         <w:rPr>
           <w:rFonts w:ascii="Calibri" w:eastAsia="Calibri" w:hAnsi="Calibri" w:cs="Calibri"/>
@@ -6052,7 +5897,6 @@
       </w:r>
     </w:p>
     <w:p>
-      <w:pPr/>
       <w:r>
         <w:rPr>
           <w:rFonts w:ascii="Calibri" w:eastAsia="Calibri" w:hAnsi="Calibri" w:cs="Calibri"/>
@@ -6062,24 +5906,22 @@
         <w:t xml:space="preserve">    plt.grid(True)</w:t>
       </w:r>
     </w:p>
-    <w:p>
-      <w:pPr/>
-    </w:p>
-    <w:p>
-      <w:pPr/>
+    <w:p/>
+    <w:p>
       <w:r>
         <w:rPr>
           <w:rFonts w:ascii="Calibri" w:eastAsia="Calibri" w:hAnsi="Calibri" w:cs="Calibri"/>
           <w:sz w:val="22"/>
           <w:szCs w:val="22"/>
         </w:rPr>
+        <w:lastRenderedPageBreak/>
         <w:t>plt.show()</w:t>
       </w:r>
     </w:p>
     <w:p/>
     <w:sectPr>
-      <w:footerReference w:type="default" r:id="rId20"/>
-      <w:footerReference w:type="first" r:id="rId21"/>
+      <w:footerReference w:type="default" r:id="rId21"/>
+      <w:footerReference w:type="first" r:id="rId22"/>
       <w:pgSz w:w="12240" w:h="15840"/>
       <w:pgMar w:top="1440" w:right="1440" w:bottom="1440" w:left="1440" w:header="708" w:footer="708" w:gutter="0"/>
       <w:cols w:space="720"/>
@@ -7148,6 +6990,7 @@
   <w:style w:type="character" w:default="1" w:styleId="DefaultParagraphFont">
     <w:name w:val="Default Paragraph Font"/>
     <w:uiPriority w:val="1"/>
+    <w:semiHidden/>
     <w:unhideWhenUsed/>
   </w:style>
   <w:style w:type="table" w:default="1" w:styleId="TableNormal">
@@ -7579,4 +7422,16 @@
     </a:ext>
   </a:extLst>
 </a:theme>
+</file>
+
+<file path=customXml/item1.xml><?xml version="1.0" encoding="utf-8"?>
+<b:Sources xmlns:b="http://schemas.openxmlformats.org/officeDocument/2006/bibliography" xmlns="http://schemas.openxmlformats.org/officeDocument/2006/bibliography" SelectedStyle="\APASixthEditionOfficeOnline.xsl" StyleName="APA" Version="6"/>
+</file>
+
+<file path=customXml/itemProps1.xml><?xml version="1.0" encoding="utf-8"?>
+<ds:datastoreItem xmlns:ds="http://schemas.openxmlformats.org/officeDocument/2006/customXml" ds:itemID="{F1C8B960-150C-49F4-A69F-17E7A9299B46}">
+  <ds:schemaRefs>
+    <ds:schemaRef ds:uri="http://schemas.openxmlformats.org/officeDocument/2006/bibliography"/>
+  </ds:schemaRefs>
+</ds:datastoreItem>
 </file>
</xml_diff>

<commit_message>
Update Project 2 report and keep old version
</commit_message>
<xml_diff>
--- a/EEE309_Project2_ADC_Report.docx
+++ b/EEE309_Project2_ADC_Report.docx
@@ -230,9 +230,11 @@
         <w:spacing w:after="100"/>
         <w:ind w:left="720"/>
       </w:pPr>
+      <w:proofErr w:type="gramStart"/>
       <w:r>
         <w:t>1.1  Objective</w:t>
       </w:r>
+      <w:proofErr w:type="gramEnd"/>
       <w:r>
         <w:tab/>
         <w:t>3</w:t>
@@ -246,8 +248,13 @@
         <w:spacing w:after="100"/>
         <w:ind w:left="720"/>
       </w:pPr>
-      <w:r>
-        <w:t>1.2  Pre-Lab Questions</w:t>
+      <w:proofErr w:type="gramStart"/>
+      <w:r>
+        <w:t>1.2  Pre</w:t>
+      </w:r>
+      <w:proofErr w:type="gramEnd"/>
+      <w:r>
+        <w:t>-Lab Questions</w:t>
       </w:r>
       <w:r>
         <w:tab/>
@@ -281,9 +288,11 @@
         <w:spacing w:after="100"/>
         <w:ind w:left="720"/>
       </w:pPr>
+      <w:proofErr w:type="gramStart"/>
       <w:r>
         <w:t>2.1  Components</w:t>
       </w:r>
+      <w:proofErr w:type="gramEnd"/>
       <w:r>
         <w:tab/>
         <w:t>4</w:t>
@@ -297,8 +306,13 @@
         <w:spacing w:after="100"/>
         <w:ind w:left="720"/>
       </w:pPr>
-      <w:r>
-        <w:t>2.2  Circuit and Setup</w:t>
+      <w:proofErr w:type="gramStart"/>
+      <w:r>
+        <w:t>2.2  Circuit</w:t>
+      </w:r>
+      <w:proofErr w:type="gramEnd"/>
+      <w:r>
+        <w:t xml:space="preserve"> and Setup</w:t>
       </w:r>
       <w:r>
         <w:tab/>
@@ -313,8 +327,13 @@
         <w:spacing w:after="100"/>
         <w:ind w:left="720"/>
       </w:pPr>
-      <w:r>
-        <w:t>2.3  Arduino Code</w:t>
+      <w:proofErr w:type="gramStart"/>
+      <w:r>
+        <w:t>2.3  Arduino</w:t>
+      </w:r>
+      <w:proofErr w:type="gramEnd"/>
+      <w:r>
+        <w:t xml:space="preserve"> Code</w:t>
       </w:r>
       <w:r>
         <w:tab/>
@@ -348,8 +367,13 @@
         <w:spacing w:after="100"/>
         <w:ind w:left="720"/>
       </w:pPr>
-      <w:r>
-        <w:t>3.1  Part 1: Arduino Serial Monitor</w:t>
+      <w:proofErr w:type="gramStart"/>
+      <w:r>
+        <w:t>3.1  Part</w:t>
+      </w:r>
+      <w:proofErr w:type="gramEnd"/>
+      <w:r>
+        <w:t xml:space="preserve"> 1: Arduino Serial Monitor</w:t>
       </w:r>
       <w:r>
         <w:tab/>
@@ -364,8 +388,13 @@
         <w:spacing w:after="100"/>
         <w:ind w:left="720"/>
       </w:pPr>
-      <w:r>
-        <w:t>3.2  Part 2: Python Serial Reading</w:t>
+      <w:proofErr w:type="gramStart"/>
+      <w:r>
+        <w:t>3.2  Part</w:t>
+      </w:r>
+      <w:proofErr w:type="gramEnd"/>
+      <w:r>
+        <w:t xml:space="preserve"> 2: Python Serial Reading</w:t>
       </w:r>
       <w:r>
         <w:tab/>
@@ -399,8 +428,13 @@
         <w:spacing w:after="100"/>
         <w:ind w:left="720"/>
       </w:pPr>
-      <w:r>
-        <w:t>4.1  Design Decisions</w:t>
+      <w:proofErr w:type="gramStart"/>
+      <w:r>
+        <w:t>4.1  Design</w:t>
+      </w:r>
+      <w:proofErr w:type="gramEnd"/>
+      <w:r>
+        <w:t xml:space="preserve"> Decisions</w:t>
       </w:r>
       <w:r>
         <w:tab/>
@@ -415,8 +449,13 @@
         <w:spacing w:after="100"/>
         <w:ind w:left="720"/>
       </w:pPr>
-      <w:r>
-        <w:t>4.2  Online Mode</w:t>
+      <w:proofErr w:type="gramStart"/>
+      <w:r>
+        <w:t>4.2  Online</w:t>
+      </w:r>
+      <w:proofErr w:type="gramEnd"/>
+      <w:r>
+        <w:t xml:space="preserve"> Mode</w:t>
       </w:r>
       <w:r>
         <w:tab/>
@@ -431,8 +470,13 @@
         <w:spacing w:after="100"/>
         <w:ind w:left="720"/>
       </w:pPr>
-      <w:r>
-        <w:t>4.3  Offline Mode</w:t>
+      <w:proofErr w:type="gramStart"/>
+      <w:r>
+        <w:t>4.3  Offline</w:t>
+      </w:r>
+      <w:proofErr w:type="gramEnd"/>
+      <w:r>
+        <w:t xml:space="preserve"> Mode</w:t>
       </w:r>
       <w:r>
         <w:tab/>
@@ -466,8 +510,13 @@
         <w:spacing w:after="100"/>
         <w:ind w:left="720"/>
       </w:pPr>
-      <w:r>
-        <w:t>5.1  Measurement Vectors and Ideal ADC</w:t>
+      <w:proofErr w:type="gramStart"/>
+      <w:r>
+        <w:t>5.1  Measurement</w:t>
+      </w:r>
+      <w:proofErr w:type="gramEnd"/>
+      <w:r>
+        <w:t xml:space="preserve"> Vectors and Ideal ADC</w:t>
       </w:r>
       <w:r>
         <w:tab/>
@@ -482,8 +531,13 @@
         <w:spacing w:after="100"/>
         <w:ind w:left="720"/>
       </w:pPr>
-      <w:r>
-        <w:t>5.2  ADC-to-Voltage Conversion</w:t>
+      <w:proofErr w:type="gramStart"/>
+      <w:r>
+        <w:t>5.2  ADC</w:t>
+      </w:r>
+      <w:proofErr w:type="gramEnd"/>
+      <w:r>
+        <w:t>-to-Voltage Conversion</w:t>
       </w:r>
       <w:r>
         <w:tab/>
@@ -498,8 +552,13 @@
         <w:spacing w:after="100"/>
         <w:ind w:left="720"/>
       </w:pPr>
-      <w:r>
-        <w:t>5.3  Measured vs Ideal ADC Output</w:t>
+      <w:proofErr w:type="gramStart"/>
+      <w:r>
+        <w:t>5.3  Measured</w:t>
+      </w:r>
+      <w:proofErr w:type="gramEnd"/>
+      <w:r>
+        <w:t xml:space="preserve"> vs Ideal ADC Output</w:t>
       </w:r>
       <w:r>
         <w:tab/>
@@ -514,8 +573,13 @@
         <w:spacing w:after="100"/>
         <w:ind w:left="720"/>
       </w:pPr>
-      <w:r>
-        <w:t>5.4  Linearity and INL</w:t>
+      <w:proofErr w:type="gramStart"/>
+      <w:r>
+        <w:t>5.4  Linearity</w:t>
+      </w:r>
+      <w:proofErr w:type="gramEnd"/>
+      <w:r>
+        <w:t xml:space="preserve"> and INL</w:t>
       </w:r>
       <w:r>
         <w:tab/>
@@ -530,9 +594,11 @@
         <w:spacing w:after="100"/>
         <w:ind w:left="720"/>
       </w:pPr>
+      <w:proofErr w:type="gramStart"/>
       <w:r>
         <w:t>5.5  Discussion</w:t>
       </w:r>
+      <w:proofErr w:type="gramEnd"/>
       <w:r>
         <w:tab/>
         <w:t>11</w:t>
@@ -546,8 +612,13 @@
         <w:spacing w:after="100"/>
         <w:ind w:left="720"/>
       </w:pPr>
-      <w:r>
-        <w:t>5.6  Bonus: Python GUI</w:t>
+      <w:proofErr w:type="gramStart"/>
+      <w:r>
+        <w:t>5.6  Bonus</w:t>
+      </w:r>
+      <w:proofErr w:type="gramEnd"/>
+      <w:r>
+        <w:t>: Python GUI</w:t>
       </w:r>
       <w:r>
         <w:tab/>
@@ -694,13 +765,21 @@
         <w:jc w:val="both"/>
       </w:pPr>
       <w:r>
-        <w:t>A 10</w:t>
+        <w:t xml:space="preserve">A </w:t>
+      </w:r>
+      <w:proofErr w:type="gramStart"/>
+      <w:r>
+        <w:t>10</w:t>
       </w:r>
       <w:r>
         <w:t xml:space="preserve"> </w:t>
       </w:r>
       <w:r>
-        <w:t>bit ADC has 2^10 = 1024 levels</w:t>
+        <w:t>bit</w:t>
+      </w:r>
+      <w:proofErr w:type="gramEnd"/>
+      <w:r>
+        <w:t xml:space="preserve"> ADC has 2^10 = 1024 levels</w:t>
       </w:r>
       <w:r>
         <w:t xml:space="preserve">, </w:t>
@@ -748,8 +827,19 @@
           <w:szCs w:val="28"/>
         </w:rPr>
         <w:lastRenderedPageBreak/>
-        <w:t>2    EXPERIMENTAL SETUP</w:t>
-      </w:r>
+        <w:t xml:space="preserve">2    EXPERIMENTAL </w:t>
+      </w:r>
+      <w:proofErr w:type="gramStart"/>
+      <w:r>
+        <w:rPr>
+          <w:b/>
+          <w:bCs/>
+          <w:sz w:val="28"/>
+          <w:szCs w:val="28"/>
+        </w:rPr>
+        <w:t>SETUP</w:t>
+      </w:r>
+      <w:proofErr w:type="gramEnd"/>
     </w:p>
     <w:p>
       <w:pPr>
@@ -1076,7 +1166,25 @@
           <w:sz w:val="22"/>
           <w:szCs w:val="22"/>
         </w:rPr>
-        <w:t>int val_pot;</w:t>
+        <w:t xml:space="preserve">int </w:t>
+      </w:r>
+      <w:proofErr w:type="spellStart"/>
+      <w:r>
+        <w:rPr>
+          <w:rFonts w:ascii="Calibri" w:eastAsia="Calibri" w:hAnsi="Calibri" w:cs="Calibri"/>
+          <w:sz w:val="22"/>
+          <w:szCs w:val="22"/>
+        </w:rPr>
+        <w:t>val_pot</w:t>
+      </w:r>
+      <w:proofErr w:type="spellEnd"/>
+      <w:r>
+        <w:rPr>
+          <w:rFonts w:ascii="Calibri" w:eastAsia="Calibri" w:hAnsi="Calibri" w:cs="Calibri"/>
+          <w:sz w:val="22"/>
+          <w:szCs w:val="22"/>
+        </w:rPr>
+        <w:t>;</w:t>
       </w:r>
     </w:p>
     <w:p>
@@ -1089,7 +1197,25 @@
           <w:sz w:val="22"/>
           <w:szCs w:val="22"/>
         </w:rPr>
-        <w:t>void setup() {</w:t>
+        <w:t xml:space="preserve">void </w:t>
+      </w:r>
+      <w:proofErr w:type="gramStart"/>
+      <w:r>
+        <w:rPr>
+          <w:rFonts w:ascii="Calibri" w:eastAsia="Calibri" w:hAnsi="Calibri" w:cs="Calibri"/>
+          <w:sz w:val="22"/>
+          <w:szCs w:val="22"/>
+        </w:rPr>
+        <w:t>setup(</w:t>
+      </w:r>
+      <w:proofErr w:type="gramEnd"/>
+      <w:r>
+        <w:rPr>
+          <w:rFonts w:ascii="Calibri" w:eastAsia="Calibri" w:hAnsi="Calibri" w:cs="Calibri"/>
+          <w:sz w:val="22"/>
+          <w:szCs w:val="22"/>
+        </w:rPr>
+        <w:t>) {</w:t>
       </w:r>
     </w:p>
     <w:p>
@@ -1102,7 +1228,25 @@
           <w:sz w:val="22"/>
           <w:szCs w:val="22"/>
         </w:rPr>
-        <w:t xml:space="preserve">    Serial.begin(9600);</w:t>
+        <w:t xml:space="preserve">    </w:t>
+      </w:r>
+      <w:proofErr w:type="spellStart"/>
+      <w:r>
+        <w:rPr>
+          <w:rFonts w:ascii="Calibri" w:eastAsia="Calibri" w:hAnsi="Calibri" w:cs="Calibri"/>
+          <w:sz w:val="22"/>
+          <w:szCs w:val="22"/>
+        </w:rPr>
+        <w:t>Serial.begin</w:t>
+      </w:r>
+      <w:proofErr w:type="spellEnd"/>
+      <w:r>
+        <w:rPr>
+          <w:rFonts w:ascii="Calibri" w:eastAsia="Calibri" w:hAnsi="Calibri" w:cs="Calibri"/>
+          <w:sz w:val="22"/>
+          <w:szCs w:val="22"/>
+        </w:rPr>
+        <w:t>(9600);</w:t>
       </w:r>
     </w:p>
     <w:p>
@@ -1128,7 +1272,25 @@
           <w:sz w:val="22"/>
           <w:szCs w:val="22"/>
         </w:rPr>
-        <w:t>void loop() {</w:t>
+        <w:t xml:space="preserve">void </w:t>
+      </w:r>
+      <w:proofErr w:type="gramStart"/>
+      <w:r>
+        <w:rPr>
+          <w:rFonts w:ascii="Calibri" w:eastAsia="Calibri" w:hAnsi="Calibri" w:cs="Calibri"/>
+          <w:sz w:val="22"/>
+          <w:szCs w:val="22"/>
+        </w:rPr>
+        <w:t>loop(</w:t>
+      </w:r>
+      <w:proofErr w:type="gramEnd"/>
+      <w:r>
+        <w:rPr>
+          <w:rFonts w:ascii="Calibri" w:eastAsia="Calibri" w:hAnsi="Calibri" w:cs="Calibri"/>
+          <w:sz w:val="22"/>
+          <w:szCs w:val="22"/>
+        </w:rPr>
+        <w:t>) {</w:t>
       </w:r>
     </w:p>
     <w:p>
@@ -1141,7 +1303,43 @@
           <w:sz w:val="22"/>
           <w:szCs w:val="22"/>
         </w:rPr>
-        <w:t xml:space="preserve">    val_pot = analogRead(A0);</w:t>
+        <w:t xml:space="preserve">    </w:t>
+      </w:r>
+      <w:proofErr w:type="spellStart"/>
+      <w:r>
+        <w:rPr>
+          <w:rFonts w:ascii="Calibri" w:eastAsia="Calibri" w:hAnsi="Calibri" w:cs="Calibri"/>
+          <w:sz w:val="22"/>
+          <w:szCs w:val="22"/>
+        </w:rPr>
+        <w:t>val_pot</w:t>
+      </w:r>
+      <w:proofErr w:type="spellEnd"/>
+      <w:r>
+        <w:rPr>
+          <w:rFonts w:ascii="Calibri" w:eastAsia="Calibri" w:hAnsi="Calibri" w:cs="Calibri"/>
+          <w:sz w:val="22"/>
+          <w:szCs w:val="22"/>
+        </w:rPr>
+        <w:t xml:space="preserve"> = </w:t>
+      </w:r>
+      <w:proofErr w:type="spellStart"/>
+      <w:r>
+        <w:rPr>
+          <w:rFonts w:ascii="Calibri" w:eastAsia="Calibri" w:hAnsi="Calibri" w:cs="Calibri"/>
+          <w:sz w:val="22"/>
+          <w:szCs w:val="22"/>
+        </w:rPr>
+        <w:t>analogRead</w:t>
+      </w:r>
+      <w:proofErr w:type="spellEnd"/>
+      <w:r>
+        <w:rPr>
+          <w:rFonts w:ascii="Calibri" w:eastAsia="Calibri" w:hAnsi="Calibri" w:cs="Calibri"/>
+          <w:sz w:val="22"/>
+          <w:szCs w:val="22"/>
+        </w:rPr>
+        <w:t>(A0);</w:t>
       </w:r>
     </w:p>
     <w:p>
@@ -1154,7 +1352,43 @@
           <w:sz w:val="22"/>
           <w:szCs w:val="22"/>
         </w:rPr>
-        <w:t xml:space="preserve">    Serial.println(val_pot);</w:t>
+        <w:t xml:space="preserve">    </w:t>
+      </w:r>
+      <w:proofErr w:type="spellStart"/>
+      <w:r>
+        <w:rPr>
+          <w:rFonts w:ascii="Calibri" w:eastAsia="Calibri" w:hAnsi="Calibri" w:cs="Calibri"/>
+          <w:sz w:val="22"/>
+          <w:szCs w:val="22"/>
+        </w:rPr>
+        <w:t>Serial.println</w:t>
+      </w:r>
+      <w:proofErr w:type="spellEnd"/>
+      <w:r>
+        <w:rPr>
+          <w:rFonts w:ascii="Calibri" w:eastAsia="Calibri" w:hAnsi="Calibri" w:cs="Calibri"/>
+          <w:sz w:val="22"/>
+          <w:szCs w:val="22"/>
+        </w:rPr>
+        <w:t>(</w:t>
+      </w:r>
+      <w:proofErr w:type="spellStart"/>
+      <w:r>
+        <w:rPr>
+          <w:rFonts w:ascii="Calibri" w:eastAsia="Calibri" w:hAnsi="Calibri" w:cs="Calibri"/>
+          <w:sz w:val="22"/>
+          <w:szCs w:val="22"/>
+        </w:rPr>
+        <w:t>val_pot</w:t>
+      </w:r>
+      <w:proofErr w:type="spellEnd"/>
+      <w:r>
+        <w:rPr>
+          <w:rFonts w:ascii="Calibri" w:eastAsia="Calibri" w:hAnsi="Calibri" w:cs="Calibri"/>
+          <w:sz w:val="22"/>
+          <w:szCs w:val="22"/>
+        </w:rPr>
+        <w:t>);</w:t>
       </w:r>
     </w:p>
     <w:p>
@@ -1167,7 +1401,25 @@
           <w:sz w:val="22"/>
           <w:szCs w:val="22"/>
         </w:rPr>
-        <w:t xml:space="preserve">    delay(100);</w:t>
+        <w:t xml:space="preserve">    </w:t>
+      </w:r>
+      <w:proofErr w:type="gramStart"/>
+      <w:r>
+        <w:rPr>
+          <w:rFonts w:ascii="Calibri" w:eastAsia="Calibri" w:hAnsi="Calibri" w:cs="Calibri"/>
+          <w:sz w:val="22"/>
+          <w:szCs w:val="22"/>
+        </w:rPr>
+        <w:t>delay(</w:t>
+      </w:r>
+      <w:proofErr w:type="gramEnd"/>
+      <w:r>
+        <w:rPr>
+          <w:rFonts w:ascii="Calibri" w:eastAsia="Calibri" w:hAnsi="Calibri" w:cs="Calibri"/>
+          <w:sz w:val="22"/>
+          <w:szCs w:val="22"/>
+        </w:rPr>
+        <w:t>100);</w:t>
       </w:r>
     </w:p>
     <w:p>
@@ -1237,7 +1489,15 @@
         <w:jc w:val="both"/>
       </w:pPr>
       <w:r>
-        <w:t>The potentiometer was set to each multimeter voltage and the ADC value was read from the Arduino Serial Monitor (Experiment 1).</w:t>
+        <w:t xml:space="preserve">The potentiometer was set to each multimeter </w:t>
+      </w:r>
+      <w:proofErr w:type="gramStart"/>
+      <w:r>
+        <w:t>voltage</w:t>
+      </w:r>
+      <w:proofErr w:type="gramEnd"/>
+      <w:r>
+        <w:t xml:space="preserve"> and the ADC value was read from the Arduino Serial Monitor (Experiment 1).</w:t>
       </w:r>
     </w:p>
     <w:p>
@@ -1362,26 +1622,68 @@
       <w:pPr>
         <w:keepNext/>
       </w:pPr>
-      <w:r>
-        <w:rPr>
-          <w:rFonts w:ascii="Calibri" w:eastAsia="Calibri" w:hAnsi="Calibri" w:cs="Calibri"/>
-          <w:sz w:val="22"/>
-          <w:szCs w:val="22"/>
-        </w:rPr>
-        <w:t>arduino = serial.Serial('COM5', 9600, timeout=1)</w:t>
+      <w:proofErr w:type="spellStart"/>
+      <w:r>
+        <w:rPr>
+          <w:rFonts w:ascii="Calibri" w:eastAsia="Calibri" w:hAnsi="Calibri" w:cs="Calibri"/>
+          <w:sz w:val="22"/>
+          <w:szCs w:val="22"/>
+        </w:rPr>
+        <w:t>arduino</w:t>
+      </w:r>
+      <w:proofErr w:type="spellEnd"/>
+      <w:r>
+        <w:rPr>
+          <w:rFonts w:ascii="Calibri" w:eastAsia="Calibri" w:hAnsi="Calibri" w:cs="Calibri"/>
+          <w:sz w:val="22"/>
+          <w:szCs w:val="22"/>
+        </w:rPr>
+        <w:t xml:space="preserve"> = </w:t>
+      </w:r>
+      <w:proofErr w:type="spellStart"/>
+      <w:proofErr w:type="gramStart"/>
+      <w:r>
+        <w:rPr>
+          <w:rFonts w:ascii="Calibri" w:eastAsia="Calibri" w:hAnsi="Calibri" w:cs="Calibri"/>
+          <w:sz w:val="22"/>
+          <w:szCs w:val="22"/>
+        </w:rPr>
+        <w:t>serial.Serial</w:t>
+      </w:r>
+      <w:proofErr w:type="spellEnd"/>
+      <w:proofErr w:type="gramEnd"/>
+      <w:r>
+        <w:rPr>
+          <w:rFonts w:ascii="Calibri" w:eastAsia="Calibri" w:hAnsi="Calibri" w:cs="Calibri"/>
+          <w:sz w:val="22"/>
+          <w:szCs w:val="22"/>
+        </w:rPr>
+        <w:t>('COM5', 9600, timeout=1)</w:t>
       </w:r>
     </w:p>
     <w:p>
       <w:pPr>
         <w:keepNext/>
       </w:pPr>
-      <w:r>
-        <w:rPr>
-          <w:rFonts w:ascii="Calibri" w:eastAsia="Calibri" w:hAnsi="Calibri" w:cs="Calibri"/>
-          <w:sz w:val="22"/>
-          <w:szCs w:val="22"/>
-        </w:rPr>
-        <w:t>time.sleep(2)</w:t>
+      <w:proofErr w:type="spellStart"/>
+      <w:proofErr w:type="gramStart"/>
+      <w:r>
+        <w:rPr>
+          <w:rFonts w:ascii="Calibri" w:eastAsia="Calibri" w:hAnsi="Calibri" w:cs="Calibri"/>
+          <w:sz w:val="22"/>
+          <w:szCs w:val="22"/>
+        </w:rPr>
+        <w:t>time.sleep</w:t>
+      </w:r>
+      <w:proofErr w:type="spellEnd"/>
+      <w:proofErr w:type="gramEnd"/>
+      <w:r>
+        <w:rPr>
+          <w:rFonts w:ascii="Calibri" w:eastAsia="Calibri" w:hAnsi="Calibri" w:cs="Calibri"/>
+          <w:sz w:val="22"/>
+          <w:szCs w:val="22"/>
+        </w:rPr>
+        <w:t>(2)</w:t>
       </w:r>
     </w:p>
     <w:p>
@@ -1407,7 +1709,25 @@
           <w:sz w:val="22"/>
           <w:szCs w:val="22"/>
         </w:rPr>
-        <w:t xml:space="preserve">    if arduino.in_waiting &gt; 0:</w:t>
+        <w:t xml:space="preserve">    if </w:t>
+      </w:r>
+      <w:proofErr w:type="spellStart"/>
+      <w:r>
+        <w:rPr>
+          <w:rFonts w:ascii="Calibri" w:eastAsia="Calibri" w:hAnsi="Calibri" w:cs="Calibri"/>
+          <w:sz w:val="22"/>
+          <w:szCs w:val="22"/>
+        </w:rPr>
+        <w:t>arduino.in_waiting</w:t>
+      </w:r>
+      <w:proofErr w:type="spellEnd"/>
+      <w:r>
+        <w:rPr>
+          <w:rFonts w:ascii="Calibri" w:eastAsia="Calibri" w:hAnsi="Calibri" w:cs="Calibri"/>
+          <w:sz w:val="22"/>
+          <w:szCs w:val="22"/>
+        </w:rPr>
+        <w:t xml:space="preserve"> &gt; 0:</w:t>
       </w:r>
     </w:p>
     <w:p>
@@ -1420,7 +1740,63 @@
           <w:sz w:val="22"/>
           <w:szCs w:val="22"/>
         </w:rPr>
-        <w:t xml:space="preserve">        data = arduino.readline().decode('utf-8', errors='ignore').strip()</w:t>
+        <w:t xml:space="preserve">        data = </w:t>
+      </w:r>
+      <w:proofErr w:type="spellStart"/>
+      <w:proofErr w:type="gramStart"/>
+      <w:r>
+        <w:rPr>
+          <w:rFonts w:ascii="Calibri" w:eastAsia="Calibri" w:hAnsi="Calibri" w:cs="Calibri"/>
+          <w:sz w:val="22"/>
+          <w:szCs w:val="22"/>
+        </w:rPr>
+        <w:t>arduino.readline</w:t>
+      </w:r>
+      <w:proofErr w:type="spellEnd"/>
+      <w:proofErr w:type="gramEnd"/>
+      <w:r>
+        <w:rPr>
+          <w:rFonts w:ascii="Calibri" w:eastAsia="Calibri" w:hAnsi="Calibri" w:cs="Calibri"/>
+          <w:sz w:val="22"/>
+          <w:szCs w:val="22"/>
+        </w:rPr>
+        <w:t>(</w:t>
+      </w:r>
+      <w:proofErr w:type="gramStart"/>
+      <w:r>
+        <w:rPr>
+          <w:rFonts w:ascii="Calibri" w:eastAsia="Calibri" w:hAnsi="Calibri" w:cs="Calibri"/>
+          <w:sz w:val="22"/>
+          <w:szCs w:val="22"/>
+        </w:rPr>
+        <w:t>).decode</w:t>
+      </w:r>
+      <w:proofErr w:type="gramEnd"/>
+      <w:r>
+        <w:rPr>
+          <w:rFonts w:ascii="Calibri" w:eastAsia="Calibri" w:hAnsi="Calibri" w:cs="Calibri"/>
+          <w:sz w:val="22"/>
+          <w:szCs w:val="22"/>
+        </w:rPr>
+        <w:t>('utf-8', errors='ignore'</w:t>
+      </w:r>
+      <w:proofErr w:type="gramStart"/>
+      <w:r>
+        <w:rPr>
+          <w:rFonts w:ascii="Calibri" w:eastAsia="Calibri" w:hAnsi="Calibri" w:cs="Calibri"/>
+          <w:sz w:val="22"/>
+          <w:szCs w:val="22"/>
+        </w:rPr>
+        <w:t>).strip</w:t>
+      </w:r>
+      <w:proofErr w:type="gramEnd"/>
+      <w:r>
+        <w:rPr>
+          <w:rFonts w:ascii="Calibri" w:eastAsia="Calibri" w:hAnsi="Calibri" w:cs="Calibri"/>
+          <w:sz w:val="22"/>
+          <w:szCs w:val="22"/>
+        </w:rPr>
+        <w:t>()</w:t>
       </w:r>
     </w:p>
     <w:p>
@@ -1446,7 +1822,25 @@
           <w:sz w:val="22"/>
           <w:szCs w:val="22"/>
         </w:rPr>
-        <w:t xml:space="preserve">            adc_value = int(data)</w:t>
+        <w:t xml:space="preserve">            </w:t>
+      </w:r>
+      <w:proofErr w:type="spellStart"/>
+      <w:r>
+        <w:rPr>
+          <w:rFonts w:ascii="Calibri" w:eastAsia="Calibri" w:hAnsi="Calibri" w:cs="Calibri"/>
+          <w:sz w:val="22"/>
+          <w:szCs w:val="22"/>
+        </w:rPr>
+        <w:t>adc_value</w:t>
+      </w:r>
+      <w:proofErr w:type="spellEnd"/>
+      <w:r>
+        <w:rPr>
+          <w:rFonts w:ascii="Calibri" w:eastAsia="Calibri" w:hAnsi="Calibri" w:cs="Calibri"/>
+          <w:sz w:val="22"/>
+          <w:szCs w:val="22"/>
+        </w:rPr>
+        <w:t xml:space="preserve"> = int(data)</w:t>
       </w:r>
     </w:p>
     <w:p>
@@ -1459,7 +1853,25 @@
           <w:sz w:val="22"/>
           <w:szCs w:val="22"/>
         </w:rPr>
-        <w:t xml:space="preserve">            voltage = adc_value * 5.0 / 1023.0</w:t>
+        <w:t xml:space="preserve">            voltage = </w:t>
+      </w:r>
+      <w:proofErr w:type="spellStart"/>
+      <w:r>
+        <w:rPr>
+          <w:rFonts w:ascii="Calibri" w:eastAsia="Calibri" w:hAnsi="Calibri" w:cs="Calibri"/>
+          <w:sz w:val="22"/>
+          <w:szCs w:val="22"/>
+        </w:rPr>
+        <w:t>adc_value</w:t>
+      </w:r>
+      <w:proofErr w:type="spellEnd"/>
+      <w:r>
+        <w:rPr>
+          <w:rFonts w:ascii="Calibri" w:eastAsia="Calibri" w:hAnsi="Calibri" w:cs="Calibri"/>
+          <w:sz w:val="22"/>
+          <w:szCs w:val="22"/>
+        </w:rPr>
+        <w:t xml:space="preserve"> * 5.0 / 1023.0</w:t>
       </w:r>
     </w:p>
     <w:p>
@@ -1472,7 +1884,53 @@
           <w:sz w:val="22"/>
           <w:szCs w:val="22"/>
         </w:rPr>
-        <w:t xml:space="preserve">            print(f"ADC: {adc_value} | Voltage: {voltage:.3f} V")</w:t>
+        <w:t xml:space="preserve">            </w:t>
+      </w:r>
+      <w:proofErr w:type="gramStart"/>
+      <w:r>
+        <w:rPr>
+          <w:rFonts w:ascii="Calibri" w:eastAsia="Calibri" w:hAnsi="Calibri" w:cs="Calibri"/>
+          <w:sz w:val="22"/>
+          <w:szCs w:val="22"/>
+        </w:rPr>
+        <w:t>print(</w:t>
+      </w:r>
+      <w:proofErr w:type="spellStart"/>
+      <w:proofErr w:type="gramEnd"/>
+      <w:r>
+        <w:rPr>
+          <w:rFonts w:ascii="Calibri" w:eastAsia="Calibri" w:hAnsi="Calibri" w:cs="Calibri"/>
+          <w:sz w:val="22"/>
+          <w:szCs w:val="22"/>
+        </w:rPr>
+        <w:t>f"ADC</w:t>
+      </w:r>
+      <w:proofErr w:type="spellEnd"/>
+      <w:r>
+        <w:rPr>
+          <w:rFonts w:ascii="Calibri" w:eastAsia="Calibri" w:hAnsi="Calibri" w:cs="Calibri"/>
+          <w:sz w:val="22"/>
+          <w:szCs w:val="22"/>
+        </w:rPr>
+        <w:t>: {</w:t>
+      </w:r>
+      <w:proofErr w:type="spellStart"/>
+      <w:r>
+        <w:rPr>
+          <w:rFonts w:ascii="Calibri" w:eastAsia="Calibri" w:hAnsi="Calibri" w:cs="Calibri"/>
+          <w:sz w:val="22"/>
+          <w:szCs w:val="22"/>
+        </w:rPr>
+        <w:t>adc_value</w:t>
+      </w:r>
+      <w:proofErr w:type="spellEnd"/>
+      <w:r>
+        <w:rPr>
+          <w:rFonts w:ascii="Calibri" w:eastAsia="Calibri" w:hAnsi="Calibri" w:cs="Calibri"/>
+          <w:sz w:val="22"/>
+          <w:szCs w:val="22"/>
+        </w:rPr>
+        <w:t>} | Voltage: {voltage:.3f} V")</w:t>
       </w:r>
     </w:p>
     <w:p>
@@ -1485,7 +1943,25 @@
           <w:sz w:val="22"/>
           <w:szCs w:val="22"/>
         </w:rPr>
-        <w:t xml:space="preserve">        except ValueError:</w:t>
+        <w:t xml:space="preserve">        except </w:t>
+      </w:r>
+      <w:proofErr w:type="spellStart"/>
+      <w:r>
+        <w:rPr>
+          <w:rFonts w:ascii="Calibri" w:eastAsia="Calibri" w:hAnsi="Calibri" w:cs="Calibri"/>
+          <w:sz w:val="22"/>
+          <w:szCs w:val="22"/>
+        </w:rPr>
+        <w:t>ValueError</w:t>
+      </w:r>
+      <w:proofErr w:type="spellEnd"/>
+      <w:r>
+        <w:rPr>
+          <w:rFonts w:ascii="Calibri" w:eastAsia="Calibri" w:hAnsi="Calibri" w:cs="Calibri"/>
+          <w:sz w:val="22"/>
+          <w:szCs w:val="22"/>
+        </w:rPr>
+        <w:t>:</w:t>
       </w:r>
     </w:p>
     <w:p>
@@ -4362,13 +4838,23 @@
       <w:pPr>
         <w:keepNext/>
       </w:pPr>
-      <w:r>
-        <w:rPr>
-          <w:rFonts w:ascii="Calibri" w:eastAsia="Calibri" w:hAnsi="Calibri" w:cs="Calibri"/>
-          <w:sz w:val="22"/>
-          <w:szCs w:val="22"/>
-        </w:rPr>
-        <w:t>multimeter  = [0, 0.4, 0.8, 1.2, 1.6, 2, 2.4, 2.8, 3.2, 3.6, 4, 4.4, 4.8, 5]</w:t>
+      <w:proofErr w:type="gramStart"/>
+      <w:r>
+        <w:rPr>
+          <w:rFonts w:ascii="Calibri" w:eastAsia="Calibri" w:hAnsi="Calibri" w:cs="Calibri"/>
+          <w:sz w:val="22"/>
+          <w:szCs w:val="22"/>
+        </w:rPr>
+        <w:t>multimeter  =</w:t>
+      </w:r>
+      <w:proofErr w:type="gramEnd"/>
+      <w:r>
+        <w:rPr>
+          <w:rFonts w:ascii="Calibri" w:eastAsia="Calibri" w:hAnsi="Calibri" w:cs="Calibri"/>
+          <w:sz w:val="22"/>
+          <w:szCs w:val="22"/>
+        </w:rPr>
+        <w:t xml:space="preserve"> [0, 0.4, 0.8, 1.2, 1.6, 2, 2.4, 2.8, 3.2, 3.6, 4, 4.4, 4.8, 5]</w:t>
       </w:r>
     </w:p>
     <w:p>
@@ -4381,7 +4867,23 @@
           <w:sz w:val="22"/>
           <w:szCs w:val="22"/>
         </w:rPr>
-        <w:t>experiment1 = [0, 80, 162, 244, 325, 413, 492, 572, 655, 739, 820, 909, 990, 1024]</w:t>
+        <w:t>experiment1 = [0, 80, 162, 244, 325, 413, 492, 572, 655, 739, 820, 909, 990, 102</w:t>
+      </w:r>
+      <w:r>
+        <w:rPr>
+          <w:rFonts w:ascii="Calibri" w:eastAsia="Calibri" w:hAnsi="Calibri" w:cs="Calibri"/>
+          <w:sz w:val="22"/>
+          <w:szCs w:val="22"/>
+        </w:rPr>
+        <w:t>3</w:t>
+      </w:r>
+      <w:r>
+        <w:rPr>
+          <w:rFonts w:ascii="Calibri" w:eastAsia="Calibri" w:hAnsi="Calibri" w:cs="Calibri"/>
+          <w:sz w:val="22"/>
+          <w:szCs w:val="22"/>
+        </w:rPr>
+        <w:t>]</w:t>
       </w:r>
     </w:p>
     <w:p>
@@ -4662,6 +5164,36 @@
         <w:t>The deviation from the ideal ADC (in LSB) and the endpoint INL (deviation from a straight line between the first and last valid points) were calculated for both experiments.</w:t>
       </w:r>
     </w:p>
+    <w:p>
+      <w:pPr>
+        <w:keepNext/>
+        <w:spacing w:after="160" w:line="300" w:lineRule="auto"/>
+        <w:jc w:val="both"/>
+      </w:pPr>
+      <w:r>
+        <w:t>Endpoint INL = Measured ADC - Endpoint reference ADC</w:t>
+      </w:r>
+    </w:p>
+    <w:p>
+      <w:pPr>
+        <w:keepNext/>
+        <w:spacing w:after="160" w:line="300" w:lineRule="auto"/>
+        <w:jc w:val="both"/>
+      </w:pPr>
+      <w:r>
+        <w:t>The endpoint reference is the straight line connecting the first and last measured points. Since both experiments have endpoints (0 V, 0) and (5 V, 1023), the endpoint reference ADC = Voltage × 1023 / 5</w:t>
+      </w:r>
+      <w:r>
+        <w:t>.</w:t>
+      </w:r>
+    </w:p>
+    <w:p>
+      <w:pPr>
+        <w:keepNext/>
+        <w:spacing w:after="160" w:line="300" w:lineRule="auto"/>
+        <w:jc w:val="both"/>
+      </w:pPr>
+    </w:p>
     <w:tbl>
       <w:tblPr>
         <w:tblW w:w="9360" w:type="dxa"/>
@@ -4862,9 +5394,9 @@
                 <w:noProof/>
               </w:rPr>
               <w:drawing>
-                <wp:inline distT="0" distB="0" distL="0" distR="0" wp14:anchorId="57027BFB" wp14:editId="155B3CA7">
-                  <wp:extent cx="2857500" cy="1790700"/>
-                  <wp:effectExtent l="0" t="0" r="0" b="0"/>
+                <wp:inline distT="0" distB="0" distL="0" distR="0" wp14:anchorId="57027BFB" wp14:editId="4C3227EB">
+                  <wp:extent cx="2857500" cy="1785937"/>
+                  <wp:effectExtent l="0" t="0" r="0" b="5080"/>
                   <wp:docPr id="80313615" name="Picture 80313615"/>
                   <wp:cNvGraphicFramePr>
                     <a:graphicFrameLocks xmlns:a="http://schemas.openxmlformats.org/drawingml/2006/main" noChangeAspect="1"/>
@@ -4873,14 +5405,19 @@
                     <a:graphicData uri="http://schemas.openxmlformats.org/drawingml/2006/picture">
                       <pic:pic xmlns:pic="http://schemas.openxmlformats.org/drawingml/2006/picture">
                         <pic:nvPicPr>
-                          <pic:cNvPr id="0" name=""/>
+                          <pic:cNvPr id="80313615" name="Picture 80313615"/>
                           <pic:cNvPicPr>
                             <a:picLocks noChangeAspect="1" noChangeArrowheads="1"/>
                           </pic:cNvPicPr>
                         </pic:nvPicPr>
                         <pic:blipFill>
-                          <a:blip r:embed="rId19"/>
-                          <a:srcRect/>
+                          <a:blip r:embed="rId19" cstate="print">
+                            <a:extLst>
+                              <a:ext uri="{28A0092B-C50C-407E-A947-70E740481C1C}">
+                                <a14:useLocalDpi xmlns:a14="http://schemas.microsoft.com/office/drawing/2010/main" val="0"/>
+                              </a:ext>
+                            </a:extLst>
+                          </a:blip>
                           <a:stretch>
                             <a:fillRect/>
                           </a:stretch>
@@ -4888,7 +5425,7 @@
                         <pic:spPr bwMode="auto">
                           <a:xfrm>
                             <a:off x="0" y="0"/>
-                            <a:ext cx="2857500" cy="1790700"/>
+                            <a:ext cx="2857500" cy="1785937"/>
                           </a:xfrm>
                           <a:prstGeom prst="rect">
                             <a:avLst/>
@@ -4936,9 +5473,9 @@
                 <w:noProof/>
               </w:rPr>
               <w:drawing>
-                <wp:inline distT="0" distB="0" distL="0" distR="0" wp14:anchorId="68329ECB" wp14:editId="7902C090">
-                  <wp:extent cx="2857500" cy="1790700"/>
-                  <wp:effectExtent l="0" t="0" r="0" b="0"/>
+                <wp:inline distT="0" distB="0" distL="0" distR="0" wp14:anchorId="68329ECB" wp14:editId="0AF09FE1">
+                  <wp:extent cx="2857500" cy="1785937"/>
+                  <wp:effectExtent l="0" t="0" r="0" b="5080"/>
                   <wp:docPr id="1897414921" name="Picture 1897414921"/>
                   <wp:cNvGraphicFramePr>
                     <a:graphicFrameLocks xmlns:a="http://schemas.openxmlformats.org/drawingml/2006/main" noChangeAspect="1"/>
@@ -4947,14 +5484,19 @@
                     <a:graphicData uri="http://schemas.openxmlformats.org/drawingml/2006/picture">
                       <pic:pic xmlns:pic="http://schemas.openxmlformats.org/drawingml/2006/picture">
                         <pic:nvPicPr>
-                          <pic:cNvPr id="0" name=""/>
+                          <pic:cNvPr id="1897414921" name="Picture 1897414921"/>
                           <pic:cNvPicPr>
                             <a:picLocks noChangeAspect="1" noChangeArrowheads="1"/>
                           </pic:cNvPicPr>
                         </pic:nvPicPr>
                         <pic:blipFill>
-                          <a:blip r:embed="rId20"/>
-                          <a:srcRect/>
+                          <a:blip r:embed="rId20" cstate="print">
+                            <a:extLst>
+                              <a:ext uri="{28A0092B-C50C-407E-A947-70E740481C1C}">
+                                <a14:useLocalDpi xmlns:a14="http://schemas.microsoft.com/office/drawing/2010/main" val="0"/>
+                              </a:ext>
+                            </a:extLst>
+                          </a:blip>
                           <a:stretch>
                             <a:fillRect/>
                           </a:stretch>
@@ -4962,7 +5504,7 @@
                         <pic:spPr bwMode="auto">
                           <a:xfrm>
                             <a:off x="0" y="0"/>
-                            <a:ext cx="2857500" cy="1790700"/>
+                            <a:ext cx="2857500" cy="1785937"/>
                           </a:xfrm>
                           <a:prstGeom prst="rect">
                             <a:avLst/>
@@ -5226,7 +5768,7 @@
                 <w:sz w:val="21"/>
                 <w:szCs w:val="21"/>
               </w:rPr>
-              <w:t>5.50</w:t>
+              <w:t>8.76</w:t>
             </w:r>
           </w:p>
         </w:tc>
@@ -5348,6 +5890,7 @@
           <w:b/>
           <w:bCs/>
         </w:rPr>
+        <w:lastRenderedPageBreak/>
         <w:t>5.5    Discussion</w:t>
       </w:r>
     </w:p>
@@ -5371,7 +5914,6 @@
           <w:b/>
           <w:bCs/>
         </w:rPr>
-        <w:lastRenderedPageBreak/>
         <w:t>5.6    Bonus: Python GUI</w:t>
       </w:r>
     </w:p>
@@ -5382,7 +5924,23 @@
         <w:jc w:val="both"/>
       </w:pPr>
       <w:r>
-        <w:t>The bonus task was completed: the full digital voltmeter GUI (online and offline modes) was built in Python with Tkinter and pyserial, since MATLAB was not available. It reads live data from the Arduino over the serial port and loads stored measurements from CSV files (Figures 4.1–4.3). AI assistance was used to debug and improve the GUI code.</w:t>
+        <w:t xml:space="preserve">The bonus task was completed: the full digital voltmeter GUI (online and offline modes) was built in Python with </w:t>
+      </w:r>
+      <w:proofErr w:type="spellStart"/>
+      <w:r>
+        <w:t>Tkinter</w:t>
+      </w:r>
+      <w:proofErr w:type="spellEnd"/>
+      <w:r>
+        <w:t xml:space="preserve"> and </w:t>
+      </w:r>
+      <w:proofErr w:type="spellStart"/>
+      <w:r>
+        <w:t>pyserial</w:t>
+      </w:r>
+      <w:proofErr w:type="spellEnd"/>
+      <w:r>
+        <w:t>, since MATLAB was not available. It reads live data from the Arduino over the serial port and loads stored measurements from CSV files (Figures 4.1–4.3). AI assistance was used to debug and improve the GUI code.</w:t>
       </w:r>
     </w:p>
     <w:p>
@@ -5404,55 +5962,9 @@
           <w:szCs w:val="28"/>
         </w:rPr>
         <w:lastRenderedPageBreak/>
-        <w:t>6    CONCLUSION</w:t>
-      </w:r>
-    </w:p>
-    <w:p>
-      <w:pPr>
-        <w:spacing w:after="600" w:line="300" w:lineRule="auto"/>
-        <w:ind w:firstLine="540"/>
-        <w:jc w:val="both"/>
-      </w:pPr>
-      <w:r>
-        <w:t>The Arduino ADC is close to linear, and the Python measurements stayed within 2 LSB of the ideal. The Python GUI worked in both online and offline modes.</w:t>
-      </w:r>
-    </w:p>
-    <w:p>
-      <w:pPr>
-        <w:keepNext/>
-        <w:spacing w:before="240" w:after="120"/>
-      </w:pPr>
-      <w:r>
-        <w:rPr>
-          <w:b/>
-          <w:bCs/>
-        </w:rPr>
-        <w:t>AI Use</w:t>
-      </w:r>
-    </w:p>
-    <w:p>
-      <w:pPr>
-        <w:spacing w:after="160" w:line="300" w:lineRule="auto"/>
-        <w:ind w:firstLine="540"/>
-        <w:jc w:val="both"/>
-      </w:pPr>
-      <w:r>
-        <w:rPr>
-          <w:i/>
-          <w:iCs/>
-          <w:sz w:val="22"/>
-          <w:szCs w:val="22"/>
-        </w:rPr>
-        <w:t>AI (Claude, Anthropic) was used to help write the Python analysis and plotting code (Figures 5.1–5.6, Appendix A), to debug the GUI code, and to format this report. All measurements, photos and screenshots were taken by the group.</w:t>
-      </w:r>
-    </w:p>
-    <w:p/>
-    <w:p>
-      <w:pPr>
-        <w:keepNext/>
-        <w:spacing w:after="240" w:line="300" w:lineRule="auto"/>
-        <w:jc w:val="center"/>
-      </w:pPr>
+        <w:t xml:space="preserve">6    </w:t>
+      </w:r>
+      <w:proofErr w:type="gramStart"/>
       <w:r>
         <w:rPr>
           <w:b/>
@@ -5460,48 +5972,53 @@
           <w:sz w:val="28"/>
           <w:szCs w:val="28"/>
         </w:rPr>
-        <w:t>REFERENCES</w:t>
+        <w:t>CONCLUSION</w:t>
+      </w:r>
+      <w:proofErr w:type="gramEnd"/>
+    </w:p>
+    <w:p>
+      <w:pPr>
+        <w:spacing w:after="600" w:line="300" w:lineRule="auto"/>
+        <w:ind w:firstLine="540"/>
+        <w:jc w:val="both"/>
+      </w:pPr>
+      <w:r>
+        <w:t>The Arduino ADC is close to linear, and the Python measurements stayed within 2 LSB of the ideal. The Python GUI worked in both online and offline modes.</w:t>
+      </w:r>
+    </w:p>
+    <w:p>
+      <w:pPr>
+        <w:keepNext/>
+        <w:spacing w:before="240" w:after="120"/>
+      </w:pPr>
+      <w:r>
+        <w:rPr>
+          <w:b/>
+          <w:bCs/>
+        </w:rPr>
+        <w:t>AI Use</w:t>
       </w:r>
     </w:p>
     <w:p>
       <w:pPr>
         <w:spacing w:after="160" w:line="300" w:lineRule="auto"/>
-      </w:pPr>
-      <w:r>
-        <w:t>[1]  EEE 309 Project 2 lab sheet, Kadir Has University, 2026.</w:t>
-      </w:r>
-    </w:p>
-    <w:p>
-      <w:pPr>
-        <w:spacing w:after="160" w:line="300" w:lineRule="auto"/>
-      </w:pPr>
-      <w:r>
-        <w:t>[2]  Arduino, “analogRead()” reference, docs.arduino.cc.</w:t>
-      </w:r>
-    </w:p>
-    <w:p>
-      <w:pPr>
-        <w:spacing w:after="160" w:line="300" w:lineRule="auto"/>
-      </w:pPr>
-      <w:r>
-        <w:t>[3]  Python Software Foundation, “tkinter — Python interface to Tcl/Tk,” docs.python.org.</w:t>
-      </w:r>
-    </w:p>
-    <w:p>
-      <w:pPr>
-        <w:spacing w:after="160" w:line="300" w:lineRule="auto"/>
-      </w:pPr>
-      <w:r>
-        <w:t>[4]  EEE309 Project 2 source code (prj2_gui.py, prj2-ex2.2.py, prj2_analysis.py), GitHub: https://github.com/gingerismisharam/EEE309Project2</w:t>
-      </w:r>
-    </w:p>
-    <w:p>
-      <w:r>
-        <w:br w:type="page"/>
-      </w:r>
-    </w:p>
-    <w:p>
-      <w:pPr>
+        <w:ind w:firstLine="540"/>
+        <w:jc w:val="both"/>
+      </w:pPr>
+      <w:r>
+        <w:rPr>
+          <w:i/>
+          <w:iCs/>
+          <w:sz w:val="22"/>
+          <w:szCs w:val="22"/>
+        </w:rPr>
+        <w:t>AI (Claude, Anthropic) was used to help write the Python analysis and plotting code (Figures 5.1–5.6, Appendix A), to debug the GUI code, and to format this report. All measurements, photos and screenshots were taken by the group.</w:t>
+      </w:r>
+    </w:p>
+    <w:p/>
+    <w:p>
+      <w:pPr>
+        <w:keepNext/>
         <w:spacing w:after="240" w:line="300" w:lineRule="auto"/>
         <w:jc w:val="center"/>
       </w:pPr>
@@ -5512,6 +6029,119 @@
           <w:sz w:val="28"/>
           <w:szCs w:val="28"/>
         </w:rPr>
+        <w:t>REFERENCES</w:t>
+      </w:r>
+    </w:p>
+    <w:p>
+      <w:pPr>
+        <w:spacing w:after="160" w:line="300" w:lineRule="auto"/>
+      </w:pPr>
+      <w:r>
+        <w:t>[1</w:t>
+      </w:r>
+      <w:proofErr w:type="gramStart"/>
+      <w:r>
+        <w:t>]  EEE</w:t>
+      </w:r>
+      <w:proofErr w:type="gramEnd"/>
+      <w:r>
+        <w:t xml:space="preserve"> 309 Project 2 lab sheet, Kadir Has University, 2026.</w:t>
+      </w:r>
+    </w:p>
+    <w:p>
+      <w:pPr>
+        <w:spacing w:after="160" w:line="300" w:lineRule="auto"/>
+      </w:pPr>
+      <w:r>
+        <w:t>[2</w:t>
+      </w:r>
+      <w:proofErr w:type="gramStart"/>
+      <w:r>
+        <w:t>]  Arduino</w:t>
+      </w:r>
+      <w:proofErr w:type="gramEnd"/>
+      <w:r>
+        <w:t>, “</w:t>
+      </w:r>
+      <w:proofErr w:type="spellStart"/>
+      <w:proofErr w:type="gramStart"/>
+      <w:r>
+        <w:t>analogRead</w:t>
+      </w:r>
+      <w:proofErr w:type="spellEnd"/>
+      <w:r>
+        <w:t>(</w:t>
+      </w:r>
+      <w:proofErr w:type="gramEnd"/>
+      <w:r>
+        <w:t>)” reference, docs.arduino.cc.</w:t>
+      </w:r>
+    </w:p>
+    <w:p>
+      <w:pPr>
+        <w:spacing w:after="160" w:line="300" w:lineRule="auto"/>
+      </w:pPr>
+      <w:r>
+        <w:t>[3</w:t>
+      </w:r>
+      <w:proofErr w:type="gramStart"/>
+      <w:r>
+        <w:t>]  Python</w:t>
+      </w:r>
+      <w:proofErr w:type="gramEnd"/>
+      <w:r>
+        <w:t xml:space="preserve"> Software Foundation, “</w:t>
+      </w:r>
+      <w:proofErr w:type="spellStart"/>
+      <w:r>
+        <w:t>tkinter</w:t>
+      </w:r>
+      <w:proofErr w:type="spellEnd"/>
+      <w:r>
+        <w:t xml:space="preserve"> — Python interface to </w:t>
+      </w:r>
+      <w:proofErr w:type="spellStart"/>
+      <w:r>
+        <w:t>Tcl</w:t>
+      </w:r>
+      <w:proofErr w:type="spellEnd"/>
+      <w:r>
+        <w:t>/Tk,” docs.python.org.</w:t>
+      </w:r>
+    </w:p>
+    <w:p>
+      <w:pPr>
+        <w:spacing w:after="160" w:line="300" w:lineRule="auto"/>
+      </w:pPr>
+      <w:r>
+        <w:t>[4</w:t>
+      </w:r>
+      <w:proofErr w:type="gramStart"/>
+      <w:r>
+        <w:t>]  EEE</w:t>
+      </w:r>
+      <w:proofErr w:type="gramEnd"/>
+      <w:r>
+        <w:t>309 Project 2 source code (prj2_gui.py, prj2-ex2.2.py, prj2_analysis.py), GitHub: https://github.com/gingerismisharam/EEE309Project2</w:t>
+      </w:r>
+    </w:p>
+    <w:p>
+      <w:r>
+        <w:br w:type="page"/>
+      </w:r>
+    </w:p>
+    <w:p>
+      <w:pPr>
+        <w:spacing w:after="240" w:line="300" w:lineRule="auto"/>
+        <w:jc w:val="center"/>
+      </w:pPr>
+      <w:r>
+        <w:rPr>
+          <w:b/>
+          <w:bCs/>
+          <w:sz w:val="28"/>
+          <w:szCs w:val="28"/>
+        </w:rPr>
         <w:lastRenderedPageBreak/>
         <w:t>APPENDIX A: PYTHON ANALYSIS CODE</w:t>
       </w:r>
@@ -5539,17 +6169,201 @@
           <w:sz w:val="22"/>
           <w:szCs w:val="22"/>
         </w:rPr>
-        <w:t>import numpy as np</w:t>
-      </w:r>
-    </w:p>
-    <w:p>
-      <w:r>
-        <w:rPr>
-          <w:rFonts w:ascii="Calibri" w:eastAsia="Calibri" w:hAnsi="Calibri" w:cs="Calibri"/>
-          <w:sz w:val="22"/>
-          <w:szCs w:val="22"/>
-        </w:rPr>
-        <w:t>import matplotlib.pyplot as plt</w:t>
+        <w:t xml:space="preserve">import </w:t>
+      </w:r>
+      <w:proofErr w:type="spellStart"/>
+      <w:r>
+        <w:rPr>
+          <w:rFonts w:ascii="Calibri" w:eastAsia="Calibri" w:hAnsi="Calibri" w:cs="Calibri"/>
+          <w:sz w:val="22"/>
+          <w:szCs w:val="22"/>
+        </w:rPr>
+        <w:t>numpy</w:t>
+      </w:r>
+      <w:proofErr w:type="spellEnd"/>
+      <w:r>
+        <w:rPr>
+          <w:rFonts w:ascii="Calibri" w:eastAsia="Calibri" w:hAnsi="Calibri" w:cs="Calibri"/>
+          <w:sz w:val="22"/>
+          <w:szCs w:val="22"/>
+        </w:rPr>
+        <w:t xml:space="preserve"> as np</w:t>
+      </w:r>
+    </w:p>
+    <w:p>
+      <w:r>
+        <w:rPr>
+          <w:rFonts w:ascii="Calibri" w:eastAsia="Calibri" w:hAnsi="Calibri" w:cs="Calibri"/>
+          <w:sz w:val="22"/>
+          <w:szCs w:val="22"/>
+        </w:rPr>
+        <w:t xml:space="preserve">import </w:t>
+      </w:r>
+      <w:proofErr w:type="spellStart"/>
+      <w:proofErr w:type="gramStart"/>
+      <w:r>
+        <w:rPr>
+          <w:rFonts w:ascii="Calibri" w:eastAsia="Calibri" w:hAnsi="Calibri" w:cs="Calibri"/>
+          <w:sz w:val="22"/>
+          <w:szCs w:val="22"/>
+        </w:rPr>
+        <w:t>matplotlib.pyplot</w:t>
+      </w:r>
+      <w:proofErr w:type="spellEnd"/>
+      <w:proofErr w:type="gramEnd"/>
+      <w:r>
+        <w:rPr>
+          <w:rFonts w:ascii="Calibri" w:eastAsia="Calibri" w:hAnsi="Calibri" w:cs="Calibri"/>
+          <w:sz w:val="22"/>
+          <w:szCs w:val="22"/>
+        </w:rPr>
+        <w:t xml:space="preserve"> as </w:t>
+      </w:r>
+      <w:proofErr w:type="spellStart"/>
+      <w:r>
+        <w:rPr>
+          <w:rFonts w:ascii="Calibri" w:eastAsia="Calibri" w:hAnsi="Calibri" w:cs="Calibri"/>
+          <w:sz w:val="22"/>
+          <w:szCs w:val="22"/>
+        </w:rPr>
+        <w:t>plt</w:t>
+      </w:r>
+      <w:proofErr w:type="spellEnd"/>
+    </w:p>
+    <w:p>
+      <w:proofErr w:type="spellStart"/>
+      <w:proofErr w:type="gramStart"/>
+      <w:r>
+        <w:rPr>
+          <w:rFonts w:ascii="Calibri" w:eastAsia="Calibri" w:hAnsi="Calibri" w:cs="Calibri"/>
+          <w:sz w:val="22"/>
+          <w:szCs w:val="22"/>
+        </w:rPr>
+        <w:t>multimeter</w:t>
+      </w:r>
+      <w:proofErr w:type="spellEnd"/>
+      <w:r>
+        <w:rPr>
+          <w:rFonts w:ascii="Calibri" w:eastAsia="Calibri" w:hAnsi="Calibri" w:cs="Calibri"/>
+          <w:sz w:val="22"/>
+          <w:szCs w:val="22"/>
+        </w:rPr>
+        <w:t xml:space="preserve">  =</w:t>
+      </w:r>
+      <w:proofErr w:type="gramEnd"/>
+      <w:r>
+        <w:rPr>
+          <w:rFonts w:ascii="Calibri" w:eastAsia="Calibri" w:hAnsi="Calibri" w:cs="Calibri"/>
+          <w:sz w:val="22"/>
+          <w:szCs w:val="22"/>
+        </w:rPr>
+        <w:t xml:space="preserve"> </w:t>
+      </w:r>
+      <w:proofErr w:type="spellStart"/>
+      <w:proofErr w:type="gramStart"/>
+      <w:r>
+        <w:rPr>
+          <w:rFonts w:ascii="Calibri" w:eastAsia="Calibri" w:hAnsi="Calibri" w:cs="Calibri"/>
+          <w:sz w:val="22"/>
+          <w:szCs w:val="22"/>
+        </w:rPr>
+        <w:t>np.array</w:t>
+      </w:r>
+      <w:proofErr w:type="spellEnd"/>
+      <w:proofErr w:type="gramEnd"/>
+      <w:r>
+        <w:rPr>
+          <w:rFonts w:ascii="Calibri" w:eastAsia="Calibri" w:hAnsi="Calibri" w:cs="Calibri"/>
+          <w:sz w:val="22"/>
+          <w:szCs w:val="22"/>
+        </w:rPr>
+        <w:t>([0, 0.4, 0.8, 1.2, 1.6, 2.0, 2.4, 2.8, 3.2, 3.6, 4.0, 4.4, 4.8, 5.0])</w:t>
+      </w:r>
+    </w:p>
+    <w:p>
+      <w:r>
+        <w:rPr>
+          <w:rFonts w:ascii="Calibri" w:eastAsia="Calibri" w:hAnsi="Calibri" w:cs="Calibri"/>
+          <w:sz w:val="22"/>
+          <w:szCs w:val="22"/>
+        </w:rPr>
+        <w:t xml:space="preserve">experiment1 = </w:t>
+      </w:r>
+      <w:proofErr w:type="spellStart"/>
+      <w:proofErr w:type="gramStart"/>
+      <w:r>
+        <w:rPr>
+          <w:rFonts w:ascii="Calibri" w:eastAsia="Calibri" w:hAnsi="Calibri" w:cs="Calibri"/>
+          <w:sz w:val="22"/>
+          <w:szCs w:val="22"/>
+        </w:rPr>
+        <w:t>np.array</w:t>
+      </w:r>
+      <w:proofErr w:type="spellEnd"/>
+      <w:proofErr w:type="gramEnd"/>
+      <w:r>
+        <w:rPr>
+          <w:rFonts w:ascii="Calibri" w:eastAsia="Calibri" w:hAnsi="Calibri" w:cs="Calibri"/>
+          <w:sz w:val="22"/>
+          <w:szCs w:val="22"/>
+        </w:rPr>
+        <w:t>([0, 80, 162, 244, 325, 413, 492, 572, 655, 739, 820, 909, 990, 102</w:t>
+      </w:r>
+      <w:r>
+        <w:rPr>
+          <w:rFonts w:ascii="Calibri" w:eastAsia="Calibri" w:hAnsi="Calibri" w:cs="Calibri"/>
+          <w:sz w:val="22"/>
+          <w:szCs w:val="22"/>
+        </w:rPr>
+        <w:t>3</w:t>
+      </w:r>
+      <w:r>
+        <w:rPr>
+          <w:rFonts w:ascii="Calibri" w:eastAsia="Calibri" w:hAnsi="Calibri" w:cs="Calibri"/>
+          <w:sz w:val="22"/>
+          <w:szCs w:val="22"/>
+        </w:rPr>
+        <w:t>])</w:t>
+      </w:r>
+    </w:p>
+    <w:p>
+      <w:r>
+        <w:rPr>
+          <w:rFonts w:ascii="Calibri" w:eastAsia="Calibri" w:hAnsi="Calibri" w:cs="Calibri"/>
+          <w:sz w:val="22"/>
+          <w:szCs w:val="22"/>
+        </w:rPr>
+        <w:t xml:space="preserve">experiment2 = </w:t>
+      </w:r>
+      <w:proofErr w:type="spellStart"/>
+      <w:proofErr w:type="gramStart"/>
+      <w:r>
+        <w:rPr>
+          <w:rFonts w:ascii="Calibri" w:eastAsia="Calibri" w:hAnsi="Calibri" w:cs="Calibri"/>
+          <w:sz w:val="22"/>
+          <w:szCs w:val="22"/>
+        </w:rPr>
+        <w:t>np.array</w:t>
+      </w:r>
+      <w:proofErr w:type="spellEnd"/>
+      <w:proofErr w:type="gramEnd"/>
+      <w:r>
+        <w:rPr>
+          <w:rFonts w:ascii="Calibri" w:eastAsia="Calibri" w:hAnsi="Calibri" w:cs="Calibri"/>
+          <w:sz w:val="22"/>
+          <w:szCs w:val="22"/>
+        </w:rPr>
+        <w:t>([0, 83, 165, 247, 327, 410, 490, 573, 656, 737, 817, 902, 983, 1023])</w:t>
+      </w:r>
+    </w:p>
+    <w:p>
+      <w:r>
+        <w:rPr>
+          <w:rFonts w:ascii="Calibri" w:eastAsia="Calibri" w:hAnsi="Calibri" w:cs="Calibri"/>
+          <w:sz w:val="22"/>
+          <w:szCs w:val="22"/>
+        </w:rPr>
+        <w:t>ideal_adc = multimeter * 1023 / 5.0</w:t>
       </w:r>
     </w:p>
     <w:p/>
@@ -5560,37 +6374,429 @@
           <w:sz w:val="22"/>
           <w:szCs w:val="22"/>
         </w:rPr>
-        <w:t>multimeter  = np.array([0, 0.4, 0.8, 1.2, 1.6, 2.0, 2.4, 2.8, 3.2, 3.6, 4.0, 4.4, 4.8, 5.0])</w:t>
-      </w:r>
-    </w:p>
-    <w:p>
-      <w:r>
-        <w:rPr>
-          <w:rFonts w:ascii="Calibri" w:eastAsia="Calibri" w:hAnsi="Calibri" w:cs="Calibri"/>
-          <w:sz w:val="22"/>
-          <w:szCs w:val="22"/>
-        </w:rPr>
-        <w:t>experiment1 = np.array([0, 80, 162, 244, 325, 413, 492, 572, 655, 739, 820, 909, 990, 1024])</w:t>
-      </w:r>
-    </w:p>
-    <w:p>
-      <w:r>
-        <w:rPr>
-          <w:rFonts w:ascii="Calibri" w:eastAsia="Calibri" w:hAnsi="Calibri" w:cs="Calibri"/>
-          <w:sz w:val="22"/>
-          <w:szCs w:val="22"/>
-        </w:rPr>
-        <w:t>experiment2 = np.array([0, 83, 165, 247, 327, 410, 490, 573, 656, 737, 817, 902, 983, 1023])</w:t>
-      </w:r>
-    </w:p>
-    <w:p>
-      <w:r>
-        <w:rPr>
-          <w:rFonts w:ascii="Calibri" w:eastAsia="Calibri" w:hAnsi="Calibri" w:cs="Calibri"/>
-          <w:sz w:val="22"/>
-          <w:szCs w:val="22"/>
-        </w:rPr>
-        <w:t>ideal_adc = multimeter * 1023 / 5.0</w:t>
+        <w:t># Figures 5.1 and 5.2: measured vs ideal</w:t>
+      </w:r>
+    </w:p>
+    <w:p>
+      <w:r>
+        <w:rPr>
+          <w:rFonts w:ascii="Calibri" w:eastAsia="Calibri" w:hAnsi="Calibri" w:cs="Calibri"/>
+          <w:sz w:val="22"/>
+          <w:szCs w:val="22"/>
+        </w:rPr>
+        <w:t>for n, exp, c in [(1, experiment1, "</w:t>
+      </w:r>
+      <w:proofErr w:type="spellStart"/>
+      <w:r>
+        <w:rPr>
+          <w:rFonts w:ascii="Calibri" w:eastAsia="Calibri" w:hAnsi="Calibri" w:cs="Calibri"/>
+          <w:sz w:val="22"/>
+          <w:szCs w:val="22"/>
+        </w:rPr>
+        <w:t>bo</w:t>
+      </w:r>
+      <w:proofErr w:type="spellEnd"/>
+      <w:r>
+        <w:rPr>
+          <w:rFonts w:ascii="Calibri" w:eastAsia="Calibri" w:hAnsi="Calibri" w:cs="Calibri"/>
+          <w:sz w:val="22"/>
+          <w:szCs w:val="22"/>
+        </w:rPr>
+        <w:t>-"), (2, experiment2, "</w:t>
+      </w:r>
+      <w:proofErr w:type="spellStart"/>
+      <w:r>
+        <w:rPr>
+          <w:rFonts w:ascii="Calibri" w:eastAsia="Calibri" w:hAnsi="Calibri" w:cs="Calibri"/>
+          <w:sz w:val="22"/>
+          <w:szCs w:val="22"/>
+        </w:rPr>
+        <w:t>ro</w:t>
+      </w:r>
+      <w:proofErr w:type="spellEnd"/>
+      <w:r>
+        <w:rPr>
+          <w:rFonts w:ascii="Calibri" w:eastAsia="Calibri" w:hAnsi="Calibri" w:cs="Calibri"/>
+          <w:sz w:val="22"/>
+          <w:szCs w:val="22"/>
+        </w:rPr>
+        <w:t>-")]:</w:t>
+      </w:r>
+    </w:p>
+    <w:p>
+      <w:r>
+        <w:rPr>
+          <w:rFonts w:ascii="Calibri" w:eastAsia="Calibri" w:hAnsi="Calibri" w:cs="Calibri"/>
+          <w:sz w:val="22"/>
+          <w:szCs w:val="22"/>
+        </w:rPr>
+        <w:t xml:space="preserve">    </w:t>
+      </w:r>
+      <w:proofErr w:type="spellStart"/>
+      <w:proofErr w:type="gramStart"/>
+      <w:r>
+        <w:rPr>
+          <w:rFonts w:ascii="Calibri" w:eastAsia="Calibri" w:hAnsi="Calibri" w:cs="Calibri"/>
+          <w:sz w:val="22"/>
+          <w:szCs w:val="22"/>
+        </w:rPr>
+        <w:t>plt.figure</w:t>
+      </w:r>
+      <w:proofErr w:type="spellEnd"/>
+      <w:proofErr w:type="gramEnd"/>
+      <w:r>
+        <w:rPr>
+          <w:rFonts w:ascii="Calibri" w:eastAsia="Calibri" w:hAnsi="Calibri" w:cs="Calibri"/>
+          <w:sz w:val="22"/>
+          <w:szCs w:val="22"/>
+        </w:rPr>
+        <w:t>(</w:t>
+      </w:r>
+      <w:proofErr w:type="spellStart"/>
+      <w:r>
+        <w:rPr>
+          <w:rFonts w:ascii="Calibri" w:eastAsia="Calibri" w:hAnsi="Calibri" w:cs="Calibri"/>
+          <w:sz w:val="22"/>
+          <w:szCs w:val="22"/>
+        </w:rPr>
+        <w:t>figsize</w:t>
+      </w:r>
+      <w:proofErr w:type="spellEnd"/>
+      <w:proofErr w:type="gramStart"/>
+      <w:r>
+        <w:rPr>
+          <w:rFonts w:ascii="Calibri" w:eastAsia="Calibri" w:hAnsi="Calibri" w:cs="Calibri"/>
+          <w:sz w:val="22"/>
+          <w:szCs w:val="22"/>
+        </w:rPr>
+        <w:t>=(</w:t>
+      </w:r>
+      <w:proofErr w:type="gramEnd"/>
+      <w:r>
+        <w:rPr>
+          <w:rFonts w:ascii="Calibri" w:eastAsia="Calibri" w:hAnsi="Calibri" w:cs="Calibri"/>
+          <w:sz w:val="22"/>
+          <w:szCs w:val="22"/>
+        </w:rPr>
+        <w:t>8, 5))</w:t>
+      </w:r>
+    </w:p>
+    <w:p>
+      <w:r>
+        <w:rPr>
+          <w:rFonts w:ascii="Calibri" w:eastAsia="Calibri" w:hAnsi="Calibri" w:cs="Calibri"/>
+          <w:sz w:val="22"/>
+          <w:szCs w:val="22"/>
+        </w:rPr>
+        <w:t xml:space="preserve">    </w:t>
+      </w:r>
+      <w:proofErr w:type="spellStart"/>
+      <w:proofErr w:type="gramStart"/>
+      <w:r>
+        <w:rPr>
+          <w:rFonts w:ascii="Calibri" w:eastAsia="Calibri" w:hAnsi="Calibri" w:cs="Calibri"/>
+          <w:sz w:val="22"/>
+          <w:szCs w:val="22"/>
+        </w:rPr>
+        <w:t>plt.plot</w:t>
+      </w:r>
+      <w:proofErr w:type="spellEnd"/>
+      <w:proofErr w:type="gramEnd"/>
+      <w:r>
+        <w:rPr>
+          <w:rFonts w:ascii="Calibri" w:eastAsia="Calibri" w:hAnsi="Calibri" w:cs="Calibri"/>
+          <w:sz w:val="22"/>
+          <w:szCs w:val="22"/>
+        </w:rPr>
+        <w:t>(</w:t>
+      </w:r>
+      <w:proofErr w:type="spellStart"/>
+      <w:r>
+        <w:rPr>
+          <w:rFonts w:ascii="Calibri" w:eastAsia="Calibri" w:hAnsi="Calibri" w:cs="Calibri"/>
+          <w:sz w:val="22"/>
+          <w:szCs w:val="22"/>
+        </w:rPr>
+        <w:t>multimeter</w:t>
+      </w:r>
+      <w:proofErr w:type="spellEnd"/>
+      <w:r>
+        <w:rPr>
+          <w:rFonts w:ascii="Calibri" w:eastAsia="Calibri" w:hAnsi="Calibri" w:cs="Calibri"/>
+          <w:sz w:val="22"/>
+          <w:szCs w:val="22"/>
+        </w:rPr>
+        <w:t xml:space="preserve">, </w:t>
+      </w:r>
+      <w:proofErr w:type="spellStart"/>
+      <w:r>
+        <w:rPr>
+          <w:rFonts w:ascii="Calibri" w:eastAsia="Calibri" w:hAnsi="Calibri" w:cs="Calibri"/>
+          <w:sz w:val="22"/>
+          <w:szCs w:val="22"/>
+        </w:rPr>
+        <w:t>ideal_adc</w:t>
+      </w:r>
+      <w:proofErr w:type="spellEnd"/>
+      <w:r>
+        <w:rPr>
+          <w:rFonts w:ascii="Calibri" w:eastAsia="Calibri" w:hAnsi="Calibri" w:cs="Calibri"/>
+          <w:sz w:val="22"/>
+          <w:szCs w:val="22"/>
+        </w:rPr>
+        <w:t>, "k--", label="Ideal ADC")</w:t>
+      </w:r>
+    </w:p>
+    <w:p>
+      <w:r>
+        <w:rPr>
+          <w:rFonts w:ascii="Calibri" w:eastAsia="Calibri" w:hAnsi="Calibri" w:cs="Calibri"/>
+          <w:sz w:val="22"/>
+          <w:szCs w:val="22"/>
+        </w:rPr>
+        <w:t xml:space="preserve">    </w:t>
+      </w:r>
+      <w:proofErr w:type="spellStart"/>
+      <w:proofErr w:type="gramStart"/>
+      <w:r>
+        <w:rPr>
+          <w:rFonts w:ascii="Calibri" w:eastAsia="Calibri" w:hAnsi="Calibri" w:cs="Calibri"/>
+          <w:sz w:val="22"/>
+          <w:szCs w:val="22"/>
+        </w:rPr>
+        <w:t>plt.plot</w:t>
+      </w:r>
+      <w:proofErr w:type="spellEnd"/>
+      <w:proofErr w:type="gramEnd"/>
+      <w:r>
+        <w:rPr>
+          <w:rFonts w:ascii="Calibri" w:eastAsia="Calibri" w:hAnsi="Calibri" w:cs="Calibri"/>
+          <w:sz w:val="22"/>
+          <w:szCs w:val="22"/>
+        </w:rPr>
+        <w:t>(</w:t>
+      </w:r>
+      <w:proofErr w:type="spellStart"/>
+      <w:r>
+        <w:rPr>
+          <w:rFonts w:ascii="Calibri" w:eastAsia="Calibri" w:hAnsi="Calibri" w:cs="Calibri"/>
+          <w:sz w:val="22"/>
+          <w:szCs w:val="22"/>
+        </w:rPr>
+        <w:t>multimeter</w:t>
+      </w:r>
+      <w:proofErr w:type="spellEnd"/>
+      <w:r>
+        <w:rPr>
+          <w:rFonts w:ascii="Calibri" w:eastAsia="Calibri" w:hAnsi="Calibri" w:cs="Calibri"/>
+          <w:sz w:val="22"/>
+          <w:szCs w:val="22"/>
+        </w:rPr>
+        <w:t>, exp, c, label=</w:t>
+      </w:r>
+      <w:proofErr w:type="spellStart"/>
+      <w:r>
+        <w:rPr>
+          <w:rFonts w:ascii="Calibri" w:eastAsia="Calibri" w:hAnsi="Calibri" w:cs="Calibri"/>
+          <w:sz w:val="22"/>
+          <w:szCs w:val="22"/>
+        </w:rPr>
+        <w:t>f"Experiment</w:t>
+      </w:r>
+      <w:proofErr w:type="spellEnd"/>
+      <w:r>
+        <w:rPr>
+          <w:rFonts w:ascii="Calibri" w:eastAsia="Calibri" w:hAnsi="Calibri" w:cs="Calibri"/>
+          <w:sz w:val="22"/>
+          <w:szCs w:val="22"/>
+        </w:rPr>
+        <w:t xml:space="preserve"> {n}")</w:t>
+      </w:r>
+    </w:p>
+    <w:p>
+      <w:r>
+        <w:rPr>
+          <w:rFonts w:ascii="Calibri" w:eastAsia="Calibri" w:hAnsi="Calibri" w:cs="Calibri"/>
+          <w:sz w:val="22"/>
+          <w:szCs w:val="22"/>
+        </w:rPr>
+        <w:t xml:space="preserve">    </w:t>
+      </w:r>
+      <w:proofErr w:type="spellStart"/>
+      <w:proofErr w:type="gramStart"/>
+      <w:r>
+        <w:rPr>
+          <w:rFonts w:ascii="Calibri" w:eastAsia="Calibri" w:hAnsi="Calibri" w:cs="Calibri"/>
+          <w:sz w:val="22"/>
+          <w:szCs w:val="22"/>
+        </w:rPr>
+        <w:t>plt.xlabel</w:t>
+      </w:r>
+      <w:proofErr w:type="spellEnd"/>
+      <w:proofErr w:type="gramEnd"/>
+      <w:r>
+        <w:rPr>
+          <w:rFonts w:ascii="Calibri" w:eastAsia="Calibri" w:hAnsi="Calibri" w:cs="Calibri"/>
+          <w:sz w:val="22"/>
+          <w:szCs w:val="22"/>
+        </w:rPr>
+        <w:t>("</w:t>
+      </w:r>
+      <w:proofErr w:type="spellStart"/>
+      <w:r>
+        <w:rPr>
+          <w:rFonts w:ascii="Calibri" w:eastAsia="Calibri" w:hAnsi="Calibri" w:cs="Calibri"/>
+          <w:sz w:val="22"/>
+          <w:szCs w:val="22"/>
+        </w:rPr>
+        <w:t>Multimeter</w:t>
+      </w:r>
+      <w:proofErr w:type="spellEnd"/>
+      <w:r>
+        <w:rPr>
+          <w:rFonts w:ascii="Calibri" w:eastAsia="Calibri" w:hAnsi="Calibri" w:cs="Calibri"/>
+          <w:sz w:val="22"/>
+          <w:szCs w:val="22"/>
+        </w:rPr>
+        <w:t xml:space="preserve"> Voltage (V)")</w:t>
+      </w:r>
+    </w:p>
+    <w:p>
+      <w:r>
+        <w:rPr>
+          <w:rFonts w:ascii="Calibri" w:eastAsia="Calibri" w:hAnsi="Calibri" w:cs="Calibri"/>
+          <w:sz w:val="22"/>
+          <w:szCs w:val="22"/>
+        </w:rPr>
+        <w:t xml:space="preserve">    </w:t>
+      </w:r>
+      <w:proofErr w:type="spellStart"/>
+      <w:proofErr w:type="gramStart"/>
+      <w:r>
+        <w:rPr>
+          <w:rFonts w:ascii="Calibri" w:eastAsia="Calibri" w:hAnsi="Calibri" w:cs="Calibri"/>
+          <w:sz w:val="22"/>
+          <w:szCs w:val="22"/>
+        </w:rPr>
+        <w:t>plt.ylabel</w:t>
+      </w:r>
+      <w:proofErr w:type="spellEnd"/>
+      <w:proofErr w:type="gramEnd"/>
+      <w:r>
+        <w:rPr>
+          <w:rFonts w:ascii="Calibri" w:eastAsia="Calibri" w:hAnsi="Calibri" w:cs="Calibri"/>
+          <w:sz w:val="22"/>
+          <w:szCs w:val="22"/>
+        </w:rPr>
+        <w:t>("ADC Output")</w:t>
+      </w:r>
+    </w:p>
+    <w:p>
+      <w:r>
+        <w:rPr>
+          <w:rFonts w:ascii="Calibri" w:eastAsia="Calibri" w:hAnsi="Calibri" w:cs="Calibri"/>
+          <w:sz w:val="22"/>
+          <w:szCs w:val="22"/>
+        </w:rPr>
+        <w:t xml:space="preserve">    </w:t>
+      </w:r>
+      <w:proofErr w:type="spellStart"/>
+      <w:proofErr w:type="gramStart"/>
+      <w:r>
+        <w:rPr>
+          <w:rFonts w:ascii="Calibri" w:eastAsia="Calibri" w:hAnsi="Calibri" w:cs="Calibri"/>
+          <w:sz w:val="22"/>
+          <w:szCs w:val="22"/>
+        </w:rPr>
+        <w:t>plt.title</w:t>
+      </w:r>
+      <w:proofErr w:type="spellEnd"/>
+      <w:proofErr w:type="gramEnd"/>
+      <w:r>
+        <w:rPr>
+          <w:rFonts w:ascii="Calibri" w:eastAsia="Calibri" w:hAnsi="Calibri" w:cs="Calibri"/>
+          <w:sz w:val="22"/>
+          <w:szCs w:val="22"/>
+        </w:rPr>
+        <w:t>(</w:t>
+      </w:r>
+      <w:proofErr w:type="spellStart"/>
+      <w:r>
+        <w:rPr>
+          <w:rFonts w:ascii="Calibri" w:eastAsia="Calibri" w:hAnsi="Calibri" w:cs="Calibri"/>
+          <w:sz w:val="22"/>
+          <w:szCs w:val="22"/>
+        </w:rPr>
+        <w:t>f"Experiment</w:t>
+      </w:r>
+      <w:proofErr w:type="spellEnd"/>
+      <w:r>
+        <w:rPr>
+          <w:rFonts w:ascii="Calibri" w:eastAsia="Calibri" w:hAnsi="Calibri" w:cs="Calibri"/>
+          <w:sz w:val="22"/>
+          <w:szCs w:val="22"/>
+        </w:rPr>
+        <w:t xml:space="preserve"> {n} vs Ideal ADC")</w:t>
+      </w:r>
+    </w:p>
+    <w:p>
+      <w:r>
+        <w:rPr>
+          <w:rFonts w:ascii="Calibri" w:eastAsia="Calibri" w:hAnsi="Calibri" w:cs="Calibri"/>
+          <w:sz w:val="22"/>
+          <w:szCs w:val="22"/>
+        </w:rPr>
+        <w:t xml:space="preserve">    </w:t>
+      </w:r>
+      <w:proofErr w:type="spellStart"/>
+      <w:proofErr w:type="gramStart"/>
+      <w:r>
+        <w:rPr>
+          <w:rFonts w:ascii="Calibri" w:eastAsia="Calibri" w:hAnsi="Calibri" w:cs="Calibri"/>
+          <w:sz w:val="22"/>
+          <w:szCs w:val="22"/>
+        </w:rPr>
+        <w:t>plt.legend</w:t>
+      </w:r>
+      <w:proofErr w:type="spellEnd"/>
+      <w:proofErr w:type="gramEnd"/>
+      <w:r>
+        <w:rPr>
+          <w:rFonts w:ascii="Calibri" w:eastAsia="Calibri" w:hAnsi="Calibri" w:cs="Calibri"/>
+          <w:sz w:val="22"/>
+          <w:szCs w:val="22"/>
+        </w:rPr>
+        <w:t>()</w:t>
+      </w:r>
+    </w:p>
+    <w:p>
+      <w:r>
+        <w:rPr>
+          <w:rFonts w:ascii="Calibri" w:eastAsia="Calibri" w:hAnsi="Calibri" w:cs="Calibri"/>
+          <w:sz w:val="22"/>
+          <w:szCs w:val="22"/>
+        </w:rPr>
+        <w:t xml:space="preserve">    </w:t>
+      </w:r>
+      <w:proofErr w:type="spellStart"/>
+      <w:proofErr w:type="gramStart"/>
+      <w:r>
+        <w:rPr>
+          <w:rFonts w:ascii="Calibri" w:eastAsia="Calibri" w:hAnsi="Calibri" w:cs="Calibri"/>
+          <w:sz w:val="22"/>
+          <w:szCs w:val="22"/>
+        </w:rPr>
+        <w:t>plt.grid</w:t>
+      </w:r>
+      <w:proofErr w:type="spellEnd"/>
+      <w:proofErr w:type="gramEnd"/>
+      <w:r>
+        <w:rPr>
+          <w:rFonts w:ascii="Calibri" w:eastAsia="Calibri" w:hAnsi="Calibri" w:cs="Calibri"/>
+          <w:sz w:val="22"/>
+          <w:szCs w:val="22"/>
+        </w:rPr>
+        <w:t>(True)</w:t>
       </w:r>
     </w:p>
     <w:p/>
@@ -5601,324 +6807,1137 @@
           <w:sz w:val="22"/>
           <w:szCs w:val="22"/>
         </w:rPr>
-        <w:t># Figures 5.1 and 5.2: measured vs ideal</w:t>
-      </w:r>
-    </w:p>
-    <w:p>
-      <w:r>
-        <w:rPr>
-          <w:rFonts w:ascii="Calibri" w:eastAsia="Calibri" w:hAnsi="Calibri" w:cs="Calibri"/>
-          <w:sz w:val="22"/>
-          <w:szCs w:val="22"/>
-        </w:rPr>
-        <w:t>for n, exp, c in [(1, experiment1, "bo-"), (2, experiment2, "ro-")]:</w:t>
-      </w:r>
-    </w:p>
-    <w:p>
-      <w:r>
-        <w:rPr>
-          <w:rFonts w:ascii="Calibri" w:eastAsia="Calibri" w:hAnsi="Calibri" w:cs="Calibri"/>
-          <w:sz w:val="22"/>
-          <w:szCs w:val="22"/>
-        </w:rPr>
-        <w:t xml:space="preserve">    plt.figure(figsize=(8, 5))</w:t>
-      </w:r>
-    </w:p>
-    <w:p>
-      <w:r>
-        <w:rPr>
-          <w:rFonts w:ascii="Calibri" w:eastAsia="Calibri" w:hAnsi="Calibri" w:cs="Calibri"/>
-          <w:sz w:val="22"/>
-          <w:szCs w:val="22"/>
-        </w:rPr>
-        <w:t xml:space="preserve">    plt.plot(multimeter, ideal_adc, "k--", label="Ideal ADC")</w:t>
-      </w:r>
-    </w:p>
-    <w:p>
-      <w:r>
-        <w:rPr>
-          <w:rFonts w:ascii="Calibri" w:eastAsia="Calibri" w:hAnsi="Calibri" w:cs="Calibri"/>
-          <w:sz w:val="22"/>
-          <w:szCs w:val="22"/>
-        </w:rPr>
-        <w:t xml:space="preserve">    plt.plot(multimeter, exp, c, label=f"Experiment {n}")</w:t>
-      </w:r>
-    </w:p>
-    <w:p>
-      <w:r>
-        <w:rPr>
-          <w:rFonts w:ascii="Calibri" w:eastAsia="Calibri" w:hAnsi="Calibri" w:cs="Calibri"/>
-          <w:sz w:val="22"/>
-          <w:szCs w:val="22"/>
-        </w:rPr>
-        <w:t xml:space="preserve">    plt.xlabel("Multimeter Voltage (V)")</w:t>
-      </w:r>
-    </w:p>
-    <w:p>
-      <w:r>
-        <w:rPr>
-          <w:rFonts w:ascii="Calibri" w:eastAsia="Calibri" w:hAnsi="Calibri" w:cs="Calibri"/>
-          <w:sz w:val="22"/>
-          <w:szCs w:val="22"/>
-        </w:rPr>
-        <w:t xml:space="preserve">    plt.ylabel("ADC Output")</w:t>
-      </w:r>
-    </w:p>
-    <w:p>
-      <w:r>
-        <w:rPr>
-          <w:rFonts w:ascii="Calibri" w:eastAsia="Calibri" w:hAnsi="Calibri" w:cs="Calibri"/>
-          <w:sz w:val="22"/>
-          <w:szCs w:val="22"/>
-        </w:rPr>
-        <w:t xml:space="preserve">    plt.title(f"Experiment {n} vs Ideal ADC")</w:t>
-      </w:r>
-    </w:p>
-    <w:p>
-      <w:r>
-        <w:rPr>
-          <w:rFonts w:ascii="Calibri" w:eastAsia="Calibri" w:hAnsi="Calibri" w:cs="Calibri"/>
-          <w:sz w:val="22"/>
-          <w:szCs w:val="22"/>
-        </w:rPr>
-        <w:t xml:space="preserve">    plt.legend()</w:t>
-      </w:r>
-    </w:p>
-    <w:p>
-      <w:r>
-        <w:rPr>
-          <w:rFonts w:ascii="Calibri" w:eastAsia="Calibri" w:hAnsi="Calibri" w:cs="Calibri"/>
-          <w:sz w:val="22"/>
-          <w:szCs w:val="22"/>
-        </w:rPr>
-        <w:t xml:space="preserve">    plt.grid(True)</w:t>
+        <w:t># Figures 5.3 and 5.4: deviation from ideal (LSB)</w:t>
+      </w:r>
+    </w:p>
+    <w:p>
+      <w:r>
+        <w:rPr>
+          <w:rFonts w:ascii="Calibri" w:eastAsia="Calibri" w:hAnsi="Calibri" w:cs="Calibri"/>
+          <w:sz w:val="22"/>
+          <w:szCs w:val="22"/>
+        </w:rPr>
+        <w:t>for n, exp, c in [(1, experiment1, "</w:t>
+      </w:r>
+      <w:proofErr w:type="spellStart"/>
+      <w:r>
+        <w:rPr>
+          <w:rFonts w:ascii="Calibri" w:eastAsia="Calibri" w:hAnsi="Calibri" w:cs="Calibri"/>
+          <w:sz w:val="22"/>
+          <w:szCs w:val="22"/>
+        </w:rPr>
+        <w:t>bo</w:t>
+      </w:r>
+      <w:proofErr w:type="spellEnd"/>
+      <w:r>
+        <w:rPr>
+          <w:rFonts w:ascii="Calibri" w:eastAsia="Calibri" w:hAnsi="Calibri" w:cs="Calibri"/>
+          <w:sz w:val="22"/>
+          <w:szCs w:val="22"/>
+        </w:rPr>
+        <w:t>-"), (2, experiment2, "</w:t>
+      </w:r>
+      <w:proofErr w:type="spellStart"/>
+      <w:r>
+        <w:rPr>
+          <w:rFonts w:ascii="Calibri" w:eastAsia="Calibri" w:hAnsi="Calibri" w:cs="Calibri"/>
+          <w:sz w:val="22"/>
+          <w:szCs w:val="22"/>
+        </w:rPr>
+        <w:t>ro</w:t>
+      </w:r>
+      <w:proofErr w:type="spellEnd"/>
+      <w:r>
+        <w:rPr>
+          <w:rFonts w:ascii="Calibri" w:eastAsia="Calibri" w:hAnsi="Calibri" w:cs="Calibri"/>
+          <w:sz w:val="22"/>
+          <w:szCs w:val="22"/>
+        </w:rPr>
+        <w:t>-")]:</w:t>
+      </w:r>
+    </w:p>
+    <w:p>
+      <w:r>
+        <w:rPr>
+          <w:rFonts w:ascii="Calibri" w:eastAsia="Calibri" w:hAnsi="Calibri" w:cs="Calibri"/>
+          <w:sz w:val="22"/>
+          <w:szCs w:val="22"/>
+        </w:rPr>
+        <w:t xml:space="preserve">    </w:t>
+      </w:r>
+      <w:proofErr w:type="spellStart"/>
+      <w:proofErr w:type="gramStart"/>
+      <w:r>
+        <w:rPr>
+          <w:rFonts w:ascii="Calibri" w:eastAsia="Calibri" w:hAnsi="Calibri" w:cs="Calibri"/>
+          <w:sz w:val="22"/>
+          <w:szCs w:val="22"/>
+        </w:rPr>
+        <w:t>plt.figure</w:t>
+      </w:r>
+      <w:proofErr w:type="spellEnd"/>
+      <w:proofErr w:type="gramEnd"/>
+      <w:r>
+        <w:rPr>
+          <w:rFonts w:ascii="Calibri" w:eastAsia="Calibri" w:hAnsi="Calibri" w:cs="Calibri"/>
+          <w:sz w:val="22"/>
+          <w:szCs w:val="22"/>
+        </w:rPr>
+        <w:t>(</w:t>
+      </w:r>
+      <w:proofErr w:type="spellStart"/>
+      <w:r>
+        <w:rPr>
+          <w:rFonts w:ascii="Calibri" w:eastAsia="Calibri" w:hAnsi="Calibri" w:cs="Calibri"/>
+          <w:sz w:val="22"/>
+          <w:szCs w:val="22"/>
+        </w:rPr>
+        <w:t>figsize</w:t>
+      </w:r>
+      <w:proofErr w:type="spellEnd"/>
+      <w:proofErr w:type="gramStart"/>
+      <w:r>
+        <w:rPr>
+          <w:rFonts w:ascii="Calibri" w:eastAsia="Calibri" w:hAnsi="Calibri" w:cs="Calibri"/>
+          <w:sz w:val="22"/>
+          <w:szCs w:val="22"/>
+        </w:rPr>
+        <w:t>=(</w:t>
+      </w:r>
+      <w:proofErr w:type="gramEnd"/>
+      <w:r>
+        <w:rPr>
+          <w:rFonts w:ascii="Calibri" w:eastAsia="Calibri" w:hAnsi="Calibri" w:cs="Calibri"/>
+          <w:sz w:val="22"/>
+          <w:szCs w:val="22"/>
+        </w:rPr>
+        <w:t>8, 5))</w:t>
+      </w:r>
+    </w:p>
+    <w:p>
+      <w:r>
+        <w:rPr>
+          <w:rFonts w:ascii="Calibri" w:eastAsia="Calibri" w:hAnsi="Calibri" w:cs="Calibri"/>
+          <w:sz w:val="22"/>
+          <w:szCs w:val="22"/>
+        </w:rPr>
+        <w:t xml:space="preserve">    </w:t>
+      </w:r>
+      <w:proofErr w:type="spellStart"/>
+      <w:proofErr w:type="gramStart"/>
+      <w:r>
+        <w:rPr>
+          <w:rFonts w:ascii="Calibri" w:eastAsia="Calibri" w:hAnsi="Calibri" w:cs="Calibri"/>
+          <w:sz w:val="22"/>
+          <w:szCs w:val="22"/>
+        </w:rPr>
+        <w:t>plt.plot</w:t>
+      </w:r>
+      <w:proofErr w:type="spellEnd"/>
+      <w:proofErr w:type="gramEnd"/>
+      <w:r>
+        <w:rPr>
+          <w:rFonts w:ascii="Calibri" w:eastAsia="Calibri" w:hAnsi="Calibri" w:cs="Calibri"/>
+          <w:sz w:val="22"/>
+          <w:szCs w:val="22"/>
+        </w:rPr>
+        <w:t>(</w:t>
+      </w:r>
+      <w:proofErr w:type="spellStart"/>
+      <w:r>
+        <w:rPr>
+          <w:rFonts w:ascii="Calibri" w:eastAsia="Calibri" w:hAnsi="Calibri" w:cs="Calibri"/>
+          <w:sz w:val="22"/>
+          <w:szCs w:val="22"/>
+        </w:rPr>
+        <w:t>multimeter</w:t>
+      </w:r>
+      <w:proofErr w:type="spellEnd"/>
+      <w:r>
+        <w:rPr>
+          <w:rFonts w:ascii="Calibri" w:eastAsia="Calibri" w:hAnsi="Calibri" w:cs="Calibri"/>
+          <w:sz w:val="22"/>
+          <w:szCs w:val="22"/>
+        </w:rPr>
+        <w:t xml:space="preserve">, exp - </w:t>
+      </w:r>
+      <w:proofErr w:type="spellStart"/>
+      <w:r>
+        <w:rPr>
+          <w:rFonts w:ascii="Calibri" w:eastAsia="Calibri" w:hAnsi="Calibri" w:cs="Calibri"/>
+          <w:sz w:val="22"/>
+          <w:szCs w:val="22"/>
+        </w:rPr>
+        <w:t>ideal_adc</w:t>
+      </w:r>
+      <w:proofErr w:type="spellEnd"/>
+      <w:r>
+        <w:rPr>
+          <w:rFonts w:ascii="Calibri" w:eastAsia="Calibri" w:hAnsi="Calibri" w:cs="Calibri"/>
+          <w:sz w:val="22"/>
+          <w:szCs w:val="22"/>
+        </w:rPr>
+        <w:t>, c, label=</w:t>
+      </w:r>
+      <w:proofErr w:type="spellStart"/>
+      <w:r>
+        <w:rPr>
+          <w:rFonts w:ascii="Calibri" w:eastAsia="Calibri" w:hAnsi="Calibri" w:cs="Calibri"/>
+          <w:sz w:val="22"/>
+          <w:szCs w:val="22"/>
+        </w:rPr>
+        <w:t>f"Experiment</w:t>
+      </w:r>
+      <w:proofErr w:type="spellEnd"/>
+      <w:r>
+        <w:rPr>
+          <w:rFonts w:ascii="Calibri" w:eastAsia="Calibri" w:hAnsi="Calibri" w:cs="Calibri"/>
+          <w:sz w:val="22"/>
+          <w:szCs w:val="22"/>
+        </w:rPr>
+        <w:t xml:space="preserve"> {n}")</w:t>
+      </w:r>
+    </w:p>
+    <w:p>
+      <w:r>
+        <w:rPr>
+          <w:rFonts w:ascii="Calibri" w:eastAsia="Calibri" w:hAnsi="Calibri" w:cs="Calibri"/>
+          <w:sz w:val="22"/>
+          <w:szCs w:val="22"/>
+        </w:rPr>
+        <w:t xml:space="preserve">    </w:t>
+      </w:r>
+      <w:proofErr w:type="spellStart"/>
+      <w:proofErr w:type="gramStart"/>
+      <w:r>
+        <w:rPr>
+          <w:rFonts w:ascii="Calibri" w:eastAsia="Calibri" w:hAnsi="Calibri" w:cs="Calibri"/>
+          <w:sz w:val="22"/>
+          <w:szCs w:val="22"/>
+        </w:rPr>
+        <w:t>plt.axhline</w:t>
+      </w:r>
+      <w:proofErr w:type="spellEnd"/>
+      <w:proofErr w:type="gramEnd"/>
+      <w:r>
+        <w:rPr>
+          <w:rFonts w:ascii="Calibri" w:eastAsia="Calibri" w:hAnsi="Calibri" w:cs="Calibri"/>
+          <w:sz w:val="22"/>
+          <w:szCs w:val="22"/>
+        </w:rPr>
+        <w:t xml:space="preserve">(0, </w:t>
+      </w:r>
+      <w:proofErr w:type="spellStart"/>
+      <w:r>
+        <w:rPr>
+          <w:rFonts w:ascii="Calibri" w:eastAsia="Calibri" w:hAnsi="Calibri" w:cs="Calibri"/>
+          <w:sz w:val="22"/>
+          <w:szCs w:val="22"/>
+        </w:rPr>
+        <w:t>color</w:t>
+      </w:r>
+      <w:proofErr w:type="spellEnd"/>
+      <w:r>
+        <w:rPr>
+          <w:rFonts w:ascii="Calibri" w:eastAsia="Calibri" w:hAnsi="Calibri" w:cs="Calibri"/>
+          <w:sz w:val="22"/>
+          <w:szCs w:val="22"/>
+        </w:rPr>
+        <w:t xml:space="preserve">="black", </w:t>
+      </w:r>
+      <w:proofErr w:type="spellStart"/>
+      <w:r>
+        <w:rPr>
+          <w:rFonts w:ascii="Calibri" w:eastAsia="Calibri" w:hAnsi="Calibri" w:cs="Calibri"/>
+          <w:sz w:val="22"/>
+          <w:szCs w:val="22"/>
+        </w:rPr>
+        <w:t>linestyle</w:t>
+      </w:r>
+      <w:proofErr w:type="spellEnd"/>
+      <w:r>
+        <w:rPr>
+          <w:rFonts w:ascii="Calibri" w:eastAsia="Calibri" w:hAnsi="Calibri" w:cs="Calibri"/>
+          <w:sz w:val="22"/>
+          <w:szCs w:val="22"/>
+        </w:rPr>
+        <w:t>="--", label="Ideal")</w:t>
+      </w:r>
+    </w:p>
+    <w:p>
+      <w:r>
+        <w:rPr>
+          <w:rFonts w:ascii="Calibri" w:eastAsia="Calibri" w:hAnsi="Calibri" w:cs="Calibri"/>
+          <w:sz w:val="22"/>
+          <w:szCs w:val="22"/>
+        </w:rPr>
+        <w:t xml:space="preserve">    </w:t>
+      </w:r>
+      <w:proofErr w:type="spellStart"/>
+      <w:proofErr w:type="gramStart"/>
+      <w:r>
+        <w:rPr>
+          <w:rFonts w:ascii="Calibri" w:eastAsia="Calibri" w:hAnsi="Calibri" w:cs="Calibri"/>
+          <w:sz w:val="22"/>
+          <w:szCs w:val="22"/>
+        </w:rPr>
+        <w:t>plt.xlabel</w:t>
+      </w:r>
+      <w:proofErr w:type="spellEnd"/>
+      <w:proofErr w:type="gramEnd"/>
+      <w:r>
+        <w:rPr>
+          <w:rFonts w:ascii="Calibri" w:eastAsia="Calibri" w:hAnsi="Calibri" w:cs="Calibri"/>
+          <w:sz w:val="22"/>
+          <w:szCs w:val="22"/>
+        </w:rPr>
+        <w:t>("</w:t>
+      </w:r>
+      <w:proofErr w:type="spellStart"/>
+      <w:r>
+        <w:rPr>
+          <w:rFonts w:ascii="Calibri" w:eastAsia="Calibri" w:hAnsi="Calibri" w:cs="Calibri"/>
+          <w:sz w:val="22"/>
+          <w:szCs w:val="22"/>
+        </w:rPr>
+        <w:t>Multimeter</w:t>
+      </w:r>
+      <w:proofErr w:type="spellEnd"/>
+      <w:r>
+        <w:rPr>
+          <w:rFonts w:ascii="Calibri" w:eastAsia="Calibri" w:hAnsi="Calibri" w:cs="Calibri"/>
+          <w:sz w:val="22"/>
+          <w:szCs w:val="22"/>
+        </w:rPr>
+        <w:t xml:space="preserve"> Voltage (V)")</w:t>
+      </w:r>
+    </w:p>
+    <w:p>
+      <w:r>
+        <w:rPr>
+          <w:rFonts w:ascii="Calibri" w:eastAsia="Calibri" w:hAnsi="Calibri" w:cs="Calibri"/>
+          <w:sz w:val="22"/>
+          <w:szCs w:val="22"/>
+        </w:rPr>
+        <w:t xml:space="preserve">    </w:t>
+      </w:r>
+      <w:proofErr w:type="spellStart"/>
+      <w:proofErr w:type="gramStart"/>
+      <w:r>
+        <w:rPr>
+          <w:rFonts w:ascii="Calibri" w:eastAsia="Calibri" w:hAnsi="Calibri" w:cs="Calibri"/>
+          <w:sz w:val="22"/>
+          <w:szCs w:val="22"/>
+        </w:rPr>
+        <w:t>plt.ylabel</w:t>
+      </w:r>
+      <w:proofErr w:type="spellEnd"/>
+      <w:proofErr w:type="gramEnd"/>
+      <w:r>
+        <w:rPr>
+          <w:rFonts w:ascii="Calibri" w:eastAsia="Calibri" w:hAnsi="Calibri" w:cs="Calibri"/>
+          <w:sz w:val="22"/>
+          <w:szCs w:val="22"/>
+        </w:rPr>
+        <w:t>("Deviation (LSB)")</w:t>
+      </w:r>
+    </w:p>
+    <w:p>
+      <w:r>
+        <w:rPr>
+          <w:rFonts w:ascii="Calibri" w:eastAsia="Calibri" w:hAnsi="Calibri" w:cs="Calibri"/>
+          <w:sz w:val="22"/>
+          <w:szCs w:val="22"/>
+        </w:rPr>
+        <w:t xml:space="preserve">    </w:t>
+      </w:r>
+      <w:proofErr w:type="spellStart"/>
+      <w:proofErr w:type="gramStart"/>
+      <w:r>
+        <w:rPr>
+          <w:rFonts w:ascii="Calibri" w:eastAsia="Calibri" w:hAnsi="Calibri" w:cs="Calibri"/>
+          <w:sz w:val="22"/>
+          <w:szCs w:val="22"/>
+        </w:rPr>
+        <w:t>plt.title</w:t>
+      </w:r>
+      <w:proofErr w:type="spellEnd"/>
+      <w:proofErr w:type="gramEnd"/>
+      <w:r>
+        <w:rPr>
+          <w:rFonts w:ascii="Calibri" w:eastAsia="Calibri" w:hAnsi="Calibri" w:cs="Calibri"/>
+          <w:sz w:val="22"/>
+          <w:szCs w:val="22"/>
+        </w:rPr>
+        <w:t>(</w:t>
+      </w:r>
+      <w:proofErr w:type="spellStart"/>
+      <w:r>
+        <w:rPr>
+          <w:rFonts w:ascii="Calibri" w:eastAsia="Calibri" w:hAnsi="Calibri" w:cs="Calibri"/>
+          <w:sz w:val="22"/>
+          <w:szCs w:val="22"/>
+        </w:rPr>
+        <w:t>f"Experiment</w:t>
+      </w:r>
+      <w:proofErr w:type="spellEnd"/>
+      <w:r>
+        <w:rPr>
+          <w:rFonts w:ascii="Calibri" w:eastAsia="Calibri" w:hAnsi="Calibri" w:cs="Calibri"/>
+          <w:sz w:val="22"/>
+          <w:szCs w:val="22"/>
+        </w:rPr>
+        <w:t xml:space="preserve"> {n} - Linearity Error")</w:t>
+      </w:r>
+    </w:p>
+    <w:p>
+      <w:r>
+        <w:rPr>
+          <w:rFonts w:ascii="Calibri" w:eastAsia="Calibri" w:hAnsi="Calibri" w:cs="Calibri"/>
+          <w:sz w:val="22"/>
+          <w:szCs w:val="22"/>
+        </w:rPr>
+        <w:t xml:space="preserve">    </w:t>
+      </w:r>
+      <w:proofErr w:type="spellStart"/>
+      <w:proofErr w:type="gramStart"/>
+      <w:r>
+        <w:rPr>
+          <w:rFonts w:ascii="Calibri" w:eastAsia="Calibri" w:hAnsi="Calibri" w:cs="Calibri"/>
+          <w:sz w:val="22"/>
+          <w:szCs w:val="22"/>
+        </w:rPr>
+        <w:t>plt.legend</w:t>
+      </w:r>
+      <w:proofErr w:type="spellEnd"/>
+      <w:proofErr w:type="gramEnd"/>
+      <w:r>
+        <w:rPr>
+          <w:rFonts w:ascii="Calibri" w:eastAsia="Calibri" w:hAnsi="Calibri" w:cs="Calibri"/>
+          <w:sz w:val="22"/>
+          <w:szCs w:val="22"/>
+        </w:rPr>
+        <w:t>()</w:t>
+      </w:r>
+    </w:p>
+    <w:p>
+      <w:r>
+        <w:rPr>
+          <w:rFonts w:ascii="Calibri" w:eastAsia="Calibri" w:hAnsi="Calibri" w:cs="Calibri"/>
+          <w:sz w:val="22"/>
+          <w:szCs w:val="22"/>
+        </w:rPr>
+        <w:t xml:space="preserve">    </w:t>
+      </w:r>
+      <w:proofErr w:type="spellStart"/>
+      <w:proofErr w:type="gramStart"/>
+      <w:r>
+        <w:rPr>
+          <w:rFonts w:ascii="Calibri" w:eastAsia="Calibri" w:hAnsi="Calibri" w:cs="Calibri"/>
+          <w:sz w:val="22"/>
+          <w:szCs w:val="22"/>
+        </w:rPr>
+        <w:t>plt.grid</w:t>
+      </w:r>
+      <w:proofErr w:type="spellEnd"/>
+      <w:proofErr w:type="gramEnd"/>
+      <w:r>
+        <w:rPr>
+          <w:rFonts w:ascii="Calibri" w:eastAsia="Calibri" w:hAnsi="Calibri" w:cs="Calibri"/>
+          <w:sz w:val="22"/>
+          <w:szCs w:val="22"/>
+        </w:rPr>
+        <w:t>(True)</w:t>
       </w:r>
     </w:p>
     <w:p/>
     <w:p>
-      <w:r>
-        <w:rPr>
-          <w:rFonts w:ascii="Calibri" w:eastAsia="Calibri" w:hAnsi="Calibri" w:cs="Calibri"/>
-          <w:sz w:val="22"/>
-          <w:szCs w:val="22"/>
-        </w:rPr>
-        <w:t># Figures 5.3 and 5.4: deviation from ideal (LSB)</w:t>
-      </w:r>
-    </w:p>
-    <w:p>
-      <w:r>
-        <w:rPr>
-          <w:rFonts w:ascii="Calibri" w:eastAsia="Calibri" w:hAnsi="Calibri" w:cs="Calibri"/>
-          <w:sz w:val="22"/>
-          <w:szCs w:val="22"/>
-        </w:rPr>
-        <w:t>for n, exp, c in [(1, experiment1, "bo-"), (2, experiment2, "ro-")]:</w:t>
-      </w:r>
-    </w:p>
-    <w:p>
-      <w:r>
-        <w:rPr>
-          <w:rFonts w:ascii="Calibri" w:eastAsia="Calibri" w:hAnsi="Calibri" w:cs="Calibri"/>
-          <w:sz w:val="22"/>
-          <w:szCs w:val="22"/>
-        </w:rPr>
-        <w:t xml:space="preserve">    plt.figure(figsize=(8, 5))</w:t>
-      </w:r>
-    </w:p>
-    <w:p>
-      <w:r>
-        <w:rPr>
-          <w:rFonts w:ascii="Calibri" w:eastAsia="Calibri" w:hAnsi="Calibri" w:cs="Calibri"/>
-          <w:sz w:val="22"/>
-          <w:szCs w:val="22"/>
-        </w:rPr>
-        <w:t xml:space="preserve">    plt.plot(multimeter, exp - ideal_adc, c, label=f"Experiment {n}")</w:t>
-      </w:r>
-    </w:p>
-    <w:p>
-      <w:r>
-        <w:rPr>
-          <w:rFonts w:ascii="Calibri" w:eastAsia="Calibri" w:hAnsi="Calibri" w:cs="Calibri"/>
-          <w:sz w:val="22"/>
-          <w:szCs w:val="22"/>
-        </w:rPr>
-        <w:t xml:space="preserve">    plt.axhline(0, color="black", linestyle="--", label="Ideal")</w:t>
-      </w:r>
-    </w:p>
-    <w:p>
-      <w:r>
-        <w:rPr>
-          <w:rFonts w:ascii="Calibri" w:eastAsia="Calibri" w:hAnsi="Calibri" w:cs="Calibri"/>
-          <w:sz w:val="22"/>
-          <w:szCs w:val="22"/>
-        </w:rPr>
-        <w:t xml:space="preserve">    plt.xlabel("Multimeter Voltage (V)")</w:t>
-      </w:r>
-    </w:p>
-    <w:p>
-      <w:r>
-        <w:rPr>
-          <w:rFonts w:ascii="Calibri" w:eastAsia="Calibri" w:hAnsi="Calibri" w:cs="Calibri"/>
-          <w:sz w:val="22"/>
-          <w:szCs w:val="22"/>
-        </w:rPr>
-        <w:t xml:space="preserve">    plt.ylabel("Deviation (LSB)")</w:t>
-      </w:r>
-    </w:p>
-    <w:p>
-      <w:r>
-        <w:rPr>
-          <w:rFonts w:ascii="Calibri" w:eastAsia="Calibri" w:hAnsi="Calibri" w:cs="Calibri"/>
-          <w:sz w:val="22"/>
-          <w:szCs w:val="22"/>
-        </w:rPr>
-        <w:t xml:space="preserve">    plt.title(f"Experiment {n} - Linearity Error")</w:t>
-      </w:r>
-    </w:p>
-    <w:p>
-      <w:r>
-        <w:rPr>
-          <w:rFonts w:ascii="Calibri" w:eastAsia="Calibri" w:hAnsi="Calibri" w:cs="Calibri"/>
-          <w:sz w:val="22"/>
-          <w:szCs w:val="22"/>
-        </w:rPr>
-        <w:t xml:space="preserve">    plt.legend()</w:t>
-      </w:r>
-    </w:p>
-    <w:p>
-      <w:r>
-        <w:rPr>
-          <w:rFonts w:ascii="Calibri" w:eastAsia="Calibri" w:hAnsi="Calibri" w:cs="Calibri"/>
-          <w:sz w:val="22"/>
-          <w:szCs w:val="22"/>
-        </w:rPr>
-        <w:t xml:space="preserve">    plt.grid(True)</w:t>
+      <w:pPr>
+        <w:rPr>
+          <w:rFonts w:ascii="Calibri" w:eastAsia="Calibri" w:hAnsi="Calibri" w:cs="Calibri"/>
+          <w:sz w:val="22"/>
+          <w:szCs w:val="22"/>
+        </w:rPr>
+      </w:pPr>
+      <w:r>
+        <w:rPr>
+          <w:rFonts w:ascii="Calibri" w:eastAsia="Calibri" w:hAnsi="Calibri" w:cs="Calibri"/>
+          <w:sz w:val="22"/>
+          <w:szCs w:val="22"/>
+        </w:rPr>
+        <w:t># Figures 5.5 and 5.6: endpoint INL (0–5 V)</w:t>
+      </w:r>
+    </w:p>
+    <w:p>
+      <w:pPr>
+        <w:rPr>
+          <w:rFonts w:ascii="Calibri" w:eastAsia="Calibri" w:hAnsi="Calibri" w:cs="Calibri"/>
+          <w:sz w:val="22"/>
+          <w:szCs w:val="22"/>
+        </w:rPr>
+      </w:pPr>
+      <w:r>
+        <w:rPr>
+          <w:rFonts w:ascii="Calibri" w:eastAsia="Calibri" w:hAnsi="Calibri" w:cs="Calibri"/>
+          <w:sz w:val="22"/>
+          <w:szCs w:val="22"/>
+        </w:rPr>
+        <w:t xml:space="preserve">for n, v, </w:t>
+      </w:r>
+      <w:proofErr w:type="spellStart"/>
+      <w:r>
+        <w:rPr>
+          <w:rFonts w:ascii="Calibri" w:eastAsia="Calibri" w:hAnsi="Calibri" w:cs="Calibri"/>
+          <w:sz w:val="22"/>
+          <w:szCs w:val="22"/>
+        </w:rPr>
+        <w:t>adc</w:t>
+      </w:r>
+      <w:proofErr w:type="spellEnd"/>
+      <w:r>
+        <w:rPr>
+          <w:rFonts w:ascii="Calibri" w:eastAsia="Calibri" w:hAnsi="Calibri" w:cs="Calibri"/>
+          <w:sz w:val="22"/>
+          <w:szCs w:val="22"/>
+        </w:rPr>
+        <w:t xml:space="preserve"> in [(1, </w:t>
+      </w:r>
+      <w:proofErr w:type="spellStart"/>
+      <w:r>
+        <w:rPr>
+          <w:rFonts w:ascii="Calibri" w:eastAsia="Calibri" w:hAnsi="Calibri" w:cs="Calibri"/>
+          <w:sz w:val="22"/>
+          <w:szCs w:val="22"/>
+        </w:rPr>
+        <w:t>multimeter</w:t>
+      </w:r>
+      <w:proofErr w:type="spellEnd"/>
+      <w:r>
+        <w:rPr>
+          <w:rFonts w:ascii="Calibri" w:eastAsia="Calibri" w:hAnsi="Calibri" w:cs="Calibri"/>
+          <w:sz w:val="22"/>
+          <w:szCs w:val="22"/>
+        </w:rPr>
+        <w:t xml:space="preserve">, experiment1), (2, </w:t>
+      </w:r>
+      <w:proofErr w:type="spellStart"/>
+      <w:r>
+        <w:rPr>
+          <w:rFonts w:ascii="Calibri" w:eastAsia="Calibri" w:hAnsi="Calibri" w:cs="Calibri"/>
+          <w:sz w:val="22"/>
+          <w:szCs w:val="22"/>
+        </w:rPr>
+        <w:t>multimeter</w:t>
+      </w:r>
+      <w:proofErr w:type="spellEnd"/>
+      <w:r>
+        <w:rPr>
+          <w:rFonts w:ascii="Calibri" w:eastAsia="Calibri" w:hAnsi="Calibri" w:cs="Calibri"/>
+          <w:sz w:val="22"/>
+          <w:szCs w:val="22"/>
+        </w:rPr>
+        <w:t>, experiment2)]:</w:t>
+      </w:r>
+    </w:p>
+    <w:p>
+      <w:r>
+        <w:rPr>
+          <w:rFonts w:ascii="Calibri" w:eastAsia="Calibri" w:hAnsi="Calibri" w:cs="Calibri"/>
+          <w:sz w:val="22"/>
+          <w:szCs w:val="22"/>
+        </w:rPr>
+        <w:t xml:space="preserve">    ref = </w:t>
+      </w:r>
+      <w:proofErr w:type="spellStart"/>
+      <w:proofErr w:type="gramStart"/>
+      <w:r>
+        <w:rPr>
+          <w:rFonts w:ascii="Calibri" w:eastAsia="Calibri" w:hAnsi="Calibri" w:cs="Calibri"/>
+          <w:sz w:val="22"/>
+          <w:szCs w:val="22"/>
+        </w:rPr>
+        <w:t>adc</w:t>
+      </w:r>
+      <w:proofErr w:type="spellEnd"/>
+      <w:r>
+        <w:rPr>
+          <w:rFonts w:ascii="Calibri" w:eastAsia="Calibri" w:hAnsi="Calibri" w:cs="Calibri"/>
+          <w:sz w:val="22"/>
+          <w:szCs w:val="22"/>
+        </w:rPr>
+        <w:t>[</w:t>
+      </w:r>
+      <w:proofErr w:type="gramEnd"/>
+      <w:r>
+        <w:rPr>
+          <w:rFonts w:ascii="Calibri" w:eastAsia="Calibri" w:hAnsi="Calibri" w:cs="Calibri"/>
+          <w:sz w:val="22"/>
+          <w:szCs w:val="22"/>
+        </w:rPr>
+        <w:t>0] + (</w:t>
+      </w:r>
+      <w:proofErr w:type="spellStart"/>
+      <w:proofErr w:type="gramStart"/>
+      <w:r>
+        <w:rPr>
+          <w:rFonts w:ascii="Calibri" w:eastAsia="Calibri" w:hAnsi="Calibri" w:cs="Calibri"/>
+          <w:sz w:val="22"/>
+          <w:szCs w:val="22"/>
+        </w:rPr>
+        <w:t>adc</w:t>
+      </w:r>
+      <w:proofErr w:type="spellEnd"/>
+      <w:r>
+        <w:rPr>
+          <w:rFonts w:ascii="Calibri" w:eastAsia="Calibri" w:hAnsi="Calibri" w:cs="Calibri"/>
+          <w:sz w:val="22"/>
+          <w:szCs w:val="22"/>
+        </w:rPr>
+        <w:t>[</w:t>
+      </w:r>
+      <w:proofErr w:type="gramEnd"/>
+      <w:r>
+        <w:rPr>
+          <w:rFonts w:ascii="Calibri" w:eastAsia="Calibri" w:hAnsi="Calibri" w:cs="Calibri"/>
+          <w:sz w:val="22"/>
+          <w:szCs w:val="22"/>
+        </w:rPr>
+        <w:t xml:space="preserve">-1] - </w:t>
+      </w:r>
+      <w:proofErr w:type="spellStart"/>
+      <w:proofErr w:type="gramStart"/>
+      <w:r>
+        <w:rPr>
+          <w:rFonts w:ascii="Calibri" w:eastAsia="Calibri" w:hAnsi="Calibri" w:cs="Calibri"/>
+          <w:sz w:val="22"/>
+          <w:szCs w:val="22"/>
+        </w:rPr>
+        <w:t>adc</w:t>
+      </w:r>
+      <w:proofErr w:type="spellEnd"/>
+      <w:r>
+        <w:rPr>
+          <w:rFonts w:ascii="Calibri" w:eastAsia="Calibri" w:hAnsi="Calibri" w:cs="Calibri"/>
+          <w:sz w:val="22"/>
+          <w:szCs w:val="22"/>
+        </w:rPr>
+        <w:t>[</w:t>
+      </w:r>
+      <w:proofErr w:type="gramEnd"/>
+      <w:r>
+        <w:rPr>
+          <w:rFonts w:ascii="Calibri" w:eastAsia="Calibri" w:hAnsi="Calibri" w:cs="Calibri"/>
+          <w:sz w:val="22"/>
+          <w:szCs w:val="22"/>
+        </w:rPr>
+        <w:t>0]) / (</w:t>
+      </w:r>
+      <w:proofErr w:type="gramStart"/>
+      <w:r>
+        <w:rPr>
+          <w:rFonts w:ascii="Calibri" w:eastAsia="Calibri" w:hAnsi="Calibri" w:cs="Calibri"/>
+          <w:sz w:val="22"/>
+          <w:szCs w:val="22"/>
+        </w:rPr>
+        <w:t>v[</w:t>
+      </w:r>
+      <w:proofErr w:type="gramEnd"/>
+      <w:r>
+        <w:rPr>
+          <w:rFonts w:ascii="Calibri" w:eastAsia="Calibri" w:hAnsi="Calibri" w:cs="Calibri"/>
+          <w:sz w:val="22"/>
+          <w:szCs w:val="22"/>
+        </w:rPr>
+        <w:t xml:space="preserve">-1] - </w:t>
+      </w:r>
+      <w:proofErr w:type="gramStart"/>
+      <w:r>
+        <w:rPr>
+          <w:rFonts w:ascii="Calibri" w:eastAsia="Calibri" w:hAnsi="Calibri" w:cs="Calibri"/>
+          <w:sz w:val="22"/>
+          <w:szCs w:val="22"/>
+        </w:rPr>
+        <w:t>v[</w:t>
+      </w:r>
+      <w:proofErr w:type="gramEnd"/>
+      <w:r>
+        <w:rPr>
+          <w:rFonts w:ascii="Calibri" w:eastAsia="Calibri" w:hAnsi="Calibri" w:cs="Calibri"/>
+          <w:sz w:val="22"/>
+          <w:szCs w:val="22"/>
+        </w:rPr>
+        <w:t xml:space="preserve">0]) * (v - </w:t>
+      </w:r>
+      <w:proofErr w:type="gramStart"/>
+      <w:r>
+        <w:rPr>
+          <w:rFonts w:ascii="Calibri" w:eastAsia="Calibri" w:hAnsi="Calibri" w:cs="Calibri"/>
+          <w:sz w:val="22"/>
+          <w:szCs w:val="22"/>
+        </w:rPr>
+        <w:t>v[</w:t>
+      </w:r>
+      <w:proofErr w:type="gramEnd"/>
+      <w:r>
+        <w:rPr>
+          <w:rFonts w:ascii="Calibri" w:eastAsia="Calibri" w:hAnsi="Calibri" w:cs="Calibri"/>
+          <w:sz w:val="22"/>
+          <w:szCs w:val="22"/>
+        </w:rPr>
+        <w:t>0])</w:t>
+      </w:r>
+    </w:p>
+    <w:p>
+      <w:r>
+        <w:rPr>
+          <w:rFonts w:ascii="Calibri" w:eastAsia="Calibri" w:hAnsi="Calibri" w:cs="Calibri"/>
+          <w:sz w:val="22"/>
+          <w:szCs w:val="22"/>
+        </w:rPr>
+        <w:t xml:space="preserve">    </w:t>
+      </w:r>
+      <w:proofErr w:type="spellStart"/>
+      <w:proofErr w:type="gramStart"/>
+      <w:r>
+        <w:rPr>
+          <w:rFonts w:ascii="Calibri" w:eastAsia="Calibri" w:hAnsi="Calibri" w:cs="Calibri"/>
+          <w:sz w:val="22"/>
+          <w:szCs w:val="22"/>
+        </w:rPr>
+        <w:t>plt.figure</w:t>
+      </w:r>
+      <w:proofErr w:type="spellEnd"/>
+      <w:proofErr w:type="gramEnd"/>
+      <w:r>
+        <w:rPr>
+          <w:rFonts w:ascii="Calibri" w:eastAsia="Calibri" w:hAnsi="Calibri" w:cs="Calibri"/>
+          <w:sz w:val="22"/>
+          <w:szCs w:val="22"/>
+        </w:rPr>
+        <w:t>(</w:t>
+      </w:r>
+      <w:proofErr w:type="spellStart"/>
+      <w:r>
+        <w:rPr>
+          <w:rFonts w:ascii="Calibri" w:eastAsia="Calibri" w:hAnsi="Calibri" w:cs="Calibri"/>
+          <w:sz w:val="22"/>
+          <w:szCs w:val="22"/>
+        </w:rPr>
+        <w:t>figsize</w:t>
+      </w:r>
+      <w:proofErr w:type="spellEnd"/>
+      <w:proofErr w:type="gramStart"/>
+      <w:r>
+        <w:rPr>
+          <w:rFonts w:ascii="Calibri" w:eastAsia="Calibri" w:hAnsi="Calibri" w:cs="Calibri"/>
+          <w:sz w:val="22"/>
+          <w:szCs w:val="22"/>
+        </w:rPr>
+        <w:t>=(</w:t>
+      </w:r>
+      <w:proofErr w:type="gramEnd"/>
+      <w:r>
+        <w:rPr>
+          <w:rFonts w:ascii="Calibri" w:eastAsia="Calibri" w:hAnsi="Calibri" w:cs="Calibri"/>
+          <w:sz w:val="22"/>
+          <w:szCs w:val="22"/>
+        </w:rPr>
+        <w:t>8, 5))</w:t>
+      </w:r>
+    </w:p>
+    <w:p>
+      <w:pPr>
+        <w:rPr>
+          <w:rFonts w:ascii="Calibri" w:eastAsia="Calibri" w:hAnsi="Calibri" w:cs="Calibri"/>
+          <w:sz w:val="22"/>
+          <w:szCs w:val="22"/>
+        </w:rPr>
+      </w:pPr>
+      <w:r>
+        <w:rPr>
+          <w:rFonts w:ascii="Calibri" w:eastAsia="Calibri" w:hAnsi="Calibri" w:cs="Calibri"/>
+          <w:sz w:val="22"/>
+          <w:szCs w:val="22"/>
+        </w:rPr>
+        <w:t xml:space="preserve">    </w:t>
+      </w:r>
+      <w:proofErr w:type="spellStart"/>
+      <w:proofErr w:type="gramStart"/>
+      <w:r>
+        <w:rPr>
+          <w:rFonts w:ascii="Calibri" w:eastAsia="Calibri" w:hAnsi="Calibri" w:cs="Calibri"/>
+          <w:sz w:val="22"/>
+          <w:szCs w:val="22"/>
+        </w:rPr>
+        <w:t>plt.plot</w:t>
+      </w:r>
+      <w:proofErr w:type="spellEnd"/>
+      <w:proofErr w:type="gramEnd"/>
+      <w:r>
+        <w:rPr>
+          <w:rFonts w:ascii="Calibri" w:eastAsia="Calibri" w:hAnsi="Calibri" w:cs="Calibri"/>
+          <w:sz w:val="22"/>
+          <w:szCs w:val="22"/>
+        </w:rPr>
+        <w:t xml:space="preserve">(v, </w:t>
+      </w:r>
+      <w:proofErr w:type="spellStart"/>
+      <w:r>
+        <w:rPr>
+          <w:rFonts w:ascii="Calibri" w:eastAsia="Calibri" w:hAnsi="Calibri" w:cs="Calibri"/>
+          <w:sz w:val="22"/>
+          <w:szCs w:val="22"/>
+        </w:rPr>
+        <w:t>adc</w:t>
+      </w:r>
+      <w:proofErr w:type="spellEnd"/>
+      <w:r>
+        <w:rPr>
+          <w:rFonts w:ascii="Calibri" w:eastAsia="Calibri" w:hAnsi="Calibri" w:cs="Calibri"/>
+          <w:sz w:val="22"/>
+          <w:szCs w:val="22"/>
+        </w:rPr>
+        <w:t xml:space="preserve"> - ref, "o-",</w:t>
+      </w:r>
+    </w:p>
+    <w:p>
+      <w:pPr>
+        <w:rPr>
+          <w:rFonts w:ascii="Calibri" w:eastAsia="Calibri" w:hAnsi="Calibri" w:cs="Calibri"/>
+          <w:sz w:val="22"/>
+          <w:szCs w:val="22"/>
+        </w:rPr>
+      </w:pPr>
+      <w:r>
+        <w:rPr>
+          <w:rFonts w:ascii="Calibri" w:eastAsia="Calibri" w:hAnsi="Calibri" w:cs="Calibri"/>
+          <w:sz w:val="22"/>
+          <w:szCs w:val="22"/>
+        </w:rPr>
+        <w:t xml:space="preserve">         </w:t>
+      </w:r>
+      <w:proofErr w:type="spellStart"/>
+      <w:r>
+        <w:rPr>
+          <w:rFonts w:ascii="Calibri" w:eastAsia="Calibri" w:hAnsi="Calibri" w:cs="Calibri"/>
+          <w:sz w:val="22"/>
+          <w:szCs w:val="22"/>
+        </w:rPr>
+        <w:t>color</w:t>
+      </w:r>
+      <w:proofErr w:type="spellEnd"/>
+      <w:r>
+        <w:rPr>
+          <w:rFonts w:ascii="Calibri" w:eastAsia="Calibri" w:hAnsi="Calibri" w:cs="Calibri"/>
+          <w:sz w:val="22"/>
+          <w:szCs w:val="22"/>
+        </w:rPr>
+        <w:t>="blue" if n == 1 else "red",</w:t>
+      </w:r>
+    </w:p>
+    <w:p>
+      <w:r>
+        <w:rPr>
+          <w:rFonts w:ascii="Calibri" w:eastAsia="Calibri" w:hAnsi="Calibri" w:cs="Calibri"/>
+          <w:sz w:val="22"/>
+          <w:szCs w:val="22"/>
+        </w:rPr>
+        <w:t xml:space="preserve">         label=</w:t>
+      </w:r>
+      <w:proofErr w:type="spellStart"/>
+      <w:r>
+        <w:rPr>
+          <w:rFonts w:ascii="Calibri" w:eastAsia="Calibri" w:hAnsi="Calibri" w:cs="Calibri"/>
+          <w:sz w:val="22"/>
+          <w:szCs w:val="22"/>
+        </w:rPr>
+        <w:t>f"Experiment</w:t>
+      </w:r>
+      <w:proofErr w:type="spellEnd"/>
+      <w:r>
+        <w:rPr>
+          <w:rFonts w:ascii="Calibri" w:eastAsia="Calibri" w:hAnsi="Calibri" w:cs="Calibri"/>
+          <w:sz w:val="22"/>
+          <w:szCs w:val="22"/>
+        </w:rPr>
+        <w:t xml:space="preserve"> {n}")</w:t>
+      </w:r>
+    </w:p>
+    <w:p>
+      <w:r>
+        <w:rPr>
+          <w:rFonts w:ascii="Calibri" w:eastAsia="Calibri" w:hAnsi="Calibri" w:cs="Calibri"/>
+          <w:sz w:val="22"/>
+          <w:szCs w:val="22"/>
+        </w:rPr>
+        <w:t xml:space="preserve">    </w:t>
+      </w:r>
+      <w:proofErr w:type="spellStart"/>
+      <w:proofErr w:type="gramStart"/>
+      <w:r>
+        <w:rPr>
+          <w:rFonts w:ascii="Calibri" w:eastAsia="Calibri" w:hAnsi="Calibri" w:cs="Calibri"/>
+          <w:sz w:val="22"/>
+          <w:szCs w:val="22"/>
+        </w:rPr>
+        <w:t>plt.axhline</w:t>
+      </w:r>
+      <w:proofErr w:type="spellEnd"/>
+      <w:proofErr w:type="gramEnd"/>
+      <w:r>
+        <w:rPr>
+          <w:rFonts w:ascii="Calibri" w:eastAsia="Calibri" w:hAnsi="Calibri" w:cs="Calibri"/>
+          <w:sz w:val="22"/>
+          <w:szCs w:val="22"/>
+        </w:rPr>
+        <w:t xml:space="preserve">(0, </w:t>
+      </w:r>
+      <w:proofErr w:type="spellStart"/>
+      <w:r>
+        <w:rPr>
+          <w:rFonts w:ascii="Calibri" w:eastAsia="Calibri" w:hAnsi="Calibri" w:cs="Calibri"/>
+          <w:sz w:val="22"/>
+          <w:szCs w:val="22"/>
+        </w:rPr>
+        <w:t>color</w:t>
+      </w:r>
+      <w:proofErr w:type="spellEnd"/>
+      <w:r>
+        <w:rPr>
+          <w:rFonts w:ascii="Calibri" w:eastAsia="Calibri" w:hAnsi="Calibri" w:cs="Calibri"/>
+          <w:sz w:val="22"/>
+          <w:szCs w:val="22"/>
+        </w:rPr>
+        <w:t xml:space="preserve">="black", </w:t>
+      </w:r>
+      <w:proofErr w:type="spellStart"/>
+      <w:r>
+        <w:rPr>
+          <w:rFonts w:ascii="Calibri" w:eastAsia="Calibri" w:hAnsi="Calibri" w:cs="Calibri"/>
+          <w:sz w:val="22"/>
+          <w:szCs w:val="22"/>
+        </w:rPr>
+        <w:t>linestyle</w:t>
+      </w:r>
+      <w:proofErr w:type="spellEnd"/>
+      <w:r>
+        <w:rPr>
+          <w:rFonts w:ascii="Calibri" w:eastAsia="Calibri" w:hAnsi="Calibri" w:cs="Calibri"/>
+          <w:sz w:val="22"/>
+          <w:szCs w:val="22"/>
+        </w:rPr>
+        <w:t>="--", label="Reference")</w:t>
+      </w:r>
+    </w:p>
+    <w:p>
+      <w:r>
+        <w:rPr>
+          <w:rFonts w:ascii="Calibri" w:eastAsia="Calibri" w:hAnsi="Calibri" w:cs="Calibri"/>
+          <w:sz w:val="22"/>
+          <w:szCs w:val="22"/>
+        </w:rPr>
+        <w:t xml:space="preserve">    </w:t>
+      </w:r>
+      <w:proofErr w:type="spellStart"/>
+      <w:proofErr w:type="gramStart"/>
+      <w:r>
+        <w:rPr>
+          <w:rFonts w:ascii="Calibri" w:eastAsia="Calibri" w:hAnsi="Calibri" w:cs="Calibri"/>
+          <w:sz w:val="22"/>
+          <w:szCs w:val="22"/>
+        </w:rPr>
+        <w:t>plt.xlabel</w:t>
+      </w:r>
+      <w:proofErr w:type="spellEnd"/>
+      <w:proofErr w:type="gramEnd"/>
+      <w:r>
+        <w:rPr>
+          <w:rFonts w:ascii="Calibri" w:eastAsia="Calibri" w:hAnsi="Calibri" w:cs="Calibri"/>
+          <w:sz w:val="22"/>
+          <w:szCs w:val="22"/>
+        </w:rPr>
+        <w:t>("</w:t>
+      </w:r>
+      <w:proofErr w:type="spellStart"/>
+      <w:r>
+        <w:rPr>
+          <w:rFonts w:ascii="Calibri" w:eastAsia="Calibri" w:hAnsi="Calibri" w:cs="Calibri"/>
+          <w:sz w:val="22"/>
+          <w:szCs w:val="22"/>
+        </w:rPr>
+        <w:t>Multimeter</w:t>
+      </w:r>
+      <w:proofErr w:type="spellEnd"/>
+      <w:r>
+        <w:rPr>
+          <w:rFonts w:ascii="Calibri" w:eastAsia="Calibri" w:hAnsi="Calibri" w:cs="Calibri"/>
+          <w:sz w:val="22"/>
+          <w:szCs w:val="22"/>
+        </w:rPr>
+        <w:t xml:space="preserve"> Voltage (V)")</w:t>
+      </w:r>
+    </w:p>
+    <w:p>
+      <w:r>
+        <w:rPr>
+          <w:rFonts w:ascii="Calibri" w:eastAsia="Calibri" w:hAnsi="Calibri" w:cs="Calibri"/>
+          <w:sz w:val="22"/>
+          <w:szCs w:val="22"/>
+        </w:rPr>
+        <w:t xml:space="preserve">    </w:t>
+      </w:r>
+      <w:proofErr w:type="spellStart"/>
+      <w:proofErr w:type="gramStart"/>
+      <w:r>
+        <w:rPr>
+          <w:rFonts w:ascii="Calibri" w:eastAsia="Calibri" w:hAnsi="Calibri" w:cs="Calibri"/>
+          <w:sz w:val="22"/>
+          <w:szCs w:val="22"/>
+        </w:rPr>
+        <w:t>plt.ylabel</w:t>
+      </w:r>
+      <w:proofErr w:type="spellEnd"/>
+      <w:proofErr w:type="gramEnd"/>
+      <w:r>
+        <w:rPr>
+          <w:rFonts w:ascii="Calibri" w:eastAsia="Calibri" w:hAnsi="Calibri" w:cs="Calibri"/>
+          <w:sz w:val="22"/>
+          <w:szCs w:val="22"/>
+        </w:rPr>
+        <w:t>("Endpoint Deviation (LSB)")</w:t>
+      </w:r>
+    </w:p>
+    <w:p>
+      <w:r>
+        <w:rPr>
+          <w:rFonts w:ascii="Calibri" w:eastAsia="Calibri" w:hAnsi="Calibri" w:cs="Calibri"/>
+          <w:sz w:val="22"/>
+          <w:szCs w:val="22"/>
+        </w:rPr>
+        <w:t xml:space="preserve">    </w:t>
+      </w:r>
+      <w:proofErr w:type="spellStart"/>
+      <w:proofErr w:type="gramStart"/>
+      <w:r>
+        <w:rPr>
+          <w:rFonts w:ascii="Calibri" w:eastAsia="Calibri" w:hAnsi="Calibri" w:cs="Calibri"/>
+          <w:sz w:val="22"/>
+          <w:szCs w:val="22"/>
+        </w:rPr>
+        <w:t>plt.title</w:t>
+      </w:r>
+      <w:proofErr w:type="spellEnd"/>
+      <w:proofErr w:type="gramEnd"/>
+      <w:r>
+        <w:rPr>
+          <w:rFonts w:ascii="Calibri" w:eastAsia="Calibri" w:hAnsi="Calibri" w:cs="Calibri"/>
+          <w:sz w:val="22"/>
+          <w:szCs w:val="22"/>
+        </w:rPr>
+        <w:t>(</w:t>
+      </w:r>
+      <w:proofErr w:type="spellStart"/>
+      <w:r>
+        <w:rPr>
+          <w:rFonts w:ascii="Calibri" w:eastAsia="Calibri" w:hAnsi="Calibri" w:cs="Calibri"/>
+          <w:sz w:val="22"/>
+          <w:szCs w:val="22"/>
+        </w:rPr>
+        <w:t>f"Experiment</w:t>
+      </w:r>
+      <w:proofErr w:type="spellEnd"/>
+      <w:r>
+        <w:rPr>
+          <w:rFonts w:ascii="Calibri" w:eastAsia="Calibri" w:hAnsi="Calibri" w:cs="Calibri"/>
+          <w:sz w:val="22"/>
+          <w:szCs w:val="22"/>
+        </w:rPr>
+        <w:t xml:space="preserve"> {n}: Approximate Endpoint INL")</w:t>
+      </w:r>
+    </w:p>
+    <w:p>
+      <w:r>
+        <w:rPr>
+          <w:rFonts w:ascii="Calibri" w:eastAsia="Calibri" w:hAnsi="Calibri" w:cs="Calibri"/>
+          <w:sz w:val="22"/>
+          <w:szCs w:val="22"/>
+        </w:rPr>
+        <w:t xml:space="preserve">    </w:t>
+      </w:r>
+      <w:proofErr w:type="spellStart"/>
+      <w:proofErr w:type="gramStart"/>
+      <w:r>
+        <w:rPr>
+          <w:rFonts w:ascii="Calibri" w:eastAsia="Calibri" w:hAnsi="Calibri" w:cs="Calibri"/>
+          <w:sz w:val="22"/>
+          <w:szCs w:val="22"/>
+        </w:rPr>
+        <w:t>plt.legend</w:t>
+      </w:r>
+      <w:proofErr w:type="spellEnd"/>
+      <w:proofErr w:type="gramEnd"/>
+      <w:r>
+        <w:rPr>
+          <w:rFonts w:ascii="Calibri" w:eastAsia="Calibri" w:hAnsi="Calibri" w:cs="Calibri"/>
+          <w:sz w:val="22"/>
+          <w:szCs w:val="22"/>
+        </w:rPr>
+        <w:t>()</w:t>
+      </w:r>
+    </w:p>
+    <w:p>
+      <w:r>
+        <w:rPr>
+          <w:rFonts w:ascii="Calibri" w:eastAsia="Calibri" w:hAnsi="Calibri" w:cs="Calibri"/>
+          <w:sz w:val="22"/>
+          <w:szCs w:val="22"/>
+        </w:rPr>
+        <w:t xml:space="preserve">    </w:t>
+      </w:r>
+      <w:proofErr w:type="spellStart"/>
+      <w:proofErr w:type="gramStart"/>
+      <w:r>
+        <w:rPr>
+          <w:rFonts w:ascii="Calibri" w:eastAsia="Calibri" w:hAnsi="Calibri" w:cs="Calibri"/>
+          <w:sz w:val="22"/>
+          <w:szCs w:val="22"/>
+        </w:rPr>
+        <w:t>plt.grid</w:t>
+      </w:r>
+      <w:proofErr w:type="spellEnd"/>
+      <w:proofErr w:type="gramEnd"/>
+      <w:r>
+        <w:rPr>
+          <w:rFonts w:ascii="Calibri" w:eastAsia="Calibri" w:hAnsi="Calibri" w:cs="Calibri"/>
+          <w:sz w:val="22"/>
+          <w:szCs w:val="22"/>
+        </w:rPr>
+        <w:t>(True)</w:t>
       </w:r>
     </w:p>
     <w:p/>
     <w:p>
-      <w:r>
-        <w:rPr>
-          <w:rFonts w:ascii="Calibri" w:eastAsia="Calibri" w:hAnsi="Calibri" w:cs="Calibri"/>
-          <w:sz w:val="22"/>
-          <w:szCs w:val="22"/>
-        </w:rPr>
-        <w:t># Figures 5.5 and 5.6: endpoint INL (1024 excluded from Experiment 1)</w:t>
-      </w:r>
-    </w:p>
-    <w:p>
-      <w:r>
-        <w:rPr>
-          <w:rFonts w:ascii="Calibri" w:eastAsia="Calibri" w:hAnsi="Calibri" w:cs="Calibri"/>
-          <w:sz w:val="22"/>
-          <w:szCs w:val="22"/>
-        </w:rPr>
-        <w:t>for n, v, adc in [(1, multimeter[:-1], experiment1[:-1]), (2, multimeter, experiment2)]:</w:t>
-      </w:r>
-    </w:p>
-    <w:p>
-      <w:r>
-        <w:rPr>
-          <w:rFonts w:ascii="Calibri" w:eastAsia="Calibri" w:hAnsi="Calibri" w:cs="Calibri"/>
-          <w:sz w:val="22"/>
-          <w:szCs w:val="22"/>
-        </w:rPr>
-        <w:t xml:space="preserve">    ref = adc[0] + (adc[-1] - adc[0]) / (v[-1] - v[0]) * (v - v[0])</w:t>
-      </w:r>
-    </w:p>
-    <w:p>
-      <w:r>
-        <w:rPr>
-          <w:rFonts w:ascii="Calibri" w:eastAsia="Calibri" w:hAnsi="Calibri" w:cs="Calibri"/>
-          <w:sz w:val="22"/>
-          <w:szCs w:val="22"/>
-        </w:rPr>
-        <w:t xml:space="preserve">    plt.figure(figsize=(8, 5))</w:t>
-      </w:r>
-    </w:p>
-    <w:p>
-      <w:r>
-        <w:rPr>
-          <w:rFonts w:ascii="Calibri" w:eastAsia="Calibri" w:hAnsi="Calibri" w:cs="Calibri"/>
-          <w:sz w:val="22"/>
-          <w:szCs w:val="22"/>
-        </w:rPr>
-        <w:t xml:space="preserve">    plt.plot(v, adc - ref, "o-", label=f"Experiment {n}")</w:t>
-      </w:r>
-    </w:p>
-    <w:p>
-      <w:r>
-        <w:rPr>
-          <w:rFonts w:ascii="Calibri" w:eastAsia="Calibri" w:hAnsi="Calibri" w:cs="Calibri"/>
-          <w:sz w:val="22"/>
-          <w:szCs w:val="22"/>
-        </w:rPr>
-        <w:t xml:space="preserve">    plt.axhline(0, color="black", linestyle="--", label="Reference")</w:t>
-      </w:r>
-    </w:p>
-    <w:p>
-      <w:r>
-        <w:rPr>
-          <w:rFonts w:ascii="Calibri" w:eastAsia="Calibri" w:hAnsi="Calibri" w:cs="Calibri"/>
-          <w:sz w:val="22"/>
-          <w:szCs w:val="22"/>
-        </w:rPr>
-        <w:t xml:space="preserve">    plt.xlabel("Multimeter Voltage (V)")</w:t>
-      </w:r>
-    </w:p>
-    <w:p>
-      <w:r>
-        <w:rPr>
-          <w:rFonts w:ascii="Calibri" w:eastAsia="Calibri" w:hAnsi="Calibri" w:cs="Calibri"/>
-          <w:sz w:val="22"/>
-          <w:szCs w:val="22"/>
-        </w:rPr>
-        <w:t xml:space="preserve">    plt.ylabel("Endpoint Deviation (LSB)")</w:t>
-      </w:r>
-    </w:p>
-    <w:p>
-      <w:r>
-        <w:rPr>
-          <w:rFonts w:ascii="Calibri" w:eastAsia="Calibri" w:hAnsi="Calibri" w:cs="Calibri"/>
-          <w:sz w:val="22"/>
-          <w:szCs w:val="22"/>
-        </w:rPr>
-        <w:t xml:space="preserve">    plt.title(f"Experiment {n}: Approximate Endpoint INL")</w:t>
-      </w:r>
-    </w:p>
-    <w:p>
-      <w:r>
-        <w:rPr>
-          <w:rFonts w:ascii="Calibri" w:eastAsia="Calibri" w:hAnsi="Calibri" w:cs="Calibri"/>
-          <w:sz w:val="22"/>
-          <w:szCs w:val="22"/>
-        </w:rPr>
-        <w:t xml:space="preserve">    plt.legend()</w:t>
-      </w:r>
-    </w:p>
-    <w:p>
-      <w:r>
-        <w:rPr>
-          <w:rFonts w:ascii="Calibri" w:eastAsia="Calibri" w:hAnsi="Calibri" w:cs="Calibri"/>
-          <w:sz w:val="22"/>
-          <w:szCs w:val="22"/>
-        </w:rPr>
-        <w:t xml:space="preserve">    plt.grid(True)</w:t>
-      </w:r>
-    </w:p>
-    <w:p/>
-    <w:p>
-      <w:r>
-        <w:rPr>
-          <w:rFonts w:ascii="Calibri" w:eastAsia="Calibri" w:hAnsi="Calibri" w:cs="Calibri"/>
-          <w:sz w:val="22"/>
-          <w:szCs w:val="22"/>
-        </w:rPr>
-        <w:lastRenderedPageBreak/>
-        <w:t>plt.show()</w:t>
-      </w:r>
-    </w:p>
-    <w:p/>
+      <w:proofErr w:type="spellStart"/>
+      <w:proofErr w:type="gramStart"/>
+      <w:r>
+        <w:rPr>
+          <w:rFonts w:ascii="Calibri" w:eastAsia="Calibri" w:hAnsi="Calibri" w:cs="Calibri"/>
+          <w:sz w:val="22"/>
+          <w:szCs w:val="22"/>
+        </w:rPr>
+        <w:t>plt.show</w:t>
+      </w:r>
+      <w:proofErr w:type="spellEnd"/>
+      <w:proofErr w:type="gramEnd"/>
+      <w:r>
+        <w:rPr>
+          <w:rFonts w:ascii="Calibri" w:eastAsia="Calibri" w:hAnsi="Calibri" w:cs="Calibri"/>
+          <w:sz w:val="22"/>
+          <w:szCs w:val="22"/>
+        </w:rPr>
+        <w:t>()</w:t>
+      </w:r>
+    </w:p>
     <w:sectPr>
       <w:footerReference w:type="default" r:id="rId21"/>
       <w:footerReference w:type="first" r:id="rId22"/>

</xml_diff>